<commit_message>
Opleidingsplanning: correcties na de controle
Tien reisdagen en 1.600 km in plaats van veertien en 2.400 - Janou geeft de
gedragsdagdelen niet meer. Technologie noemt nu ook de Orthotimer en de
MoveMonitor. Pedorthist doet de ICC mee. Certificering splitst het gedragsdomein
naar Dobbels op het tweede dagdeel. Beslispunt 2 sprak nog van drie dagdelen.

Co-Authored-By: Claude Opus 5 <noreply@anthropic.com>
</commit_message>
<xml_diff>
--- a/PARADISE_opleidingsplanning.docx
+++ b/PARADISE_opleidingsplanning.docx
@@ -642,7 +642,7 @@
                 <w:color w:val="1B2630"/>
                 <w:sz w:val="17"/>
               </w:rPr>
-              <w:t>5 · Technologie</w:t>
+              <w:t>5 · Technologie — pedar, Orthotimer, MoveMonitor</w:t>
             </w:r>
           </w:p>
         </w:tc>
@@ -1008,7 +1008,7 @@
                 <w:color w:val="1B2630"/>
                 <w:sz w:val="17"/>
               </w:rPr>
-              <w:t>twee beoordelaars per centrum</w:t>
+              <w:t>twee beoordelaars per centrum, doorgaans de podoloog en de pedorthist</w:t>
             </w:r>
           </w:p>
         </w:tc>
@@ -4689,13 +4689,15 @@
             <w:pPr>
               <w:spacing w:before="40" w:after="40"/>
             </w:pPr>
-            <w:r>
-              <w:rPr>
+            <w:r/>
+            <w:r>
+              <w:rPr>
+                <w:rFonts w:ascii="Segoe UI" w:hAnsi="Segoe UI"/>
                 <w:b/>
                 <w:color w:val="1B2630"/>
                 <w:sz w:val="17"/>
               </w:rPr>
-              <w:t>Praktijkbeoordeling tijdens de droogloop</w:t>
+              <w:t>Praktijkbeoordeling gedrag, door Dobbels</w:t>
             </w:r>
           </w:p>
         </w:tc>
@@ -4707,12 +4709,15 @@
             <w:pPr>
               <w:spacing w:before="40" w:after="40"/>
             </w:pPr>
-            <w:r>
-              <w:rPr>
-                <w:color w:val="1B2630"/>
-                <w:sz w:val="17"/>
-              </w:rPr>
-              <w:t>14–27 jan</w:t>
+            <w:r/>
+            <w:r>
+              <w:rPr>
+                <w:rFonts w:ascii="Segoe UI" w:hAnsi="Segoe UI"/>
+                <w:b w:val="0"/>
+                <w:color w:val="1B2630"/>
+                <w:sz w:val="17"/>
+              </w:rPr>
+              <w:t>tweede gedragsdagdeel, 10 of 17 dec</w:t>
             </w:r>
           </w:p>
         </w:tc>
@@ -4724,12 +4729,77 @@
             <w:pPr>
               <w:spacing w:before="40" w:after="40"/>
             </w:pPr>
-            <w:r>
-              <w:rPr>
-                <w:color w:val="1B2630"/>
-                <w:sz w:val="17"/>
-              </w:rPr>
-              <w:t>alle domeinen 3 op 4</w:t>
+            <w:r/>
+            <w:r>
+              <w:rPr>
+                <w:rFonts w:ascii="Segoe UI" w:hAnsi="Segoe UI"/>
+                <w:b w:val="0"/>
+                <w:color w:val="1B2630"/>
+                <w:sz w:val="17"/>
+              </w:rPr>
+              <w:t>domein gedrag 3 op 4</w:t>
+            </w:r>
+          </w:p>
+        </w:tc>
+      </w:tr>
+      <w:tr>
+        <w:tc>
+          <w:tcPr>
+            <w:tcW w:type="dxa" w:w="3200"/>
+          </w:tcPr>
+          <w:p>
+            <w:pPr>
+              <w:spacing w:before="40" w:after="40"/>
+            </w:pPr>
+            <w:r/>
+            <w:r>
+              <w:rPr>
+                <w:rFonts w:ascii="Segoe UI" w:hAnsi="Segoe UI"/>
+                <w:b/>
+                <w:color w:val="1B2630"/>
+                <w:sz w:val="17"/>
+              </w:rPr>
+              <w:t>Praktijkbeoordeling techniek en traject, door Janou</w:t>
+            </w:r>
+          </w:p>
+        </w:tc>
+        <w:tc>
+          <w:tcPr>
+            <w:tcW w:type="dxa" w:w="3200"/>
+          </w:tcPr>
+          <w:p>
+            <w:pPr>
+              <w:spacing w:before="40" w:after="40"/>
+            </w:pPr>
+            <w:r/>
+            <w:r>
+              <w:rPr>
+                <w:rFonts w:ascii="Segoe UI" w:hAnsi="Segoe UI"/>
+                <w:b w:val="0"/>
+                <w:color w:val="1B2630"/>
+                <w:sz w:val="17"/>
+              </w:rPr>
+              <w:t>droogloop, 14–27 jan</w:t>
+            </w:r>
+          </w:p>
+        </w:tc>
+        <w:tc>
+          <w:tcPr>
+            <w:tcW w:type="dxa" w:w="3460"/>
+          </w:tcPr>
+          <w:p>
+            <w:pPr>
+              <w:spacing w:before="40" w:after="40"/>
+            </w:pPr>
+            <w:r/>
+            <w:r>
+              <w:rPr>
+                <w:rFonts w:ascii="Segoe UI" w:hAnsi="Segoe UI"/>
+                <w:b w:val="0"/>
+                <w:color w:val="1B2630"/>
+                <w:sz w:val="17"/>
+              </w:rPr>
+              <w:t>overige domeinen 3 op 4</w:t>
             </w:r>
           </w:p>
         </w:tc>
@@ -5830,7 +5900,7 @@
                 <w:color w:val="1B2630"/>
                 <w:sz w:val="17"/>
               </w:rPr>
-              <w:t>3 u theorie, 2 u technologie, 4,5 u droogloop</w:t>
+              <w:t>3 u theorie, 2 u technologie, 4,5 u droogloop, 1 u ICC</w:t>
             </w:r>
           </w:p>
         </w:tc>
@@ -10094,7 +10164,7 @@
                 <w:color w:val="1B2630"/>
                 <w:sz w:val="17"/>
               </w:rPr>
-              <w:t>14 reisdagen, ongeveer 2.400 km</w:t>
+              <w:t>10 reisdagen, ongeveer 1.600 km</w:t>
             </w:r>
           </w:p>
         </w:tc>
@@ -10841,14 +10911,13 @@
           <w:color w:val="1B2630"/>
           <w:lang w:val="nl-BE"/>
         </w:rPr>
-        <w:t>De locatie van de drie centrale gedragsdagdelen.</w:t>
+        <w:t>De locatie van de vier centrale gedragsdagdelen en de twee boosters.</w:t>
       </w:r>
       <w:r>
         <w:rPr>
           <w:color w:val="1B2630"/>
           <w:lang w:val="nl-BE"/>
         </w:rPr>
-        <w:t xml:space="preserve">  </w:t>
       </w:r>
     </w:p>
     <w:p>

</xml_diff>

<commit_message>
Opleidingsplanning: gedrag wordt zes blokken van twee uur, drie per dag
Twee gedragsdagen van zes uur per centrum: dag 1 in december, dag 2 in april,
zodat stap 3 en 4 getraind worden vlak voor ze gebruikt worden. Twaalf uur per
zorgverlener. Dobbels komt op twaalf volle lesdagen. De technologiedag blijft
los staan met twee centra per dag.
</commit_message>
<xml_diff>
--- a/PARADISE_opleidingsplanning.docx
+++ b/PARADISE_opleidingsplanning.docx
@@ -435,7 +435,7 @@
                 <w:color w:val="1B2630"/>
                 <w:sz w:val="17"/>
               </w:rPr>
-              <w:t>3 blokken van 2 u, elk op een andere dag</w:t>
+              <w:t>6 blokken van 2 u, drie per dag</w:t>
             </w:r>
           </w:p>
         </w:tc>
@@ -447,12 +447,15 @@
             <w:pPr>
               <w:spacing w:before="40" w:after="40"/>
             </w:pPr>
-            <w:r>
-              <w:rPr>
-                <w:color w:val="1B2630"/>
-                <w:sz w:val="17"/>
-              </w:rPr>
-              <w:t>ter plaatse, per centrum</w:t>
+            <w:r/>
+            <w:r>
+              <w:rPr>
+                <w:rFonts w:ascii="Segoe UI" w:hAnsi="Segoe UI"/>
+                <w:b w:val="0"/>
+                <w:color w:val="1B2630"/>
+                <w:sz w:val="17"/>
+              </w:rPr>
+              <w:t>ter plaatse, per centrum, twee dagen</w:t>
             </w:r>
           </w:p>
         </w:tc>
@@ -1891,7 +1894,7 @@
                 <w:color w:val="1B2630"/>
                 <w:sz w:val="17"/>
               </w:rPr>
-              <w:t>Gedrag blok 1, twee uur per centrum — op een andere dag dan de technologiedag</w:t>
+              <w:t>Gedragsdag 1: blok 1 tot 3, zes uur per centrum — op een andere dag dan de technologiedag</w:t>
             </w:r>
           </w:p>
         </w:tc>
@@ -2648,7 +2651,7 @@
                 <w:color w:val="1B2630"/>
                 <w:sz w:val="17"/>
               </w:rPr>
-              <w:t>januari</w:t>
+              <w:t>vr 29 jan</w:t>
             </w:r>
           </w:p>
         </w:tc>
@@ -2668,75 +2671,13 @@
                 <w:color w:val="1B2630"/>
                 <w:sz w:val="17"/>
               </w:rPr>
-              <w:t>Gedrag blok 2, twee uur per centrum — niet op de droogloopdag</w:t>
+              <w:t>Certificatenregister getekend en in de Trial Master File</w:t>
             </w:r>
           </w:p>
         </w:tc>
         <w:tc>
           <w:tcPr>
             <w:tcW w:w="3460" w:type="dxa"/>
-          </w:tcPr>
-          <w:p>
-            <w:pPr>
-              <w:spacing w:before="40" w:after="40"/>
-            </w:pPr>
-            <w:r/>
-            <w:r>
-              <w:rPr>
-                <w:rFonts w:ascii="Segoe UI" w:hAnsi="Segoe UI"/>
-                <w:b w:val="0"/>
-                <w:color w:val="1B2630"/>
-                <w:sz w:val="17"/>
-              </w:rPr>
-              <w:t>bij elk centrum</w:t>
-            </w:r>
-          </w:p>
-        </w:tc>
-      </w:tr>
-      <w:tr>
-        <w:tc>
-          <w:tcPr>
-            <w:tcW w:type="dxa" w:w="1500"/>
-          </w:tcPr>
-          <w:p>
-            <w:pPr>
-              <w:spacing w:before="40" w:after="40"/>
-            </w:pPr>
-            <w:r/>
-            <w:r>
-              <w:rPr>
-                <w:rFonts w:ascii="Segoe UI" w:hAnsi="Segoe UI"/>
-                <w:b/>
-                <w:color w:val="1B2630"/>
-                <w:sz w:val="17"/>
-              </w:rPr>
-              <w:t>vr 29 jan</w:t>
-            </w:r>
-          </w:p>
-        </w:tc>
-        <w:tc>
-          <w:tcPr>
-            <w:tcW w:type="dxa" w:w="4900"/>
-          </w:tcPr>
-          <w:p>
-            <w:pPr>
-              <w:spacing w:before="40" w:after="40"/>
-            </w:pPr>
-            <w:r/>
-            <w:r>
-              <w:rPr>
-                <w:rFonts w:ascii="Segoe UI" w:hAnsi="Segoe UI"/>
-                <w:b w:val="0"/>
-                <w:color w:val="1B2630"/>
-                <w:sz w:val="17"/>
-              </w:rPr>
-              <w:t>Certificatenregister getekend en in de Trial Master File</w:t>
-            </w:r>
-          </w:p>
-        </w:tc>
-        <w:tc>
-          <w:tcPr>
-            <w:tcW w:type="dxa" w:w="3460"/>
           </w:tcPr>
           <w:p>
             <w:pPr>
@@ -3055,7 +2996,7 @@
           <w:b/>
           <w:color w:val="00407A"/>
         </w:rPr>
-        <w:t>2027 · het derde gedragsblok</w:t>
+        <w:t>2027 · de tweede gedragsdag</w:t>
       </w:r>
     </w:p>
     <w:tbl>
@@ -3153,7 +3094,7 @@
                 <w:color w:val="1B2630"/>
                 <w:sz w:val="17"/>
               </w:rPr>
-              <w:t>Gedrag blok 3, twee uur per centrum: terugkoppeling op meetgegevens, stap 3 en 4, en de fideliteitsterugkoppeling. Zes bezoeken, vóór de eerste maand 3-visites</w:t>
+              <w:t>Gedragsdag 2: blok 4 tot 6, zes uur per centrum — terugkoppeling op meetgegevens, stap 3 en 4, en de fideliteitsterugkoppeling. Zes dagen, vóór de eerste maand 3-visites</w:t>
             </w:r>
           </w:p>
         </w:tc>
@@ -4633,7 +4574,7 @@
                 <w:color w:val="1B2630"/>
                 <w:sz w:val="17"/>
               </w:rPr>
-              <w:t>3 u theorie, 1,5 u toestemming, 1,5 u educatie, 2 u technologie, 4 u gedrag, 3 u vragenlijsten, 4,5 u droogloop, 1 u ICC — samen 20,5 u vóór de start, plus 2 u in april</w:t>
+              <w:t>3 u theorie, 1,5 u toestemming, 1,5 u educatie, 2 u technologie, 6 u gedrag, 3 u vragenlijsten, 4,5 u droogloop, 1 u ICC — samen 22,5 u vóór de start, plus 6 u in april</w:t>
             </w:r>
           </w:p>
         </w:tc>
@@ -4761,7 +4702,7 @@
                 <w:color w:val="1B2630"/>
                 <w:sz w:val="17"/>
               </w:rPr>
-              <w:t>Janou twaalf sitebezoeken, Dobbels achttien — zes per blok</w:t>
+              <w:t>Janou twaalf sitebezoeken, Dobbels twaalf volle dagen — zes per gedragsdag</w:t>
             </w:r>
           </w:p>
         </w:tc>
@@ -5072,7 +5013,7 @@
                 <w:color w:val="1B2630"/>
                 <w:sz w:val="17"/>
               </w:rPr>
-              <w:t>Gedrag blok 1 en 2, zes centra</w:t>
+              <w:t>Gedragsdag 1, zes centra</w:t>
             </w:r>
           </w:p>
         </w:tc>
@@ -5109,7 +5050,7 @@
                 <w:color w:val="1B2630"/>
                 <w:sz w:val="17"/>
               </w:rPr>
-              <w:t>24 u</w:t>
+              <w:t>36 u</w:t>
             </w:r>
           </w:p>
         </w:tc>
@@ -5406,7 +5347,7 @@
                 <w:color w:val="1B2630"/>
                 <w:sz w:val="17"/>
               </w:rPr>
-              <w:t>Gedrag blok 3, in april 2027</w:t>
+              <w:t>Gedragsdag 2, in april 2027</w:t>
             </w:r>
           </w:p>
         </w:tc>
@@ -5445,7 +5386,7 @@
                 <w:color w:val="1B2630"/>
                 <w:sz w:val="17"/>
               </w:rPr>
-              <w:t>12 u</w:t>
+              <w:t>36 u</w:t>
             </w:r>
           </w:p>
         </w:tc>
@@ -5506,7 +5447,7 @@
                 <w:color w:val="1B2630"/>
                 <w:sz w:val="17"/>
               </w:rPr>
-              <w:t>80 u</w:t>
+              <w:t>92 u</w:t>
             </w:r>
           </w:p>
         </w:tc>
@@ -6950,7 +6891,7 @@
                 <w:color w:val="1B2630"/>
                 <w:sz w:val="17"/>
               </w:rPr>
-              <w:t>Dobbels · 25,5 u contact, achttien sitebezoeken</w:t>
+              <w:t>Dobbels · 37,5 u contact, zes volle dagen in december</w:t>
             </w:r>
           </w:p>
         </w:tc>
@@ -6970,7 +6911,7 @@
                 <w:color w:val="1B2630"/>
                 <w:sz w:val="17"/>
               </w:rPr>
-              <w:t>12</w:t>
+              <w:t>10</w:t>
             </w:r>
           </w:p>
         </w:tc>
@@ -7157,7 +7098,7 @@
           <w:color w:val="1B2630"/>
           <w:sz w:val="19"/>
         </w:rPr>
-        <w:t>Of Dobbels de achttien gedragsbezoeken zelf doet, of iemand opleidt voor blok 3.</w:t>
+        <w:t>Of Dobbels de twaalf gedragsdagen zelf geeft, of iemand opleidt voor gedragsdag 2.</w:t>
       </w:r>
     </w:p>
     <w:p>
@@ -7216,7 +7157,7 @@
           <w:color w:val="1B2630"/>
           <w:sz w:val="19"/>
         </w:rPr>
-        <w:t>Vier uur gedrag vóór de start en twee in april — of alle zes vooraf.</w:t>
+        <w:t>Zes uur gedrag vóór de start en zes in april — of alle twaalf vooraf.</w:t>
       </w:r>
     </w:p>
     <w:p>

</xml_diff>

<commit_message>
Opleidingsplanning: knelpuntentabel stond onder de kop Oktober, plus vijf verouderde verwijzingen
De oktobertabel was vervangen door de knelpunten; die staan nu waar ze horen en
oktober heeft zijn eigen inhoud terug. Verder: tien van de dertien sessiedagen
werd twaalf van de veertien, het boosterdagdeel van juni werd gedragsdag 2 van
april, de verwijzing naar sectie 7 werd sectie 6, de educatiesessie was voor
iedereen in plaats van voor wie ze geeft, en Dobbels stond op zes dagen in
december terwijl het er twaalf zijn.
</commit_message>
<xml_diff>
--- a/PARADISE_opleidingsplanning.docx
+++ b/PARADISE_opleidingsplanning.docx
@@ -884,19 +884,21 @@
       <w:tr>
         <w:tc>
           <w:tcPr>
-            <w:tcW w:w="2400" w:type="dxa"/>
-          </w:tcPr>
-          <w:p>
-            <w:pPr>
-              <w:spacing w:before="40" w:after="40"/>
-            </w:pPr>
-            <w:r>
-              <w:rPr>
+            <w:tcW w:w="1800" w:type="dxa"/>
+          </w:tcPr>
+          <w:p>
+            <w:pPr>
+              <w:spacing w:before="40" w:after="40"/>
+            </w:pPr>
+            <w:r/>
+            <w:r>
+              <w:rPr>
+                <w:rFonts w:ascii="Segoe UI" w:hAnsi="Segoe UI"/>
                 <w:b/>
                 <w:color w:val="1B2630"/>
                 <w:sz w:val="17"/>
               </w:rPr>
-              <w:t>1–16 dec</w:t>
+              <w:t>week van 21 sep</w:t>
             </w:r>
           </w:p>
         </w:tc>
@@ -907,17 +909,16 @@
           <w:p>
             <w:pPr>
               <w:spacing w:before="40" w:after="40"/>
-              <w:rPr>
-                <w:lang w:val="nl-BE"/>
-              </w:rPr>
-            </w:pPr>
-            <w:r>
-              <w:rPr>
-                <w:color w:val="1B2630"/>
-                <w:sz w:val="17"/>
-                <w:lang w:val="nl-BE"/>
-              </w:rPr>
-              <w:t>Zes opleidingsdagen van zes uur ter plaatse, met twee lesgevers, in twaalf werkdagen</w:t>
+            </w:pPr>
+            <w:r/>
+            <w:r>
+              <w:rPr>
+                <w:rFonts w:ascii="Segoe UI" w:hAnsi="Segoe UI"/>
+                <w:b w:val="0"/>
+                <w:color w:val="1B2630"/>
+                <w:sz w:val="17"/>
+              </w:rPr>
+              <w:t>Datumvoorstel naar de zes centra, met per sessie wie er verwacht wordt</w:t>
             </w:r>
           </w:p>
         </w:tc>
@@ -925,19 +926,21 @@
       <w:tr>
         <w:tc>
           <w:tcPr>
-            <w:tcW w:w="2400" w:type="dxa"/>
-          </w:tcPr>
-          <w:p>
-            <w:pPr>
-              <w:spacing w:before="40" w:after="40"/>
-            </w:pPr>
-            <w:r>
-              <w:rPr>
+            <w:tcW w:w="1800" w:type="dxa"/>
+          </w:tcPr>
+          <w:p>
+            <w:pPr>
+              <w:spacing w:before="40" w:after="40"/>
+            </w:pPr>
+            <w:r/>
+            <w:r>
+              <w:rPr>
+                <w:rFonts w:ascii="Segoe UI" w:hAnsi="Segoe UI"/>
                 <w:b/>
                 <w:color w:val="1B2630"/>
                 <w:sz w:val="17"/>
               </w:rPr>
-              <w:t>11–29 jan</w:t>
+              <w:t>vr 16 okt</w:t>
             </w:r>
           </w:p>
         </w:tc>
@@ -948,17 +951,16 @@
           <w:p>
             <w:pPr>
               <w:spacing w:before="40" w:after="40"/>
-              <w:rPr>
-                <w:lang w:val="nl-BE"/>
-              </w:rPr>
-            </w:pPr>
-            <w:r>
-              <w:rPr>
-                <w:color w:val="1B2630"/>
-                <w:sz w:val="17"/>
-                <w:lang w:val="nl-BE"/>
-              </w:rPr>
-              <w:t>Acht van de vijftien werkdagen ter plaatse, plus voorbereiding</w:t>
+            </w:pPr>
+            <w:r/>
+            <w:r>
+              <w:rPr>
+                <w:rFonts w:ascii="Segoe UI" w:hAnsi="Segoe UI"/>
+                <w:b w:val="0"/>
+                <w:color w:val="1B2630"/>
+                <w:sz w:val="17"/>
+              </w:rPr>
+              <w:t>Antwoord van de zes centra; kalender vastgelegd, daarna geen verschuiving meer</w:t>
             </w:r>
           </w:p>
         </w:tc>
@@ -966,19 +968,21 @@
       <w:tr>
         <w:tc>
           <w:tcPr>
-            <w:tcW w:w="2400" w:type="dxa"/>
-          </w:tcPr>
-          <w:p>
-            <w:pPr>
-              <w:spacing w:before="40" w:after="40"/>
-            </w:pPr>
-            <w:r>
-              <w:rPr>
+            <w:tcW w:w="1800" w:type="dxa"/>
+          </w:tcPr>
+          <w:p>
+            <w:pPr>
+              <w:spacing w:before="40" w:after="40"/>
+            </w:pPr>
+            <w:r/>
+            <w:r>
+              <w:rPr>
+                <w:rFonts w:ascii="Segoe UI" w:hAnsi="Segoe UI"/>
                 <w:b/>
                 <w:color w:val="1B2630"/>
                 <w:sz w:val="17"/>
               </w:rPr>
-              <w:t>26 en 27 jan</w:t>
+              <w:t>oktober</w:t>
             </w:r>
           </w:p>
         </w:tc>
@@ -989,58 +993,16 @@
           <w:p>
             <w:pPr>
               <w:spacing w:before="40" w:after="40"/>
-              <w:rPr>
-                <w:lang w:val="nl-BE"/>
-              </w:rPr>
-            </w:pPr>
-            <w:r>
-              <w:rPr>
-                <w:color w:val="1B2630"/>
-                <w:sz w:val="17"/>
-                <w:lang w:val="nl-BE"/>
-              </w:rPr>
-              <w:t>Leuven en Antwerpen, negen en een half uur deur tot deur, twee dagen na elkaar</w:t>
-            </w:r>
-          </w:p>
-        </w:tc>
-      </w:tr>
-      <w:tr>
-        <w:tc>
-          <w:tcPr>
-            <w:tcW w:w="2400" w:type="dxa"/>
-          </w:tcPr>
-          <w:p>
-            <w:pPr>
-              <w:spacing w:before="40" w:after="40"/>
-            </w:pPr>
-            <w:r>
-              <w:rPr>
-                <w:b/>
-                <w:color w:val="1B2630"/>
-                <w:sz w:val="17"/>
-              </w:rPr>
-              <w:t>21 dec – 3 jan</w:t>
-            </w:r>
-          </w:p>
-        </w:tc>
-        <w:tc>
-          <w:tcPr>
-            <w:tcW w:w="8060" w:type="dxa"/>
-          </w:tcPr>
-          <w:p>
-            <w:pPr>
-              <w:spacing w:before="40" w:after="40"/>
-              <w:rPr>
-                <w:lang w:val="nl-BE"/>
-              </w:rPr>
-            </w:pPr>
-            <w:r>
-              <w:rPr>
-                <w:color w:val="1B2630"/>
-                <w:sz w:val="17"/>
-                <w:lang w:val="nl-BE"/>
-              </w:rPr>
-              <w:t>Kerstvakantie: geen inhaalruimte tussen december en januari</w:t>
+            </w:pPr>
+            <w:r/>
+            <w:r>
+              <w:rPr>
+                <w:rFonts w:ascii="Segoe UI" w:hAnsi="Segoe UI"/>
+                <w:b w:val="0"/>
+                <w:color w:val="1B2630"/>
+                <w:sz w:val="17"/>
+              </w:rPr>
+              <w:t>Licenties EuroQol en iMTA rond, formulierenroute beslist, drukmeetsystemen besteld</w:t>
             </w:r>
           </w:p>
         </w:tc>
@@ -1383,12 +1345,15 @@
             <w:pPr>
               <w:spacing w:before="40" w:after="40"/>
             </w:pPr>
-            <w:r>
-              <w:rPr>
-                <w:color w:val="1B2630"/>
-                <w:sz w:val="17"/>
-              </w:rPr>
-              <w:t>iedereen</w:t>
+            <w:r/>
+            <w:r>
+              <w:rPr>
+                <w:rFonts w:ascii="Segoe UI" w:hAnsi="Segoe UI"/>
+                <w:b w:val="0"/>
+                <w:color w:val="1B2630"/>
+                <w:sz w:val="17"/>
+              </w:rPr>
+              <w:t>wie de educatie geeft</w:t>
             </w:r>
           </w:p>
         </w:tc>
@@ -2715,7 +2680,7 @@
           <w:sz w:val="17"/>
           <w:lang w:val="nl-BE"/>
         </w:rPr>
-        <w:t>Donderdag 21, vrijdag 22 en donderdag 28 januari blijven vrij als inhaalslots. Met zes drooglopen in twee weken is de kans reëel dat er één verschuift.</w:t>
+        <w:t>Donderdag 21, vrijdag 22 en donderdag 28 januari blijven vrij als inhaalslots. Met zes drooglopen in twee weken is de kans reëel dat er één verschuift, en de kerstvakantie ervoor laat geen ruimte om iets naar voren te halen. Leuven en Antwerpen vallen bovendien op twee opeenvolgende dagen, elk negen en een half uur deur tot deur.</w:t>
       </w:r>
     </w:p>
     <w:p>
@@ -4044,17 +4009,16 @@
           <w:p>
             <w:pPr>
               <w:spacing w:before="40" w:after="40"/>
-              <w:rPr>
-                <w:lang w:val="nl-BE"/>
-              </w:rPr>
-            </w:pPr>
-            <w:r>
-              <w:rPr>
-                <w:color w:val="1B2630"/>
-                <w:sz w:val="17"/>
-                <w:lang w:val="nl-BE"/>
-              </w:rPr>
-              <w:t>één ziekteperiode van twee weken legt tien van de dertien sessiedagen stil</w:t>
+            </w:pPr>
+            <w:r/>
+            <w:r>
+              <w:rPr>
+                <w:rFonts w:ascii="Segoe UI" w:hAnsi="Segoe UI"/>
+                <w:b w:val="0"/>
+                <w:color w:val="1B2630"/>
+                <w:sz w:val="17"/>
+              </w:rPr>
+              <w:t>één ziekteperiode van twee weken legt twaalf van de veertien sessiedagen stil</w:t>
             </w:r>
           </w:p>
         </w:tc>
@@ -4234,17 +4198,16 @@
           <w:p>
             <w:pPr>
               <w:spacing w:before="40" w:after="40"/>
-              <w:rPr>
-                <w:lang w:val="nl-BE"/>
-              </w:rPr>
-            </w:pPr>
-            <w:r>
-              <w:rPr>
-                <w:color w:val="1B2630"/>
-                <w:sz w:val="17"/>
-                <w:lang w:val="nl-BE"/>
-              </w:rPr>
-              <w:t>het boosterdagdeel van juni en de fideliteitsmeting</w:t>
+            </w:pPr>
+            <w:r/>
+            <w:r>
+              <w:rPr>
+                <w:rFonts w:ascii="Segoe UI" w:hAnsi="Segoe UI"/>
+                <w:b w:val="0"/>
+                <w:color w:val="1B2630"/>
+                <w:sz w:val="17"/>
+              </w:rPr>
+              <w:t>gedragsdag 2 van april en de fideliteitsmeting</w:t>
             </w:r>
           </w:p>
         </w:tc>
@@ -4677,12 +4640,15 @@
             <w:pPr>
               <w:spacing w:before="40" w:after="40"/>
             </w:pPr>
-            <w:r>
-              <w:rPr>
-                <w:color w:val="1B2630"/>
-                <w:sz w:val="17"/>
-              </w:rPr>
-              <w:t>zie sectie 7</w:t>
+            <w:r/>
+            <w:r>
+              <w:rPr>
+                <w:rFonts w:ascii="Segoe UI" w:hAnsi="Segoe UI"/>
+                <w:b w:val="0"/>
+                <w:color w:val="1B2630"/>
+                <w:sz w:val="17"/>
+              </w:rPr>
+              <w:t>zie sectie 6</w:t>
             </w:r>
           </w:p>
         </w:tc>
@@ -6891,7 +6857,7 @@
                 <w:color w:val="1B2630"/>
                 <w:sz w:val="17"/>
               </w:rPr>
-              <w:t>Dobbels · 37,5 u contact, zes volle dagen in december</w:t>
+              <w:t>Dobbels · 37,5 u contact vóór de start, twaalf volle lesdagen</w:t>
             </w:r>
           </w:p>
         </w:tc>

</xml_diff>

<commit_message>
Opleidingsplanning: certificering en ICC eruit, en elke reisdag telt als volle dag
Certificering en de ICC-meting zijn overal geschrapt: themafiche, kalender,
deadlines, belasting, lesgevers, voorbereiding en de beslispunten, die van acht
naar zeven gaan. Nieuwe rekenregel in het weekschema: een dag met een
verplaatsing telt als een volle dag, ook als de sessie twee uur duurt. Janou
komt daarmee op 12,5 sessiedagen en 3 dagen voorbereiding, samen 15,5 van de 48
werkdagen. Contacturen voor de start gaan van 92 naar 86.
</commit_message>
<xml_diff>
--- a/PARADISE_opleidingsplanning.docx
+++ b/PARADISE_opleidingsplanning.docx
@@ -710,80 +710,6 @@
           </w:p>
         </w:tc>
       </w:tr>
-      <w:tr>
-        <w:trPr>
-          <w:trHeight w:val="597"/>
-        </w:trPr>
-        <w:tc>
-          <w:tcPr>
-            <w:tcW w:w="2400" w:type="dxa"/>
-          </w:tcPr>
-          <w:p>
-            <w:pPr>
-              <w:spacing w:before="40" w:after="40"/>
-            </w:pPr>
-            <w:r>
-              <w:rPr>
-                <w:b/>
-                <w:color w:val="1B2630"/>
-                <w:sz w:val="17"/>
-              </w:rPr>
-              <w:t>Certificering</w:t>
-            </w:r>
-          </w:p>
-        </w:tc>
-        <w:tc>
-          <w:tcPr>
-            <w:tcW w:w="1900" w:type="dxa"/>
-          </w:tcPr>
-          <w:p>
-            <w:pPr>
-              <w:spacing w:before="40" w:after="40"/>
-            </w:pPr>
-            <w:r>
-              <w:rPr>
-                <w:color w:val="1B2630"/>
-                <w:sz w:val="17"/>
-              </w:rPr>
-              <w:t>in de droogloop</w:t>
-            </w:r>
-          </w:p>
-        </w:tc>
-        <w:tc>
-          <w:tcPr>
-            <w:tcW w:w="2700" w:type="dxa"/>
-          </w:tcPr>
-          <w:p>
-            <w:pPr>
-              <w:spacing w:before="40" w:after="40"/>
-            </w:pPr>
-            <w:r>
-              <w:rPr>
-                <w:color w:val="1B2630"/>
-                <w:sz w:val="17"/>
-              </w:rPr>
-              <w:t>gemengd</w:t>
-            </w:r>
-          </w:p>
-        </w:tc>
-        <w:tc>
-          <w:tcPr>
-            <w:tcW w:w="2860" w:type="dxa"/>
-          </w:tcPr>
-          <w:p>
-            <w:pPr>
-              <w:spacing w:before="40" w:after="40"/>
-            </w:pPr>
-            <w:r>
-              <w:rPr>
-                <w:color w:val="1B2630"/>
-                <w:sz w:val="17"/>
-              </w:rPr>
-              <w:t>3 opgeleid, minstens 2 gecertificeerd</w:t>
-            </w:r>
-          </w:p>
-        </w:tc>
-      </w:tr>
     </w:tbl>
     <w:p>
       <w:pPr>
@@ -1451,7 +1377,7 @@
           <w:sz w:val="17"/>
           <w:lang w:val="nl-BE"/>
         </w:rPr>
-        <w:t>De week van 2 tot 8 november is herfstvakantie en woensdag 11 november is een feestdag</w:t>
+        <w:t>De week van 2 tot 8 november is herfstvakantie en woensdag 11 november is een feestdag; daar staat niets.</w:t>
       </w:r>
       <w:r>
         <w:rPr>
@@ -1459,7 +1385,6 @@
           <w:sz w:val="17"/>
           <w:lang w:val="nl-BE"/>
         </w:rPr>
-        <w:t xml:space="preserve">. </w:t>
       </w:r>
       <w:r>
         <w:rPr>
@@ -1467,7 +1392,6 @@
           <w:sz w:val="17"/>
           <w:lang w:val="nl-BE"/>
         </w:rPr>
-        <w:t>De kennistoets staat online open van woensdag 18 november tot vrijdag 4 december, met herkansing tot vrijdag 18 december.</w:t>
       </w:r>
     </w:p>
     <w:p>
@@ -2264,7 +2188,7 @@
                 <w:color w:val="1B2630"/>
                 <w:sz w:val="17"/>
               </w:rPr>
-              <w:t>Droogloop, debriefing en ICC-meting</w:t>
+              <w:t>Droogloop en debriefing</w:t>
             </w:r>
           </w:p>
         </w:tc>
@@ -2326,7 +2250,7 @@
                 <w:color w:val="1B2630"/>
                 <w:sz w:val="17"/>
               </w:rPr>
-              <w:t>Droogloop, debriefing en ICC-meting</w:t>
+              <w:t>Droogloop en debriefing</w:t>
             </w:r>
           </w:p>
         </w:tc>
@@ -2388,7 +2312,7 @@
                 <w:color w:val="1B2630"/>
                 <w:sz w:val="17"/>
               </w:rPr>
-              <w:t>Droogloop, debriefing en ICC-meting</w:t>
+              <w:t>Droogloop en debriefing</w:t>
             </w:r>
           </w:p>
         </w:tc>
@@ -2450,7 +2374,7 @@
                 <w:color w:val="1B2630"/>
                 <w:sz w:val="17"/>
               </w:rPr>
-              <w:t>Droogloop, debriefing en ICC-meting</w:t>
+              <w:t>Droogloop en debriefing</w:t>
             </w:r>
           </w:p>
         </w:tc>
@@ -2512,7 +2436,7 @@
                 <w:color w:val="1B2630"/>
                 <w:sz w:val="17"/>
               </w:rPr>
-              <w:t>Droogloop, debriefing en ICC-meting</w:t>
+              <w:t>Droogloop en debriefing</w:t>
             </w:r>
           </w:p>
         </w:tc>
@@ -2574,7 +2498,7 @@
                 <w:color w:val="1B2630"/>
                 <w:sz w:val="17"/>
               </w:rPr>
-              <w:t>Droogloop, debriefing en ICC-meting</w:t>
+              <w:t>Droogloop en debriefing</w:t>
             </w:r>
           </w:p>
         </w:tc>
@@ -2595,68 +2519,6 @@
                 <w:sz w:val="17"/>
               </w:rPr>
               <w:t>UZ Antwerpen</w:t>
-            </w:r>
-          </w:p>
-        </w:tc>
-      </w:tr>
-      <w:tr>
-        <w:tc>
-          <w:tcPr>
-            <w:tcW w:w="1500" w:type="dxa"/>
-          </w:tcPr>
-          <w:p>
-            <w:pPr>
-              <w:spacing w:before="40" w:after="40"/>
-            </w:pPr>
-            <w:r/>
-            <w:r>
-              <w:rPr>
-                <w:rFonts w:ascii="Segoe UI" w:hAnsi="Segoe UI"/>
-                <w:b/>
-                <w:color w:val="1B2630"/>
-                <w:sz w:val="17"/>
-              </w:rPr>
-              <w:t>vr 29 jan</w:t>
-            </w:r>
-          </w:p>
-        </w:tc>
-        <w:tc>
-          <w:tcPr>
-            <w:tcW w:w="4900" w:type="dxa"/>
-          </w:tcPr>
-          <w:p>
-            <w:pPr>
-              <w:spacing w:before="40" w:after="40"/>
-            </w:pPr>
-            <w:r/>
-            <w:r>
-              <w:rPr>
-                <w:rFonts w:ascii="Segoe UI" w:hAnsi="Segoe UI"/>
-                <w:b w:val="0"/>
-                <w:color w:val="1B2630"/>
-                <w:sz w:val="17"/>
-              </w:rPr>
-              <w:t>Certificatenregister getekend en in de Trial Master File</w:t>
-            </w:r>
-          </w:p>
-        </w:tc>
-        <w:tc>
-          <w:tcPr>
-            <w:tcW w:w="3460" w:type="dxa"/>
-          </w:tcPr>
-          <w:p>
-            <w:pPr>
-              <w:spacing w:before="40" w:after="40"/>
-            </w:pPr>
-            <w:r/>
-            <w:r>
-              <w:rPr>
-                <w:rFonts w:ascii="Segoe UI" w:hAnsi="Segoe UI"/>
-                <w:b w:val="0"/>
-                <w:color w:val="1B2630"/>
-                <w:sz w:val="17"/>
-              </w:rPr>
-              <w:t>—</w:t>
             </w:r>
           </w:p>
         </w:tc>
@@ -3915,68 +3777,6 @@
                 <w:color w:val="1B2630"/>
                 <w:sz w:val="17"/>
               </w:rPr>
-              <w:t>oktober</w:t>
-            </w:r>
-          </w:p>
-        </w:tc>
-        <w:tc>
-          <w:tcPr>
-            <w:tcW w:w="4200" w:type="dxa"/>
-          </w:tcPr>
-          <w:p>
-            <w:pPr>
-              <w:spacing w:before="40" w:after="40"/>
-              <w:rPr>
-                <w:lang w:val="nl-BE"/>
-              </w:rPr>
-            </w:pPr>
-            <w:r>
-              <w:rPr>
-                <w:color w:val="1B2630"/>
-                <w:sz w:val="17"/>
-                <w:lang w:val="nl-BE"/>
-              </w:rPr>
-              <w:t>Vrijwilligers en toestemmingsroute voor de ICC-metingen</w:t>
-            </w:r>
-          </w:p>
-        </w:tc>
-        <w:tc>
-          <w:tcPr>
-            <w:tcW w:w="4060" w:type="dxa"/>
-          </w:tcPr>
-          <w:p>
-            <w:pPr>
-              <w:spacing w:before="40" w:after="40"/>
-              <w:rPr>
-                <w:lang w:val="nl-BE"/>
-              </w:rPr>
-            </w:pPr>
-            <w:r>
-              <w:rPr>
-                <w:color w:val="1B2630"/>
-                <w:sz w:val="17"/>
-                <w:lang w:val="nl-BE"/>
-              </w:rPr>
-              <w:t>Go-criterium 6 is niet haalbaar tegen de Go/No-Go</w:t>
-            </w:r>
-          </w:p>
-        </w:tc>
-      </w:tr>
-      <w:tr>
-        <w:tc>
-          <w:tcPr>
-            <w:tcW w:w="1600" w:type="dxa"/>
-          </w:tcPr>
-          <w:p>
-            <w:pPr>
-              <w:spacing w:before="40" w:after="40"/>
-            </w:pPr>
-            <w:r>
-              <w:rPr>
-                <w:b/>
-                <w:color w:val="1B2630"/>
-                <w:sz w:val="17"/>
-              </w:rPr>
               <w:t>november</w:t>
             </w:r>
           </w:p>
@@ -4408,17 +4208,16 @@
           <w:p>
             <w:pPr>
               <w:spacing w:before="40" w:after="40"/>
-              <w:rPr>
-                <w:lang w:val="nl-BE"/>
-              </w:rPr>
-            </w:pPr>
-            <w:r>
-              <w:rPr>
-                <w:color w:val="1B2630"/>
-                <w:sz w:val="17"/>
-                <w:lang w:val="nl-BE"/>
-              </w:rPr>
-              <w:t>3 u theorie, 1,5 u toestemming en randomisatie, plus de kennistoets</w:t>
+            </w:pPr>
+            <w:r/>
+            <w:r>
+              <w:rPr>
+                <w:rFonts w:ascii="Segoe UI" w:hAnsi="Segoe UI"/>
+                <w:b w:val="0"/>
+                <w:color w:val="1B2630"/>
+                <w:sz w:val="17"/>
+              </w:rPr>
+              <w:t>3 u theorie, 1,5 u toestemming en randomisatie</w:t>
             </w:r>
           </w:p>
         </w:tc>
@@ -4466,17 +4265,16 @@
           <w:p>
             <w:pPr>
               <w:spacing w:before="40" w:after="40"/>
-              <w:rPr>
-                <w:lang w:val="nl-BE"/>
-              </w:rPr>
-            </w:pPr>
-            <w:r>
-              <w:rPr>
-                <w:color w:val="1B2630"/>
-                <w:sz w:val="17"/>
-                <w:lang w:val="nl-BE"/>
-              </w:rPr>
-              <w:t>3 u theorie, 2 u technologie, 4,5 u droogloop, 1 u ICC</w:t>
+            </w:pPr>
+            <w:r/>
+            <w:r>
+              <w:rPr>
+                <w:rFonts w:ascii="Segoe UI" w:hAnsi="Segoe UI"/>
+                <w:b w:val="0"/>
+                <w:color w:val="1B2630"/>
+                <w:sz w:val="17"/>
+              </w:rPr>
+              <w:t>3 u theorie, 2 u technologie, 4,5 u droogloop</w:t>
             </w:r>
           </w:p>
         </w:tc>
@@ -4537,7 +4335,7 @@
                 <w:color w:val="1B2630"/>
                 <w:sz w:val="17"/>
               </w:rPr>
-              <w:t>3 u theorie, 1,5 u toestemming, 1,5 u educatie, 2 u technologie, 6 u gedrag, 3 u vragenlijsten, 4,5 u droogloop, 1 u ICC — samen 22,5 u vóór de start, plus 6 u in april</w:t>
+              <w:t>3 u theorie, 1,5 u toestemming, 1,5 u educatie, 2 u technologie, 6 u gedrag, 3 u vragenlijsten, 4,5 u droogloop — samen 21,5 u vóór de start, plus 6 u in april</w:t>
             </w:r>
           </w:p>
         </w:tc>
@@ -5245,52 +5043,60 @@
         <w:tc>
           <w:tcPr>
             <w:tcW w:w="3400" w:type="dxa"/>
-          </w:tcPr>
-          <w:p>
-            <w:pPr>
-              <w:spacing w:before="40" w:after="40"/>
-            </w:pPr>
-            <w:r>
-              <w:rPr>
+            <w:shd w:val="clear" w:color="auto" w:fill="EAF3F8"/>
+          </w:tcPr>
+          <w:p>
+            <w:pPr>
+              <w:spacing w:before="40" w:after="40"/>
+            </w:pPr>
+            <w:r/>
+            <w:r>
+              <w:rPr>
+                <w:rFonts w:ascii="Segoe UI" w:hAnsi="Segoe UI"/>
                 <w:b/>
                 <w:color w:val="1B2630"/>
                 <w:sz w:val="17"/>
               </w:rPr>
-              <w:t>ICC-meting, zes centra</w:t>
+              <w:t>Gedragsdag 2, in april 2027</w:t>
             </w:r>
           </w:p>
         </w:tc>
         <w:tc>
           <w:tcPr>
             <w:tcW w:w="3600" w:type="dxa"/>
-          </w:tcPr>
-          <w:p>
-            <w:pPr>
-              <w:spacing w:before="40" w:after="40"/>
-            </w:pPr>
-            <w:r>
-              <w:rPr>
-                <w:color w:val="1B2630"/>
-                <w:sz w:val="17"/>
-              </w:rPr>
-              <w:t>Janou</w:t>
+            <w:shd w:val="clear" w:color="auto" w:fill="EAF3F8"/>
+          </w:tcPr>
+          <w:p>
+            <w:pPr>
+              <w:spacing w:before="40" w:after="40"/>
+            </w:pPr>
+            <w:r>
+              <w:rPr>
+                <w:color w:val="1B2630"/>
+                <w:sz w:val="17"/>
+              </w:rPr>
+              <w:t>Dobbels</w:t>
             </w:r>
           </w:p>
         </w:tc>
         <w:tc>
           <w:tcPr>
             <w:tcW w:w="2860" w:type="dxa"/>
-          </w:tcPr>
-          <w:p>
-            <w:pPr>
-              <w:spacing w:before="40" w:after="40"/>
-            </w:pPr>
-            <w:r>
-              <w:rPr>
-                <w:color w:val="1B2630"/>
-                <w:sz w:val="17"/>
-              </w:rPr>
-              <w:t>6 u</w:t>
+            <w:shd w:val="clear" w:color="auto" w:fill="EAF3F8"/>
+          </w:tcPr>
+          <w:p>
+            <w:pPr>
+              <w:spacing w:before="40" w:after="40"/>
+            </w:pPr>
+            <w:r/>
+            <w:r>
+              <w:rPr>
+                <w:rFonts w:ascii="Segoe UI" w:hAnsi="Segoe UI"/>
+                <w:b w:val="0"/>
+                <w:color w:val="1B2630"/>
+                <w:sz w:val="17"/>
+              </w:rPr>
+              <w:t>36 u</w:t>
             </w:r>
           </w:p>
         </w:tc>
@@ -5305,15 +5111,13 @@
             <w:pPr>
               <w:spacing w:before="40" w:after="40"/>
             </w:pPr>
-            <w:r/>
-            <w:r>
-              <w:rPr>
-                <w:rFonts w:ascii="Segoe UI" w:hAnsi="Segoe UI"/>
+            <w:r>
+              <w:rPr>
                 <w:b/>
-                <w:color w:val="1B2630"/>
-                <w:sz w:val="17"/>
-              </w:rPr>
-              <w:t>Gedragsdag 2, in april 2027</w:t>
+                <w:color w:val="00407A"/>
+                <w:sz w:val="17"/>
+              </w:rPr>
+              <w:t>Totaal vóór de start</w:t>
             </w:r>
           </w:p>
         </w:tc>
@@ -5326,12 +5130,15 @@
             <w:pPr>
               <w:spacing w:before="40" w:after="40"/>
             </w:pPr>
-            <w:r>
-              <w:rPr>
-                <w:color w:val="1B2630"/>
-                <w:sz w:val="17"/>
-              </w:rPr>
-              <w:t>Dobbels</w:t>
+            <w:r/>
+            <w:r>
+              <w:rPr>
+                <w:rFonts w:ascii="Segoe UI" w:hAnsi="Segoe UI"/>
+                <w:b w:val="0"/>
+                <w:color w:val="1B2630"/>
+                <w:sz w:val="17"/>
+              </w:rPr>
+              <w:t>waarvan Janou 42 u</w:t>
             </w:r>
           </w:p>
         </w:tc>
@@ -5352,68 +5159,7 @@
                 <w:color w:val="1B2630"/>
                 <w:sz w:val="17"/>
               </w:rPr>
-              <w:t>36 u</w:t>
-            </w:r>
-          </w:p>
-        </w:tc>
-      </w:tr>
-      <w:tr>
-        <w:tc>
-          <w:tcPr>
-            <w:tcW w:w="3400" w:type="dxa"/>
-            <w:shd w:val="clear" w:color="auto" w:fill="EAF3F8"/>
-          </w:tcPr>
-          <w:p>
-            <w:pPr>
-              <w:spacing w:before="40" w:after="40"/>
-            </w:pPr>
-            <w:r>
-              <w:rPr>
-                <w:b/>
-                <w:color w:val="00407A"/>
-                <w:sz w:val="17"/>
-              </w:rPr>
-              <w:t>Totaal vóór de start</w:t>
-            </w:r>
-          </w:p>
-        </w:tc>
-        <w:tc>
-          <w:tcPr>
-            <w:tcW w:w="3600" w:type="dxa"/>
-            <w:shd w:val="clear" w:color="auto" w:fill="EAF3F8"/>
-          </w:tcPr>
-          <w:p>
-            <w:pPr>
-              <w:spacing w:before="40" w:after="40"/>
-            </w:pPr>
-            <w:r>
-              <w:rPr>
-                <w:b/>
-                <w:color w:val="00407A"/>
-                <w:sz w:val="17"/>
-              </w:rPr>
-              <w:t>waarvan Janou 48 u</w:t>
-            </w:r>
-          </w:p>
-        </w:tc>
-        <w:tc>
-          <w:tcPr>
-            <w:tcW w:w="2860" w:type="dxa"/>
-            <w:shd w:val="clear" w:color="auto" w:fill="EAF3F8"/>
-          </w:tcPr>
-          <w:p>
-            <w:pPr>
-              <w:spacing w:before="40" w:after="40"/>
-            </w:pPr>
-            <w:r/>
-            <w:r>
-              <w:rPr>
-                <w:rFonts w:ascii="Segoe UI" w:hAnsi="Segoe UI"/>
-                <w:b w:val="0"/>
-                <w:color w:val="1B2630"/>
-                <w:sz w:val="17"/>
-              </w:rPr>
-              <w:t>92 u</w:t>
+              <w:t>86 u</w:t>
             </w:r>
           </w:p>
         </w:tc>
@@ -5558,7 +5304,7 @@
                 <w:color w:val="1B2630"/>
                 <w:sz w:val="17"/>
               </w:rPr>
-              <w:t>Vier online sessies bijwonen; geen eigen lesuren</w:t>
+              <w:t>Vier online sessies bijwonen, geen verplaatsing</w:t>
             </w:r>
           </w:p>
         </w:tc>
@@ -5744,7 +5490,7 @@
                 <w:color w:val="1B2630"/>
                 <w:sz w:val="17"/>
               </w:rPr>
-              <w:t>di 15 Leuven, wo 16 Antwerpen, vr 18 vragenlijstenset uit</w:t>
+              <w:t>di 15 Leuven, wo 16 Antwerpen — technologie; vr 18 vragenlijstenset uit</w:t>
             </w:r>
           </w:p>
         </w:tc>
@@ -5868,7 +5614,7 @@
                 <w:color w:val="1B2630"/>
                 <w:sz w:val="17"/>
               </w:rPr>
-              <w:t>di 12 datacollectie bijwonen, do 14 Brugge, vr 15 Kortrijk</w:t>
+              <w:t>di 12 datacollectie online; do 14 Brugge, vr 15 Kortrijk — droogloop</w:t>
             </w:r>
           </w:p>
         </w:tc>
@@ -5930,7 +5676,7 @@
                 <w:color w:val="1B2630"/>
                 <w:sz w:val="17"/>
               </w:rPr>
-              <w:t>di 19 Gent, wo 20 Aalst</w:t>
+              <w:t>di 19 Gent, wo 20 Aalst — droogloop</w:t>
             </w:r>
           </w:p>
         </w:tc>
@@ -5992,7 +5738,7 @@
                 <w:color w:val="1B2630"/>
                 <w:sz w:val="17"/>
               </w:rPr>
-              <w:t>di 26 Leuven, wo 27 Antwerpen, vr 29 register afwerken</w:t>
+              <w:t>di 26 Leuven, wo 27 Antwerpen — droogloop</w:t>
             </w:r>
           </w:p>
         </w:tc>
@@ -6012,7 +5758,7 @@
                 <w:color w:val="1B2630"/>
                 <w:sz w:val="17"/>
               </w:rPr>
-              <w:t>3,5</w:t>
+              <w:t>2</w:t>
             </w:r>
           </w:p>
         </w:tc>
@@ -6035,7 +5781,7 @@
                 <w:color w:val="00407A"/>
                 <w:sz w:val="17"/>
               </w:rPr>
-              <w:t>Tien weken</w:t>
+              <w:t>Tien reisdagen, twaalf sitebezoeken</w:t>
             </w:r>
           </w:p>
         </w:tc>
@@ -6056,7 +5802,7 @@
                 <w:color w:val="00407A"/>
                 <w:sz w:val="17"/>
               </w:rPr>
-              <w:t>Twaalf sitebezoeken in zes centra</w:t>
+              <w:t>Elke dag met een verplaatsing telt als een volle dag</w:t>
             </w:r>
           </w:p>
         </w:tc>
@@ -6077,7 +5823,7 @@
                 <w:color w:val="00407A"/>
                 <w:sz w:val="17"/>
               </w:rPr>
-              <w:t>14 dagen</w:t>
+              <w:t>12,5 dagen</w:t>
             </w:r>
           </w:p>
         </w:tc>
@@ -6422,148 +6168,6 @@
         <w:tc>
           <w:tcPr>
             <w:tcW w:w="3000" w:type="dxa"/>
-          </w:tcPr>
-          <w:p>
-            <w:pPr>
-              <w:spacing w:before="40" w:after="40"/>
-            </w:pPr>
-            <w:r>
-              <w:rPr>
-                <w:b/>
-                <w:color w:val="1B2630"/>
-                <w:sz w:val="17"/>
-              </w:rPr>
-              <w:t>ICC</w:t>
-            </w:r>
-          </w:p>
-        </w:tc>
-        <w:tc>
-          <w:tcPr>
-            <w:tcW w:w="2600" w:type="dxa"/>
-          </w:tcPr>
-          <w:p>
-            <w:pPr>
-              <w:spacing w:before="40" w:after="40"/>
-            </w:pPr>
-            <w:r>
-              <w:rPr>
-                <w:color w:val="1B2630"/>
-                <w:sz w:val="17"/>
-              </w:rPr>
-              <w:t>8 u opzet, vrijwilligers, analyse</w:t>
-            </w:r>
-          </w:p>
-        </w:tc>
-        <w:tc>
-          <w:tcPr>
-            <w:tcW w:w="2200" w:type="dxa"/>
-          </w:tcPr>
-          <w:p>
-            <w:pPr>
-              <w:spacing w:before="40" w:after="40"/>
-            </w:pPr>
-            <w:r>
-              <w:rPr>
-                <w:color w:val="1B2630"/>
-                <w:sz w:val="17"/>
-              </w:rPr>
-              <w:t>—</w:t>
-            </w:r>
-          </w:p>
-        </w:tc>
-        <w:tc>
-          <w:tcPr>
-            <w:tcW w:w="2060" w:type="dxa"/>
-          </w:tcPr>
-          <w:p>
-            <w:pPr>
-              <w:spacing w:before="40" w:after="40"/>
-            </w:pPr>
-            <w:r>
-              <w:rPr>
-                <w:color w:val="1B2630"/>
-                <w:sz w:val="17"/>
-              </w:rPr>
-              <w:t>8 u</w:t>
-            </w:r>
-          </w:p>
-        </w:tc>
-      </w:tr>
-      <w:tr>
-        <w:tc>
-          <w:tcPr>
-            <w:tcW w:w="3000" w:type="dxa"/>
-          </w:tcPr>
-          <w:p>
-            <w:pPr>
-              <w:spacing w:before="40" w:after="40"/>
-            </w:pPr>
-            <w:r>
-              <w:rPr>
-                <w:b/>
-                <w:color w:val="1B2630"/>
-                <w:sz w:val="17"/>
-              </w:rPr>
-              <w:t>Certificering, administratie</w:t>
-            </w:r>
-          </w:p>
-        </w:tc>
-        <w:tc>
-          <w:tcPr>
-            <w:tcW w:w="2600" w:type="dxa"/>
-          </w:tcPr>
-          <w:p>
-            <w:pPr>
-              <w:spacing w:before="40" w:after="40"/>
-            </w:pPr>
-            <w:r>
-              <w:rPr>
-                <w:color w:val="1B2630"/>
-                <w:sz w:val="17"/>
-              </w:rPr>
-              <w:t>4 u</w:t>
-            </w:r>
-          </w:p>
-        </w:tc>
-        <w:tc>
-          <w:tcPr>
-            <w:tcW w:w="2200" w:type="dxa"/>
-          </w:tcPr>
-          <w:p>
-            <w:pPr>
-              <w:spacing w:before="40" w:after="40"/>
-            </w:pPr>
-            <w:r>
-              <w:rPr>
-                <w:color w:val="1B2630"/>
-                <w:sz w:val="17"/>
-              </w:rPr>
-              <w:t>—</w:t>
-            </w:r>
-          </w:p>
-        </w:tc>
-        <w:tc>
-          <w:tcPr>
-            <w:tcW w:w="2060" w:type="dxa"/>
-          </w:tcPr>
-          <w:p>
-            <w:pPr>
-              <w:spacing w:before="40" w:after="40"/>
-            </w:pPr>
-            <w:r>
-              <w:rPr>
-                <w:color w:val="1B2630"/>
-                <w:sz w:val="17"/>
-              </w:rPr>
-              <w:t>4 u</w:t>
-            </w:r>
-          </w:p>
-        </w:tc>
-      </w:tr>
-      <w:tr>
-        <w:tc>
-          <w:tcPr>
-            <w:tcW w:w="3000" w:type="dxa"/>
             <w:shd w:val="clear" w:color="auto" w:fill="EAF3F8"/>
           </w:tcPr>
           <w:p>
@@ -6627,13 +6231,15 @@
             <w:pPr>
               <w:spacing w:before="40" w:after="40"/>
             </w:pPr>
-            <w:r>
-              <w:rPr>
-                <w:b/>
-                <w:color w:val="00407A"/>
-                <w:sz w:val="17"/>
-              </w:rPr>
-              <w:t>36 u ≈ 4,5 dagen</w:t>
+            <w:r/>
+            <w:r>
+              <w:rPr>
+                <w:rFonts w:ascii="Segoe UI" w:hAnsi="Segoe UI"/>
+                <w:b w:val="0"/>
+                <w:color w:val="1B2630"/>
+                <w:sz w:val="17"/>
+              </w:rPr>
+              <w:t>24 u ≈ 3 dagen</w:t>
             </w:r>
           </w:p>
         </w:tc>
@@ -6731,7 +6337,7 @@
                 <w:color w:val="1B2630"/>
                 <w:sz w:val="17"/>
               </w:rPr>
-              <w:t>Janou · sessies, reizen en opstellen</w:t>
+              <w:t>Janou · sessies en reisdagen</w:t>
             </w:r>
           </w:p>
         </w:tc>
@@ -6751,7 +6357,7 @@
                 <w:color w:val="1B2630"/>
                 <w:sz w:val="17"/>
               </w:rPr>
-              <w:t>14</w:t>
+              <w:t>12,5</w:t>
             </w:r>
           </w:p>
         </w:tc>
@@ -6773,7 +6379,7 @@
                 <w:color w:val="1B2630"/>
                 <w:sz w:val="17"/>
               </w:rPr>
-              <w:t>Janou · voorbereiding en administratie</w:t>
+              <w:t>Janou · voorbereiding</w:t>
             </w:r>
           </w:p>
         </w:tc>
@@ -6793,7 +6399,7 @@
                 <w:color w:val="1B2630"/>
                 <w:sz w:val="17"/>
               </w:rPr>
-              <w:t>4,5</w:t>
+              <w:t>3</w:t>
             </w:r>
           </w:p>
         </w:tc>
@@ -6857,7 +6463,7 @@
                 <w:color w:val="1B2630"/>
                 <w:sz w:val="17"/>
               </w:rPr>
-              <w:t>Dobbels · 37,5 u contact vóór de start, twaalf volle lesdagen</w:t>
+              <w:t>Dobbels · 37,5 u contact, zes lesdagen in december</w:t>
             </w:r>
           </w:p>
         </w:tc>
@@ -6877,7 +6483,7 @@
                 <w:color w:val="1B2630"/>
                 <w:sz w:val="17"/>
               </w:rPr>
-              <w:t>10</w:t>
+              <w:t>9</w:t>
             </w:r>
           </w:p>
         </w:tc>
@@ -6963,7 +6569,7 @@
                 <w:color w:val="00407A"/>
                 <w:sz w:val="17"/>
               </w:rPr>
-              <w:t>18,5 van de 48 werkdagen</w:t>
+              <w:t>15,5 van de 48 werkdagen</w:t>
             </w:r>
           </w:p>
         </w:tc>
@@ -7018,26 +6624,21 @@
       </w:pPr>
       <w:r>
         <w:rPr>
+          <w:rFonts w:ascii="Segoe UI" w:hAnsi="Segoe UI"/>
           <w:b/>
           <w:color w:val="FF7A00"/>
-          <w:lang w:val="nl-BE"/>
+          <w:sz w:val="19"/>
         </w:rPr>
         <w:t xml:space="preserve">1.  </w:t>
       </w:r>
       <w:r>
         <w:rPr>
+          <w:rFonts w:ascii="Segoe UI" w:hAnsi="Segoe UI"/>
           <w:b/>
           <w:color w:val="1B2630"/>
-          <w:lang w:val="nl-BE"/>
+          <w:sz w:val="19"/>
         </w:rPr>
         <w:t>De zes data van december en januari, met per centrum wie er die dag bij is.</w:t>
-      </w:r>
-      <w:r>
-        <w:rPr>
-          <w:color w:val="1B2630"/>
-          <w:lang w:val="nl-BE"/>
-        </w:rPr>
-        <w:t xml:space="preserve">  </w:t>
       </w:r>
     </w:p>
     <w:p>
@@ -7077,26 +6678,21 @@
       </w:pPr>
       <w:r>
         <w:rPr>
+          <w:rFonts w:ascii="Segoe UI" w:hAnsi="Segoe UI"/>
           <w:b/>
           <w:color w:val="FF7A00"/>
-          <w:lang w:val="nl-BE"/>
+          <w:sz w:val="19"/>
         </w:rPr>
         <w:t xml:space="preserve">3.  </w:t>
       </w:r>
       <w:r>
         <w:rPr>
+          <w:rFonts w:ascii="Segoe UI" w:hAnsi="Segoe UI"/>
           <w:b/>
           <w:color w:val="1B2630"/>
-          <w:lang w:val="nl-BE"/>
+          <w:sz w:val="19"/>
         </w:rPr>
         <w:t>Educatie online of ter plaatse.</w:t>
-      </w:r>
-      <w:r>
-        <w:rPr>
-          <w:color w:val="1B2630"/>
-          <w:lang w:val="nl-BE"/>
-        </w:rPr>
-        <w:t xml:space="preserve">  </w:t>
       </w:r>
     </w:p>
     <w:p>
@@ -7136,19 +6732,21 @@
       </w:pPr>
       <w:r>
         <w:rPr>
+          <w:rFonts w:ascii="Segoe UI" w:hAnsi="Segoe UI"/>
           <w:b/>
           <w:color w:val="FF7A00"/>
-          <w:lang w:val="nl-BE"/>
+          <w:sz w:val="19"/>
         </w:rPr>
         <w:t xml:space="preserve">5.  </w:t>
       </w:r>
       <w:r>
         <w:rPr>
+          <w:rFonts w:ascii="Segoe UI" w:hAnsi="Segoe UI"/>
           <w:b/>
           <w:color w:val="1B2630"/>
-          <w:lang w:val="nl-BE"/>
+          <w:sz w:val="19"/>
         </w:rPr>
-        <w:t>Wie de derde persoon per centrum is die meeloopt voor de certificering.</w:t>
+        <w:t>Wie de thema's geeft die Janou niet doet — voorstel: Deschamps theorie en randomisatie, Dobbels educatie en gedrag, Fobelets datacollectie (proces en GE evaluatie).</w:t>
       </w:r>
     </w:p>
     <w:p>
@@ -7161,58 +6759,19 @@
       </w:pPr>
       <w:r>
         <w:rPr>
+          <w:rFonts w:ascii="Segoe UI" w:hAnsi="Segoe UI"/>
           <w:b/>
           <w:color w:val="FF7A00"/>
-          <w:lang w:val="nl-BE"/>
+          <w:sz w:val="19"/>
         </w:rPr>
         <w:t xml:space="preserve">6.  </w:t>
       </w:r>
       <w:r>
         <w:rPr>
+          <w:rFonts w:ascii="Segoe UI" w:hAnsi="Segoe UI"/>
           <w:b/>
           <w:color w:val="1B2630"/>
-          <w:lang w:val="nl-BE"/>
-        </w:rPr>
-        <w:t>Wie de thema's geeft die Janou niet doet — voorstel: Deschamps theorie en randomisatie, Dobbels educatie en gedrag, Fobelets datacollectie</w:t>
-      </w:r>
-      <w:r>
-        <w:rPr>
-          <w:b/>
-          <w:color w:val="1B2630"/>
-          <w:lang w:val="nl-BE"/>
-        </w:rPr>
-        <w:t xml:space="preserve"> (proces en GE evaluatie)</w:t>
-      </w:r>
-      <w:r>
-        <w:rPr>
-          <w:b/>
-          <w:color w:val="1B2630"/>
-          <w:lang w:val="nl-BE"/>
-        </w:rPr>
-        <w:t>.</w:t>
-      </w:r>
-    </w:p>
-    <w:p>
-      <w:pPr>
-        <w:spacing w:after="80"/>
-        <w:ind w:left="280" w:hanging="280"/>
-        <w:rPr>
-          <w:lang w:val="nl-BE"/>
-        </w:rPr>
-      </w:pPr>
-      <w:r>
-        <w:rPr>
-          <w:b/>
-          <w:color w:val="FF7A00"/>
-          <w:lang w:val="nl-BE"/>
-        </w:rPr>
-        <w:t xml:space="preserve">7.  </w:t>
-      </w:r>
-      <w:r>
-        <w:rPr>
-          <w:b/>
-          <w:color w:val="1B2630"/>
-          <w:lang w:val="nl-BE"/>
+          <w:sz w:val="19"/>
         </w:rPr>
         <w:t>Een plaatsvervanger voor technologie en droogloop, met naam.</w:t>
       </w:r>
@@ -7232,7 +6791,7 @@
           <w:color w:val="FF7A00"/>
           <w:sz w:val="19"/>
         </w:rPr>
-        <w:t xml:space="preserve">8.  </w:t>
+        <w:t xml:space="preserve">7.  </w:t>
       </w:r>
       <w:r>
         <w:rPr>

</xml_diff>

<commit_message>
Opleidingsplanning: gedrag wordt zes blokken van een uur, drie per dag
Twee dagdelen van drie uur per centrum in plaats van twee volle dagen. Zes uur
per zorgverlener. Dobbels gaat van 37,5 naar 19,5 contacturen voor de start,
de contacturen in totaal van 86 naar 68, en de podoloog van 21,5 naar 18,5 uur.
</commit_message>
<xml_diff>
--- a/PARADISE_opleidingsplanning.docx
+++ b/PARADISE_opleidingsplanning.docx
@@ -435,7 +435,7 @@
                 <w:color w:val="1B2630"/>
                 <w:sz w:val="17"/>
               </w:rPr>
-              <w:t>6 blokken van 2 u, drie per dag</w:t>
+              <w:t>6 blokken van 1 u, drie per dag</w:t>
             </w:r>
           </w:p>
         </w:tc>
@@ -1783,7 +1783,7 @@
                 <w:color w:val="1B2630"/>
                 <w:sz w:val="17"/>
               </w:rPr>
-              <w:t>Gedragsdag 1: blok 1 tot 3, zes uur per centrum — op een andere dag dan de technologiedag</w:t>
+              <w:t>Gedragsdag 1: blok 1 tot 3, drie uur per centrum — op een andere dag dan de technologiedag</w:t>
             </w:r>
           </w:p>
         </w:tc>
@@ -2921,7 +2921,7 @@
                 <w:color w:val="1B2630"/>
                 <w:sz w:val="17"/>
               </w:rPr>
-              <w:t>Gedragsdag 2: blok 4 tot 6, zes uur per centrum — terugkoppeling op meetgegevens, stap 3 en 4, en de fideliteitsterugkoppeling. Zes dagen, vóór de eerste maand 3-visites</w:t>
+              <w:t>Gedragsdag 2: blok 4 tot 6, drie uur per centrum — terugkoppeling op meetgegevens, stap 3 en 4, en de fideliteitsterugkoppeling. Zes dagen, vóór de eerste maand 3-visites</w:t>
             </w:r>
           </w:p>
         </w:tc>
@@ -4335,7 +4335,7 @@
                 <w:color w:val="1B2630"/>
                 <w:sz w:val="17"/>
               </w:rPr>
-              <w:t>3 u theorie, 1,5 u toestemming, 1,5 u educatie, 2 u technologie, 6 u gedrag, 3 u vragenlijsten, 4,5 u droogloop — samen 21,5 u vóór de start, plus 6 u in april</w:t>
+              <w:t>3 u theorie, 1,5 u toestemming, 1,5 u educatie, 2 u technologie, 3 u gedrag, 3 u vragenlijsten, 4,5 u droogloop — samen 18,5 u vóór de start, plus 3 u in april</w:t>
             </w:r>
           </w:p>
         </w:tc>
@@ -4466,7 +4466,7 @@
                 <w:color w:val="1B2630"/>
                 <w:sz w:val="17"/>
               </w:rPr>
-              <w:t>Janou twaalf sitebezoeken, Dobbels twaalf volle dagen — zes per gedragsdag</w:t>
+              <w:t>Janou twaalf sitebezoeken, Dobbels twaalf reisdagen — zes per gedragsdag</w:t>
             </w:r>
           </w:p>
         </w:tc>
@@ -4814,7 +4814,7 @@
                 <w:color w:val="1B2630"/>
                 <w:sz w:val="17"/>
               </w:rPr>
-              <w:t>36 u</w:t>
+              <w:t>18 u</w:t>
             </w:r>
           </w:p>
         </w:tc>
@@ -5096,7 +5096,7 @@
                 <w:color w:val="1B2630"/>
                 <w:sz w:val="17"/>
               </w:rPr>
-              <w:t>36 u</w:t>
+              <w:t>18 u</w:t>
             </w:r>
           </w:p>
         </w:tc>
@@ -5159,7 +5159,7 @@
                 <w:color w:val="1B2630"/>
                 <w:sz w:val="17"/>
               </w:rPr>
-              <w:t>86 u</w:t>
+              <w:t>68 u</w:t>
             </w:r>
           </w:p>
         </w:tc>
@@ -6463,7 +6463,7 @@
                 <w:color w:val="1B2630"/>
                 <w:sz w:val="17"/>
               </w:rPr>
-              <w:t>Dobbels · 37,5 u contact, zes lesdagen in december</w:t>
+              <w:t>Dobbels · 19,5 u contact vóór de start, zes lesdagen in december</w:t>
             </w:r>
           </w:p>
         </w:tc>
@@ -6483,7 +6483,7 @@
                 <w:color w:val="1B2630"/>
                 <w:sz w:val="17"/>
               </w:rPr>
-              <w:t>9</w:t>
+              <w:t>8</w:t>
             </w:r>
           </w:p>
         </w:tc>
@@ -6719,7 +6719,7 @@
           <w:color w:val="1B2630"/>
           <w:sz w:val="19"/>
         </w:rPr>
-        <w:t>Zes uur gedrag vóór de start en zes in april — of alle twaalf vooraf.</w:t>
+        <w:t>Drie uur gedrag vóór de start en drie in april — of alle zes vooraf.</w:t>
       </w:r>
     </w:p>
     <w:p>

</xml_diff>

<commit_message>
Opleidingsplanning: Janou woont de gedragsdagen bij
Zes extra reisdagen in december, en nog eens zes in april. Daarmee gaat Janou van
twaalf naar achttien sitebezoeken en van 15,5 naar 21,5 van de 48 werkdagen.
</commit_message>
<xml_diff>
--- a/PARADISE_opleidingsplanning.docx
+++ b/PARADISE_opleidingsplanning.docx
@@ -4466,7 +4466,7 @@
                 <w:color w:val="1B2630"/>
                 <w:sz w:val="17"/>
               </w:rPr>
-              <w:t>Janou twaalf sitebezoeken, Dobbels twaalf reisdagen — zes per gedragsdag</w:t>
+              <w:t>Janou achttien sitebezoeken, Dobbels twaalf reisdagen — zes per gedragsdag</w:t>
             </w:r>
           </w:p>
         </w:tc>
@@ -4789,23 +4789,6 @@
             <w:pPr>
               <w:spacing w:before="40" w:after="40"/>
             </w:pPr>
-            <w:r>
-              <w:rPr>
-                <w:color w:val="1B2630"/>
-                <w:sz w:val="17"/>
-              </w:rPr>
-              <w:t>Dobbels</w:t>
-            </w:r>
-          </w:p>
-        </w:tc>
-        <w:tc>
-          <w:tcPr>
-            <w:tcW w:w="2860" w:type="dxa"/>
-          </w:tcPr>
-          <w:p>
-            <w:pPr>
-              <w:spacing w:before="40" w:after="40"/>
-            </w:pPr>
             <w:r/>
             <w:r>
               <w:rPr>
@@ -4814,6 +4797,26 @@
                 <w:color w:val="1B2630"/>
                 <w:sz w:val="17"/>
               </w:rPr>
+              <w:t>Dobbels, met Janou erbij</w:t>
+            </w:r>
+          </w:p>
+        </w:tc>
+        <w:tc>
+          <w:tcPr>
+            <w:tcW w:w="2860" w:type="dxa"/>
+          </w:tcPr>
+          <w:p>
+            <w:pPr>
+              <w:spacing w:before="40" w:after="40"/>
+            </w:pPr>
+            <w:r/>
+            <w:r>
+              <w:rPr>
+                <w:rFonts w:ascii="Segoe UI" w:hAnsi="Segoe UI"/>
+                <w:b w:val="0"/>
+                <w:color w:val="1B2630"/>
+                <w:sz w:val="17"/>
+              </w:rPr>
               <w:t>18 u</w:t>
             </w:r>
           </w:p>
@@ -5070,12 +5073,15 @@
             <w:pPr>
               <w:spacing w:before="40" w:after="40"/>
             </w:pPr>
-            <w:r>
-              <w:rPr>
-                <w:color w:val="1B2630"/>
-                <w:sz w:val="17"/>
-              </w:rPr>
-              <w:t>Dobbels</w:t>
+            <w:r/>
+            <w:r>
+              <w:rPr>
+                <w:rFonts w:ascii="Segoe UI" w:hAnsi="Segoe UI"/>
+                <w:b w:val="0"/>
+                <w:color w:val="1B2630"/>
+                <w:sz w:val="17"/>
+              </w:rPr>
+              <w:t>Dobbels, met Janou erbij</w:t>
             </w:r>
           </w:p>
         </w:tc>
@@ -5532,7 +5538,7 @@
                 <w:color w:val="1B2630"/>
                 <w:sz w:val="17"/>
               </w:rPr>
-              <w:t>4–8 jan</w:t>
+              <w:t>december, te plannen</w:t>
             </w:r>
           </w:p>
         </w:tc>
@@ -5552,7 +5558,7 @@
                 <w:color w:val="1B2630"/>
                 <w:sz w:val="17"/>
               </w:rPr>
-              <w:t>Zelftest loopt in de centra</w:t>
+              <w:t>Zes gedragsdagen bijwonen, één per centrum</w:t>
             </w:r>
           </w:p>
         </w:tc>
@@ -5572,7 +5578,7 @@
                 <w:color w:val="1B2630"/>
                 <w:sz w:val="17"/>
               </w:rPr>
-              <w:t>0,5</w:t>
+              <w:t>6</w:t>
             </w:r>
           </w:p>
         </w:tc>
@@ -5594,7 +5600,7 @@
                 <w:color w:val="1B2630"/>
                 <w:sz w:val="17"/>
               </w:rPr>
-              <w:t>11–15 jan</w:t>
+              <w:t>4–8 jan</w:t>
             </w:r>
           </w:p>
         </w:tc>
@@ -5614,7 +5620,7 @@
                 <w:color w:val="1B2630"/>
                 <w:sz w:val="17"/>
               </w:rPr>
-              <w:t>di 12 datacollectie online; do 14 Brugge, vr 15 Kortrijk — droogloop</w:t>
+              <w:t>Zelftest loopt in de centra</w:t>
             </w:r>
           </w:p>
         </w:tc>
@@ -5634,7 +5640,7 @@
                 <w:color w:val="1B2630"/>
                 <w:sz w:val="17"/>
               </w:rPr>
-              <w:t>2,5</w:t>
+              <w:t>0,5</w:t>
             </w:r>
           </w:p>
         </w:tc>
@@ -5656,7 +5662,7 @@
                 <w:color w:val="1B2630"/>
                 <w:sz w:val="17"/>
               </w:rPr>
-              <w:t>18–22 jan</w:t>
+              <w:t>11–15 jan</w:t>
             </w:r>
           </w:p>
         </w:tc>
@@ -5676,7 +5682,7 @@
                 <w:color w:val="1B2630"/>
                 <w:sz w:val="17"/>
               </w:rPr>
-              <w:t>di 19 Gent, wo 20 Aalst — droogloop</w:t>
+              <w:t>di 12 datacollectie online; do 14 Brugge, vr 15 Kortrijk — droogloop</w:t>
             </w:r>
           </w:p>
         </w:tc>
@@ -5696,7 +5702,7 @@
                 <w:color w:val="1B2630"/>
                 <w:sz w:val="17"/>
               </w:rPr>
-              <w:t>2</w:t>
+              <w:t>2,5</w:t>
             </w:r>
           </w:p>
         </w:tc>
@@ -5718,7 +5724,7 @@
                 <w:color w:val="1B2630"/>
                 <w:sz w:val="17"/>
               </w:rPr>
-              <w:t>25–29 jan</w:t>
+              <w:t>18–22 jan</w:t>
             </w:r>
           </w:p>
         </w:tc>
@@ -5738,7 +5744,7 @@
                 <w:color w:val="1B2630"/>
                 <w:sz w:val="17"/>
               </w:rPr>
-              <w:t>di 26 Leuven, wo 27 Antwerpen — droogloop</w:t>
+              <w:t>di 19 Gent, wo 20 Aalst — droogloop</w:t>
             </w:r>
           </w:p>
         </w:tc>
@@ -5767,6 +5773,71 @@
         <w:tc>
           <w:tcPr>
             <w:tcW w:w="1900" w:type="dxa"/>
+            <w:shd w:val="clear" w:color="auto" w:fill="EAF3F8"/>
+          </w:tcPr>
+          <w:p>
+            <w:pPr>
+              <w:spacing w:before="40" w:after="40"/>
+            </w:pPr>
+            <w:r/>
+            <w:r>
+              <w:rPr>
+                <w:rFonts w:ascii="Segoe UI" w:hAnsi="Segoe UI"/>
+                <w:b/>
+                <w:color w:val="1B2630"/>
+                <w:sz w:val="17"/>
+              </w:rPr>
+              <w:t>25–29 jan</w:t>
+            </w:r>
+          </w:p>
+        </w:tc>
+        <w:tc>
+          <w:tcPr>
+            <w:tcW w:w="6300" w:type="dxa"/>
+            <w:shd w:val="clear" w:color="auto" w:fill="EAF3F8"/>
+          </w:tcPr>
+          <w:p>
+            <w:pPr>
+              <w:spacing w:before="40" w:after="40"/>
+            </w:pPr>
+            <w:r/>
+            <w:r>
+              <w:rPr>
+                <w:rFonts w:ascii="Segoe UI" w:hAnsi="Segoe UI"/>
+                <w:b w:val="0"/>
+                <w:color w:val="1B2630"/>
+                <w:sz w:val="17"/>
+              </w:rPr>
+              <w:t>di 26 Leuven, wo 27 Antwerpen — droogloop</w:t>
+            </w:r>
+          </w:p>
+        </w:tc>
+        <w:tc>
+          <w:tcPr>
+            <w:tcW w:w="1660" w:type="dxa"/>
+            <w:shd w:val="clear" w:color="auto" w:fill="EAF3F8"/>
+          </w:tcPr>
+          <w:p>
+            <w:pPr>
+              <w:spacing w:before="40" w:after="40"/>
+            </w:pPr>
+            <w:r/>
+            <w:r>
+              <w:rPr>
+                <w:rFonts w:ascii="Segoe UI" w:hAnsi="Segoe UI"/>
+                <w:b w:val="0"/>
+                <w:color w:val="1B2630"/>
+                <w:sz w:val="17"/>
+              </w:rPr>
+              <w:t>2</w:t>
+            </w:r>
+          </w:p>
+        </w:tc>
+      </w:tr>
+      <w:tr>
+        <w:tc>
+          <w:tcPr>
+            <w:tcW w:type="dxa" w:w="1900"/>
             <w:shd w:val="clear" w:color="auto" w:fill="EAF3F8"/>
           </w:tcPr>
           <w:p>
@@ -5781,13 +5852,13 @@
                 <w:color w:val="00407A"/>
                 <w:sz w:val="17"/>
               </w:rPr>
-              <w:t>Tien reisdagen, twaalf sitebezoeken</w:t>
-            </w:r>
-          </w:p>
-        </w:tc>
-        <w:tc>
-          <w:tcPr>
-            <w:tcW w:w="6300" w:type="dxa"/>
+              <w:t>Zestien reisdagen, achttien sitebezoeken</w:t>
+            </w:r>
+          </w:p>
+        </w:tc>
+        <w:tc>
+          <w:tcPr>
+            <w:tcW w:type="dxa" w:w="6300"/>
             <w:shd w:val="clear" w:color="auto" w:fill="EAF3F8"/>
           </w:tcPr>
           <w:p>
@@ -5808,7 +5879,7 @@
         </w:tc>
         <w:tc>
           <w:tcPr>
-            <w:tcW w:w="1660" w:type="dxa"/>
+            <w:tcW w:type="dxa" w:w="1660"/>
             <w:shd w:val="clear" w:color="auto" w:fill="EAF3F8"/>
           </w:tcPr>
           <w:p>
@@ -5823,7 +5894,7 @@
                 <w:color w:val="00407A"/>
                 <w:sz w:val="17"/>
               </w:rPr>
-              <w:t>12,5 dagen</w:t>
+              <w:t>18,5 dagen</w:t>
             </w:r>
           </w:p>
         </w:tc>
@@ -6357,7 +6428,7 @@
                 <w:color w:val="1B2630"/>
                 <w:sz w:val="17"/>
               </w:rPr>
-              <w:t>12,5</w:t>
+              <w:t>18,5</w:t>
             </w:r>
           </w:p>
         </w:tc>
@@ -6569,7 +6640,7 @@
                 <w:color w:val="00407A"/>
                 <w:sz w:val="17"/>
               </w:rPr>
-              <w:t>15,5 van de 48 werkdagen</w:t>
+              <w:t>21,5 van de 48 werkdagen</w:t>
             </w:r>
           </w:p>
         </w:tc>

</xml_diff>

<commit_message>
Opleidingsplanning: drukmeetsystemen zijn geleverd, en een tikfout
De deadlineregel over installatie per centrum vervalt, want de systemen staan er.
En pktober werd oktober.
</commit_message>
<xml_diff>
--- a/PARADISE_opleidingsplanning.docx
+++ b/PARADISE_opleidingsplanning.docx
@@ -426,14 +426,15 @@
           <w:p>
             <w:pPr>
               <w:spacing w:before="40" w:after="40"/>
-            </w:pPr>
-            <w:r/>
-            <w:r>
-              <w:rPr>
-                <w:rFonts w:ascii="Segoe UI" w:hAnsi="Segoe UI"/>
-                <w:b w:val="0"/>
-                <w:color w:val="1B2630"/>
-                <w:sz w:val="17"/>
+              <w:rPr>
+                <w:lang w:val="nl-BE"/>
+              </w:rPr>
+            </w:pPr>
+            <w:r>
+              <w:rPr>
+                <w:color w:val="1B2630"/>
+                <w:sz w:val="17"/>
+                <w:lang w:val="nl-BE"/>
               </w:rPr>
               <w:t>6 blokken van 1 u, drie per dag</w:t>
             </w:r>
@@ -446,14 +447,15 @@
           <w:p>
             <w:pPr>
               <w:spacing w:before="40" w:after="40"/>
-            </w:pPr>
-            <w:r/>
-            <w:r>
-              <w:rPr>
-                <w:rFonts w:ascii="Segoe UI" w:hAnsi="Segoe UI"/>
-                <w:b w:val="0"/>
-                <w:color w:val="1B2630"/>
-                <w:sz w:val="17"/>
+              <w:rPr>
+                <w:lang w:val="nl-BE"/>
+              </w:rPr>
+            </w:pPr>
+            <w:r>
+              <w:rPr>
+                <w:color w:val="1B2630"/>
+                <w:sz w:val="17"/>
+                <w:lang w:val="nl-BE"/>
               </w:rPr>
               <w:t>ter plaatse, per centrum, twee dagen</w:t>
             </w:r>
@@ -816,10 +818,8 @@
             <w:pPr>
               <w:spacing w:before="40" w:after="40"/>
             </w:pPr>
-            <w:r/>
-            <w:r>
-              <w:rPr>
-                <w:rFonts w:ascii="Segoe UI" w:hAnsi="Segoe UI"/>
+            <w:r>
+              <w:rPr>
                 <w:b/>
                 <w:color w:val="1B2630"/>
                 <w:sz w:val="17"/>
@@ -835,14 +835,15 @@
           <w:p>
             <w:pPr>
               <w:spacing w:before="40" w:after="40"/>
-            </w:pPr>
-            <w:r/>
-            <w:r>
-              <w:rPr>
-                <w:rFonts w:ascii="Segoe UI" w:hAnsi="Segoe UI"/>
-                <w:b w:val="0"/>
-                <w:color w:val="1B2630"/>
-                <w:sz w:val="17"/>
+              <w:rPr>
+                <w:lang w:val="nl-BE"/>
+              </w:rPr>
+            </w:pPr>
+            <w:r>
+              <w:rPr>
+                <w:color w:val="1B2630"/>
+                <w:sz w:val="17"/>
+                <w:lang w:val="nl-BE"/>
               </w:rPr>
               <w:t>Datumvoorstel naar de zes centra, met per sessie wie er verwacht wordt</w:t>
             </w:r>
@@ -858,10 +859,8 @@
             <w:pPr>
               <w:spacing w:before="40" w:after="40"/>
             </w:pPr>
-            <w:r/>
-            <w:r>
-              <w:rPr>
-                <w:rFonts w:ascii="Segoe UI" w:hAnsi="Segoe UI"/>
+            <w:r>
+              <w:rPr>
                 <w:b/>
                 <w:color w:val="1B2630"/>
                 <w:sz w:val="17"/>
@@ -877,14 +876,15 @@
           <w:p>
             <w:pPr>
               <w:spacing w:before="40" w:after="40"/>
-            </w:pPr>
-            <w:r/>
-            <w:r>
-              <w:rPr>
-                <w:rFonts w:ascii="Segoe UI" w:hAnsi="Segoe UI"/>
-                <w:b w:val="0"/>
-                <w:color w:val="1B2630"/>
-                <w:sz w:val="17"/>
+              <w:rPr>
+                <w:lang w:val="nl-BE"/>
+              </w:rPr>
+            </w:pPr>
+            <w:r>
+              <w:rPr>
+                <w:color w:val="1B2630"/>
+                <w:sz w:val="17"/>
+                <w:lang w:val="nl-BE"/>
               </w:rPr>
               <w:t>Antwoord van de zes centra; kalender vastgelegd, daarna geen verschuiving meer</w:t>
             </w:r>
@@ -900,10 +900,8 @@
             <w:pPr>
               <w:spacing w:before="40" w:after="40"/>
             </w:pPr>
-            <w:r/>
-            <w:r>
-              <w:rPr>
-                <w:rFonts w:ascii="Segoe UI" w:hAnsi="Segoe UI"/>
+            <w:r>
+              <w:rPr>
                 <w:b/>
                 <w:color w:val="1B2630"/>
                 <w:sz w:val="17"/>
@@ -919,29 +917,22 @@
           <w:p>
             <w:pPr>
               <w:spacing w:before="40" w:after="40"/>
-            </w:pPr>
-            <w:r/>
-            <w:r>
-              <w:rPr>
-                <w:rFonts w:ascii="Segoe UI" w:hAnsi="Segoe UI"/>
-                <w:b w:val="0"/>
-                <w:color w:val="1B2630"/>
-                <w:sz w:val="17"/>
-              </w:rPr>
-              <w:t>Licenties EuroQol en iMTA rond, formulierenroute beslist, drukmeetsystemen besteld</w:t>
+              <w:rPr>
+                <w:lang w:val="nl-BE"/>
+              </w:rPr>
+            </w:pPr>
+            <w:r>
+              <w:rPr>
+                <w:color w:val="1B2630"/>
+                <w:sz w:val="17"/>
+                <w:lang w:val="nl-BE"/>
+              </w:rPr>
+              <w:t>Licenties EuroQol en iMTA rond, formulierenroute beslist</w:t>
             </w:r>
           </w:p>
         </w:tc>
       </w:tr>
     </w:tbl>
-    <w:p>
-      <w:pPr>
-        <w:spacing w:after="40"/>
-        <w:rPr>
-          <w:lang w:val="nl-BE"/>
-        </w:rPr>
-      </w:pPr>
-    </w:p>
     <w:p>
       <w:pPr>
         <w:spacing w:before="160" w:after="60"/>
@@ -1271,11 +1262,8 @@
             <w:pPr>
               <w:spacing w:before="40" w:after="40"/>
             </w:pPr>
-            <w:r/>
-            <w:r>
-              <w:rPr>
-                <w:rFonts w:ascii="Segoe UI" w:hAnsi="Segoe UI"/>
-                <w:b w:val="0"/>
+            <w:r>
+              <w:rPr>
                 <w:color w:val="1B2630"/>
                 <w:sz w:val="17"/>
               </w:rPr>
@@ -1379,30 +1367,6 @@
         </w:rPr>
         <w:t>De week van 2 tot 8 november is herfstvakantie en woensdag 11 november is een feestdag; daar staat niets.</w:t>
       </w:r>
-      <w:r>
-        <w:rPr>
-          <w:color w:val="5A6A78"/>
-          <w:sz w:val="17"/>
-          <w:lang w:val="nl-BE"/>
-        </w:rPr>
-      </w:r>
-      <w:r>
-        <w:rPr>
-          <w:color w:val="5A6A78"/>
-          <w:sz w:val="17"/>
-          <w:lang w:val="nl-BE"/>
-        </w:rPr>
-      </w:r>
-    </w:p>
-    <w:p>
-      <w:pPr>
-        <w:spacing w:before="160" w:after="60"/>
-        <w:rPr>
-          <w:b/>
-          <w:color w:val="00407A"/>
-          <w:lang w:val="nl-BE"/>
-        </w:rPr>
-      </w:pPr>
     </w:p>
     <w:p>
       <w:pPr>
@@ -1507,10 +1471,8 @@
             <w:pPr>
               <w:spacing w:before="40" w:after="40"/>
             </w:pPr>
-            <w:r/>
-            <w:r>
-              <w:rPr>
-                <w:rFonts w:ascii="Segoe UI" w:hAnsi="Segoe UI"/>
+            <w:r>
+              <w:rPr>
                 <w:b/>
                 <w:color w:val="1B2630"/>
                 <w:sz w:val="17"/>
@@ -1527,11 +1489,8 @@
             <w:pPr>
               <w:spacing w:before="40" w:after="40"/>
             </w:pPr>
-            <w:r/>
-            <w:r>
-              <w:rPr>
-                <w:rFonts w:ascii="Segoe UI" w:hAnsi="Segoe UI"/>
-                <w:b w:val="0"/>
+            <w:r>
+              <w:rPr>
                 <w:color w:val="1B2630"/>
                 <w:sz w:val="17"/>
               </w:rPr>
@@ -1546,14 +1505,15 @@
           <w:p>
             <w:pPr>
               <w:spacing w:before="40" w:after="40"/>
-            </w:pPr>
-            <w:r/>
-            <w:r>
-              <w:rPr>
-                <w:rFonts w:ascii="Segoe UI" w:hAnsi="Segoe UI"/>
-                <w:b w:val="0"/>
-                <w:color w:val="1B2630"/>
-                <w:sz w:val="17"/>
+              <w:rPr>
+                <w:lang w:val="nl-BE"/>
+              </w:rPr>
+            </w:pPr>
+            <w:r>
+              <w:rPr>
+                <w:color w:val="1B2630"/>
+                <w:sz w:val="17"/>
+                <w:lang w:val="nl-BE"/>
               </w:rPr>
               <w:t>AZ Sint-Jan Brugge · AZ Groeninge Kortrijk</w:t>
             </w:r>
@@ -1569,10 +1529,8 @@
             <w:pPr>
               <w:spacing w:before="40" w:after="40"/>
             </w:pPr>
-            <w:r/>
-            <w:r>
-              <w:rPr>
-                <w:rFonts w:ascii="Segoe UI" w:hAnsi="Segoe UI"/>
+            <w:r>
+              <w:rPr>
                 <w:b/>
                 <w:color w:val="1B2630"/>
                 <w:sz w:val="17"/>
@@ -1589,11 +1547,8 @@
             <w:pPr>
               <w:spacing w:before="40" w:after="40"/>
             </w:pPr>
-            <w:r/>
-            <w:r>
-              <w:rPr>
-                <w:rFonts w:ascii="Segoe UI" w:hAnsi="Segoe UI"/>
-                <w:b w:val="0"/>
+            <w:r>
+              <w:rPr>
                 <w:color w:val="1B2630"/>
                 <w:sz w:val="17"/>
               </w:rPr>
@@ -1609,11 +1564,8 @@
             <w:pPr>
               <w:spacing w:before="40" w:after="40"/>
             </w:pPr>
-            <w:r/>
-            <w:r>
-              <w:rPr>
-                <w:rFonts w:ascii="Segoe UI" w:hAnsi="Segoe UI"/>
-                <w:b w:val="0"/>
+            <w:r>
+              <w:rPr>
                 <w:color w:val="1B2630"/>
                 <w:sz w:val="17"/>
               </w:rPr>
@@ -1631,10 +1583,8 @@
             <w:pPr>
               <w:spacing w:before="40" w:after="40"/>
             </w:pPr>
-            <w:r/>
-            <w:r>
-              <w:rPr>
-                <w:rFonts w:ascii="Segoe UI" w:hAnsi="Segoe UI"/>
+            <w:r>
+              <w:rPr>
                 <w:b/>
                 <w:color w:val="1B2630"/>
                 <w:sz w:val="17"/>
@@ -1651,11 +1601,8 @@
             <w:pPr>
               <w:spacing w:before="40" w:after="40"/>
             </w:pPr>
-            <w:r/>
-            <w:r>
-              <w:rPr>
-                <w:rFonts w:ascii="Segoe UI" w:hAnsi="Segoe UI"/>
-                <w:b w:val="0"/>
+            <w:r>
+              <w:rPr>
                 <w:color w:val="1B2630"/>
                 <w:sz w:val="17"/>
               </w:rPr>
@@ -1671,11 +1618,8 @@
             <w:pPr>
               <w:spacing w:before="40" w:after="40"/>
             </w:pPr>
-            <w:r/>
-            <w:r>
-              <w:rPr>
-                <w:rFonts w:ascii="Segoe UI" w:hAnsi="Segoe UI"/>
-                <w:b w:val="0"/>
+            <w:r>
+              <w:rPr>
                 <w:color w:val="1B2630"/>
                 <w:sz w:val="17"/>
               </w:rPr>
@@ -1693,10 +1637,8 @@
             <w:pPr>
               <w:spacing w:before="40" w:after="40"/>
             </w:pPr>
-            <w:r/>
-            <w:r>
-              <w:rPr>
-                <w:rFonts w:ascii="Segoe UI" w:hAnsi="Segoe UI"/>
+            <w:r>
+              <w:rPr>
                 <w:b/>
                 <w:color w:val="1B2630"/>
                 <w:sz w:val="17"/>
@@ -1713,11 +1655,8 @@
             <w:pPr>
               <w:spacing w:before="40" w:after="40"/>
             </w:pPr>
-            <w:r/>
-            <w:r>
-              <w:rPr>
-                <w:rFonts w:ascii="Segoe UI" w:hAnsi="Segoe UI"/>
-                <w:b w:val="0"/>
+            <w:r>
+              <w:rPr>
                 <w:color w:val="1B2630"/>
                 <w:sz w:val="17"/>
               </w:rPr>
@@ -1733,11 +1672,8 @@
             <w:pPr>
               <w:spacing w:before="40" w:after="40"/>
             </w:pPr>
-            <w:r/>
-            <w:r>
-              <w:rPr>
-                <w:rFonts w:ascii="Segoe UI" w:hAnsi="Segoe UI"/>
-                <w:b w:val="0"/>
+            <w:r>
+              <w:rPr>
                 <w:color w:val="1B2630"/>
                 <w:sz w:val="17"/>
               </w:rPr>
@@ -1755,14 +1691,13 @@
             <w:pPr>
               <w:spacing w:before="40" w:after="40"/>
             </w:pPr>
-            <w:r/>
-            <w:r>
-              <w:rPr>
-                <w:rFonts w:ascii="Segoe UI" w:hAnsi="Segoe UI"/>
+            <w:r>
+              <w:rPr>
                 <w:b/>
                 <w:color w:val="1B2630"/>
                 <w:sz w:val="17"/>
               </w:rPr>
+              <w:lastRenderedPageBreak/>
               <w:t>december</w:t>
             </w:r>
           </w:p>
@@ -1774,14 +1709,15 @@
           <w:p>
             <w:pPr>
               <w:spacing w:before="40" w:after="40"/>
-            </w:pPr>
-            <w:r/>
-            <w:r>
-              <w:rPr>
-                <w:rFonts w:ascii="Segoe UI" w:hAnsi="Segoe UI"/>
-                <w:b w:val="0"/>
-                <w:color w:val="1B2630"/>
-                <w:sz w:val="17"/>
+              <w:rPr>
+                <w:lang w:val="nl-BE"/>
+              </w:rPr>
+            </w:pPr>
+            <w:r>
+              <w:rPr>
+                <w:color w:val="1B2630"/>
+                <w:sz w:val="17"/>
+                <w:lang w:val="nl-BE"/>
               </w:rPr>
               <w:t>Gedragsdag 1: blok 1 tot 3, drie uur per centrum — op een andere dag dan de technologiedag</w:t>
             </w:r>
@@ -1795,11 +1731,8 @@
             <w:pPr>
               <w:spacing w:before="40" w:after="40"/>
             </w:pPr>
-            <w:r/>
-            <w:r>
-              <w:rPr>
-                <w:rFonts w:ascii="Segoe UI" w:hAnsi="Segoe UI"/>
-                <w:b w:val="0"/>
+            <w:r>
+              <w:rPr>
                 <w:color w:val="1B2630"/>
                 <w:sz w:val="17"/>
               </w:rPr>
@@ -1817,10 +1750,8 @@
             <w:pPr>
               <w:spacing w:before="40" w:after="40"/>
             </w:pPr>
-            <w:r/>
-            <w:r>
-              <w:rPr>
-                <w:rFonts w:ascii="Segoe UI" w:hAnsi="Segoe UI"/>
+            <w:r>
+              <w:rPr>
                 <w:b/>
                 <w:color w:val="1B2630"/>
                 <w:sz w:val="17"/>
@@ -1836,16 +1767,25 @@
           <w:p>
             <w:pPr>
               <w:spacing w:before="40" w:after="40"/>
-            </w:pPr>
-            <w:r/>
-            <w:r>
-              <w:rPr>
-                <w:rFonts w:ascii="Segoe UI" w:hAnsi="Segoe UI"/>
-                <w:b w:val="0"/>
-                <w:color w:val="1B2630"/>
-                <w:sz w:val="17"/>
-              </w:rPr>
-              <w:t>Vragenlijstenset en feedbackblad naar de zes centra</w:t>
+              <w:rPr>
+                <w:lang w:val="nl-BE"/>
+              </w:rPr>
+            </w:pPr>
+            <w:r>
+              <w:rPr>
+                <w:color w:val="1B2630"/>
+                <w:sz w:val="17"/>
+                <w:lang w:val="nl-BE"/>
+              </w:rPr>
+              <w:t>F</w:t>
+            </w:r>
+            <w:r>
+              <w:rPr>
+                <w:color w:val="1B2630"/>
+                <w:sz w:val="17"/>
+                <w:lang w:val="nl-BE"/>
+              </w:rPr>
+              <w:t>eedbackblad naar de zes centra</w:t>
             </w:r>
           </w:p>
         </w:tc>
@@ -1857,11 +1797,8 @@
             <w:pPr>
               <w:spacing w:before="40" w:after="40"/>
             </w:pPr>
-            <w:r/>
-            <w:r>
-              <w:rPr>
-                <w:rFonts w:ascii="Segoe UI" w:hAnsi="Segoe UI"/>
-                <w:b w:val="0"/>
+            <w:r>
+              <w:rPr>
                 <w:color w:val="1B2630"/>
                 <w:sz w:val="17"/>
               </w:rPr>
@@ -1974,10 +1911,8 @@
             <w:pPr>
               <w:spacing w:before="40" w:after="40"/>
             </w:pPr>
-            <w:r/>
-            <w:r>
-              <w:rPr>
-                <w:rFonts w:ascii="Segoe UI" w:hAnsi="Segoe UI"/>
+            <w:r>
+              <w:rPr>
                 <w:b/>
                 <w:color w:val="1B2630"/>
                 <w:sz w:val="17"/>
@@ -1993,14 +1928,15 @@
           <w:p>
             <w:pPr>
               <w:spacing w:before="40" w:after="40"/>
-            </w:pPr>
-            <w:r/>
-            <w:r>
-              <w:rPr>
-                <w:rFonts w:ascii="Segoe UI" w:hAnsi="Segoe UI"/>
-                <w:b w:val="0"/>
-                <w:color w:val="1B2630"/>
-                <w:sz w:val="17"/>
+              <w:rPr>
+                <w:lang w:val="nl-BE"/>
+              </w:rPr>
+            </w:pPr>
+            <w:r>
+              <w:rPr>
+                <w:color w:val="1B2630"/>
+                <w:sz w:val="17"/>
+                <w:lang w:val="nl-BE"/>
               </w:rPr>
               <w:t>Elk centrum vult de vragenlijstenset in als proefpatiënt</w:t>
             </w:r>
@@ -2014,11 +1950,8 @@
             <w:pPr>
               <w:spacing w:before="40" w:after="40"/>
             </w:pPr>
-            <w:r/>
-            <w:r>
-              <w:rPr>
-                <w:rFonts w:ascii="Segoe UI" w:hAnsi="Segoe UI"/>
-                <w:b w:val="0"/>
+            <w:r>
+              <w:rPr>
                 <w:color w:val="1B2630"/>
                 <w:sz w:val="17"/>
               </w:rPr>
@@ -2036,10 +1969,8 @@
             <w:pPr>
               <w:spacing w:before="40" w:after="40"/>
             </w:pPr>
-            <w:r/>
-            <w:r>
-              <w:rPr>
-                <w:rFonts w:ascii="Segoe UI" w:hAnsi="Segoe UI"/>
+            <w:r>
+              <w:rPr>
                 <w:b/>
                 <w:color w:val="1B2630"/>
                 <w:sz w:val="17"/>
@@ -2055,14 +1986,15 @@
           <w:p>
             <w:pPr>
               <w:spacing w:before="40" w:after="40"/>
-            </w:pPr>
-            <w:r/>
-            <w:r>
-              <w:rPr>
-                <w:rFonts w:ascii="Segoe UI" w:hAnsi="Segoe UI"/>
-                <w:b w:val="0"/>
-                <w:color w:val="1B2630"/>
-                <w:sz w:val="17"/>
+              <w:rPr>
+                <w:lang w:val="nl-BE"/>
+              </w:rPr>
+            </w:pPr>
+            <w:r>
+              <w:rPr>
+                <w:color w:val="1B2630"/>
+                <w:sz w:val="17"/>
+                <w:lang w:val="nl-BE"/>
               </w:rPr>
               <w:t>Feedbackbladen terug bij het studieteam</w:t>
             </w:r>
@@ -2076,11 +2008,8 @@
             <w:pPr>
               <w:spacing w:before="40" w:after="40"/>
             </w:pPr>
-            <w:r/>
-            <w:r>
-              <w:rPr>
-                <w:rFonts w:ascii="Segoe UI" w:hAnsi="Segoe UI"/>
-                <w:b w:val="0"/>
+            <w:r>
+              <w:rPr>
                 <w:color w:val="1B2630"/>
                 <w:sz w:val="17"/>
               </w:rPr>
@@ -2098,10 +2027,8 @@
             <w:pPr>
               <w:spacing w:before="40" w:after="40"/>
             </w:pPr>
-            <w:r/>
-            <w:r>
-              <w:rPr>
-                <w:rFonts w:ascii="Segoe UI" w:hAnsi="Segoe UI"/>
+            <w:r>
+              <w:rPr>
                 <w:b/>
                 <w:color w:val="1B2630"/>
                 <w:sz w:val="17"/>
@@ -2117,14 +2044,15 @@
           <w:p>
             <w:pPr>
               <w:spacing w:before="40" w:after="40"/>
-            </w:pPr>
-            <w:r/>
-            <w:r>
-              <w:rPr>
-                <w:rFonts w:ascii="Segoe UI" w:hAnsi="Segoe UI"/>
-                <w:b w:val="0"/>
-                <w:color w:val="1B2630"/>
-                <w:sz w:val="17"/>
+              <w:rPr>
+                <w:lang w:val="nl-BE"/>
+              </w:rPr>
+            </w:pPr>
+            <w:r>
+              <w:rPr>
+                <w:color w:val="1B2630"/>
+                <w:sz w:val="17"/>
+                <w:lang w:val="nl-BE"/>
               </w:rPr>
               <w:t>Datacollectie en vragenlijsten, op basis van de gemelde struikelpunten</w:t>
             </w:r>
@@ -2138,11 +2066,8 @@
             <w:pPr>
               <w:spacing w:before="40" w:after="40"/>
             </w:pPr>
-            <w:r/>
-            <w:r>
-              <w:rPr>
-                <w:rFonts w:ascii="Segoe UI" w:hAnsi="Segoe UI"/>
-                <w:b w:val="0"/>
+            <w:r>
+              <w:rPr>
                 <w:color w:val="1B2630"/>
                 <w:sz w:val="17"/>
               </w:rPr>
@@ -2160,10 +2085,8 @@
             <w:pPr>
               <w:spacing w:before="40" w:after="40"/>
             </w:pPr>
-            <w:r/>
-            <w:r>
-              <w:rPr>
-                <w:rFonts w:ascii="Segoe UI" w:hAnsi="Segoe UI"/>
+            <w:r>
+              <w:rPr>
                 <w:b/>
                 <w:color w:val="1B2630"/>
                 <w:sz w:val="17"/>
@@ -2180,11 +2103,8 @@
             <w:pPr>
               <w:spacing w:before="40" w:after="40"/>
             </w:pPr>
-            <w:r/>
-            <w:r>
-              <w:rPr>
-                <w:rFonts w:ascii="Segoe UI" w:hAnsi="Segoe UI"/>
-                <w:b w:val="0"/>
+            <w:r>
+              <w:rPr>
                 <w:color w:val="1B2630"/>
                 <w:sz w:val="17"/>
               </w:rPr>
@@ -2200,11 +2120,8 @@
             <w:pPr>
               <w:spacing w:before="40" w:after="40"/>
             </w:pPr>
-            <w:r/>
-            <w:r>
-              <w:rPr>
-                <w:rFonts w:ascii="Segoe UI" w:hAnsi="Segoe UI"/>
-                <w:b w:val="0"/>
+            <w:r>
+              <w:rPr>
                 <w:color w:val="1B2630"/>
                 <w:sz w:val="17"/>
               </w:rPr>
@@ -2222,10 +2139,8 @@
             <w:pPr>
               <w:spacing w:before="40" w:after="40"/>
             </w:pPr>
-            <w:r/>
-            <w:r>
-              <w:rPr>
-                <w:rFonts w:ascii="Segoe UI" w:hAnsi="Segoe UI"/>
+            <w:r>
+              <w:rPr>
                 <w:b/>
                 <w:color w:val="1B2630"/>
                 <w:sz w:val="17"/>
@@ -2242,11 +2157,8 @@
             <w:pPr>
               <w:spacing w:before="40" w:after="40"/>
             </w:pPr>
-            <w:r/>
-            <w:r>
-              <w:rPr>
-                <w:rFonts w:ascii="Segoe UI" w:hAnsi="Segoe UI"/>
-                <w:b w:val="0"/>
+            <w:r>
+              <w:rPr>
                 <w:color w:val="1B2630"/>
                 <w:sz w:val="17"/>
               </w:rPr>
@@ -2262,11 +2174,8 @@
             <w:pPr>
               <w:spacing w:before="40" w:after="40"/>
             </w:pPr>
-            <w:r/>
-            <w:r>
-              <w:rPr>
-                <w:rFonts w:ascii="Segoe UI" w:hAnsi="Segoe UI"/>
-                <w:b w:val="0"/>
+            <w:r>
+              <w:rPr>
                 <w:color w:val="1B2630"/>
                 <w:sz w:val="17"/>
               </w:rPr>
@@ -2284,10 +2193,8 @@
             <w:pPr>
               <w:spacing w:before="40" w:after="40"/>
             </w:pPr>
-            <w:r/>
-            <w:r>
-              <w:rPr>
-                <w:rFonts w:ascii="Segoe UI" w:hAnsi="Segoe UI"/>
+            <w:r>
+              <w:rPr>
                 <w:b/>
                 <w:color w:val="1B2630"/>
                 <w:sz w:val="17"/>
@@ -2304,11 +2211,8 @@
             <w:pPr>
               <w:spacing w:before="40" w:after="40"/>
             </w:pPr>
-            <w:r/>
-            <w:r>
-              <w:rPr>
-                <w:rFonts w:ascii="Segoe UI" w:hAnsi="Segoe UI"/>
-                <w:b w:val="0"/>
+            <w:r>
+              <w:rPr>
                 <w:color w:val="1B2630"/>
                 <w:sz w:val="17"/>
               </w:rPr>
@@ -2324,11 +2228,8 @@
             <w:pPr>
               <w:spacing w:before="40" w:after="40"/>
             </w:pPr>
-            <w:r/>
-            <w:r>
-              <w:rPr>
-                <w:rFonts w:ascii="Segoe UI" w:hAnsi="Segoe UI"/>
-                <w:b w:val="0"/>
+            <w:r>
+              <w:rPr>
                 <w:color w:val="1B2630"/>
                 <w:sz w:val="17"/>
               </w:rPr>
@@ -2346,10 +2247,8 @@
             <w:pPr>
               <w:spacing w:before="40" w:after="40"/>
             </w:pPr>
-            <w:r/>
-            <w:r>
-              <w:rPr>
-                <w:rFonts w:ascii="Segoe UI" w:hAnsi="Segoe UI"/>
+            <w:r>
+              <w:rPr>
                 <w:b/>
                 <w:color w:val="1B2630"/>
                 <w:sz w:val="17"/>
@@ -2366,11 +2265,8 @@
             <w:pPr>
               <w:spacing w:before="40" w:after="40"/>
             </w:pPr>
-            <w:r/>
-            <w:r>
-              <w:rPr>
-                <w:rFonts w:ascii="Segoe UI" w:hAnsi="Segoe UI"/>
-                <w:b w:val="0"/>
+            <w:r>
+              <w:rPr>
                 <w:color w:val="1B2630"/>
                 <w:sz w:val="17"/>
               </w:rPr>
@@ -2386,11 +2282,8 @@
             <w:pPr>
               <w:spacing w:before="40" w:after="40"/>
             </w:pPr>
-            <w:r/>
-            <w:r>
-              <w:rPr>
-                <w:rFonts w:ascii="Segoe UI" w:hAnsi="Segoe UI"/>
-                <w:b w:val="0"/>
+            <w:r>
+              <w:rPr>
                 <w:color w:val="1B2630"/>
                 <w:sz w:val="17"/>
               </w:rPr>
@@ -2408,10 +2301,8 @@
             <w:pPr>
               <w:spacing w:before="40" w:after="40"/>
             </w:pPr>
-            <w:r/>
-            <w:r>
-              <w:rPr>
-                <w:rFonts w:ascii="Segoe UI" w:hAnsi="Segoe UI"/>
+            <w:r>
+              <w:rPr>
                 <w:b/>
                 <w:color w:val="1B2630"/>
                 <w:sz w:val="17"/>
@@ -2428,11 +2319,8 @@
             <w:pPr>
               <w:spacing w:before="40" w:after="40"/>
             </w:pPr>
-            <w:r/>
-            <w:r>
-              <w:rPr>
-                <w:rFonts w:ascii="Segoe UI" w:hAnsi="Segoe UI"/>
-                <w:b w:val="0"/>
+            <w:r>
+              <w:rPr>
                 <w:color w:val="1B2630"/>
                 <w:sz w:val="17"/>
               </w:rPr>
@@ -2448,11 +2336,8 @@
             <w:pPr>
               <w:spacing w:before="40" w:after="40"/>
             </w:pPr>
-            <w:r/>
-            <w:r>
-              <w:rPr>
-                <w:rFonts w:ascii="Segoe UI" w:hAnsi="Segoe UI"/>
-                <w:b w:val="0"/>
+            <w:r>
+              <w:rPr>
                 <w:color w:val="1B2630"/>
                 <w:sz w:val="17"/>
               </w:rPr>
@@ -2470,10 +2355,8 @@
             <w:pPr>
               <w:spacing w:before="40" w:after="40"/>
             </w:pPr>
-            <w:r/>
-            <w:r>
-              <w:rPr>
-                <w:rFonts w:ascii="Segoe UI" w:hAnsi="Segoe UI"/>
+            <w:r>
+              <w:rPr>
                 <w:b/>
                 <w:color w:val="1B2630"/>
                 <w:sz w:val="17"/>
@@ -2490,11 +2373,8 @@
             <w:pPr>
               <w:spacing w:before="40" w:after="40"/>
             </w:pPr>
-            <w:r/>
-            <w:r>
-              <w:rPr>
-                <w:rFonts w:ascii="Segoe UI" w:hAnsi="Segoe UI"/>
-                <w:b w:val="0"/>
+            <w:r>
+              <w:rPr>
                 <w:color w:val="1B2630"/>
                 <w:sz w:val="17"/>
               </w:rPr>
@@ -2510,11 +2390,8 @@
             <w:pPr>
               <w:spacing w:before="40" w:after="40"/>
             </w:pPr>
-            <w:r/>
-            <w:r>
-              <w:rPr>
-                <w:rFonts w:ascii="Segoe UI" w:hAnsi="Segoe UI"/>
-                <w:b w:val="0"/>
+            <w:r>
+              <w:rPr>
                 <w:color w:val="1B2630"/>
                 <w:sz w:val="17"/>
               </w:rPr>
@@ -2811,11 +2688,6 @@
     </w:tbl>
     <w:p>
       <w:pPr>
-        <w:spacing w:after="40"/>
-      </w:pPr>
-    </w:p>
-    <w:p>
-      <w:pPr>
         <w:spacing w:before="160" w:after="60"/>
       </w:pPr>
       <w:r>
@@ -2893,10 +2765,8 @@
             <w:pPr>
               <w:spacing w:before="40" w:after="40"/>
             </w:pPr>
-            <w:r/>
-            <w:r>
-              <w:rPr>
-                <w:rFonts w:ascii="Segoe UI" w:hAnsi="Segoe UI"/>
+            <w:r>
+              <w:rPr>
                 <w:b/>
                 <w:color w:val="1B2630"/>
                 <w:sz w:val="17"/>
@@ -2912,39 +2782,46 @@
           <w:p>
             <w:pPr>
               <w:spacing w:before="40" w:after="40"/>
-            </w:pPr>
-            <w:r/>
-            <w:r>
-              <w:rPr>
-                <w:rFonts w:ascii="Segoe UI" w:hAnsi="Segoe UI"/>
-                <w:b w:val="0"/>
-                <w:color w:val="1B2630"/>
-                <w:sz w:val="17"/>
-              </w:rPr>
-              <w:t>Gedragsdag 2: blok 4 tot 6, drie uur per centrum — terugkoppeling op meetgegevens, stap 3 en 4, en de fideliteitsterugkoppeling. Zes dagen, vóór de eerste maand 3-visites</w:t>
+              <w:rPr>
+                <w:lang w:val="nl-BE"/>
+              </w:rPr>
+            </w:pPr>
+            <w:r>
+              <w:rPr>
+                <w:color w:val="1B2630"/>
+                <w:sz w:val="17"/>
+                <w:lang w:val="nl-BE"/>
+              </w:rPr>
+              <w:t>Gedragsdag 2: blok 4 tot 6, drie uur per centrum</w:t>
+            </w:r>
+            <w:r>
+              <w:rPr>
+                <w:color w:val="1B2630"/>
+                <w:sz w:val="17"/>
+                <w:lang w:val="nl-BE"/>
+              </w:rPr>
+              <w:t xml:space="preserve">, stap 3 en 4, en de fideliteitsterugkoppeling. </w:t>
+            </w:r>
+            <w:r>
+              <w:rPr>
+                <w:color w:val="1B2630"/>
+                <w:sz w:val="17"/>
+                <w:lang w:val="nl-BE"/>
+              </w:rPr>
+              <w:t xml:space="preserve">Enkele </w:t>
+            </w:r>
+            <w:r>
+              <w:rPr>
+                <w:color w:val="1B2630"/>
+                <w:sz w:val="17"/>
+                <w:lang w:val="nl-BE"/>
+              </w:rPr>
+              <w:t>dagen, vóór de eerste maand 3-visites</w:t>
             </w:r>
           </w:p>
         </w:tc>
       </w:tr>
     </w:tbl>
-    <w:p>
-      <w:pPr>
-        <w:spacing w:after="40"/>
-        <w:rPr>
-          <w:lang w:val="nl-BE"/>
-        </w:rPr>
-      </w:pPr>
-    </w:p>
-    <w:p>
-      <w:pPr>
-        <w:spacing w:before="300" w:after="100"/>
-        <w:rPr>
-          <w:color w:val="5A6A78"/>
-          <w:sz w:val="17"/>
-          <w:lang w:val="nl-BE"/>
-        </w:rPr>
-      </w:pPr>
-    </w:p>
     <w:p>
       <w:pPr>
         <w:spacing w:before="300" w:after="100"/>
@@ -2959,7 +2836,6 @@
           <w:sz w:val="22"/>
           <w:lang w:val="nl-BE"/>
         </w:rPr>
-        <w:lastRenderedPageBreak/>
         <w:t xml:space="preserve">3  </w:t>
       </w:r>
       <w:r>
@@ -3381,6 +3257,7 @@
                 <w:color w:val="1B2630"/>
                 <w:sz w:val="17"/>
               </w:rPr>
+              <w:lastRenderedPageBreak/>
               <w:t>4</w:t>
             </w:r>
           </w:p>
@@ -3722,13 +3599,33 @@
           <w:p>
             <w:pPr>
               <w:spacing w:before="40" w:after="40"/>
-            </w:pPr>
-            <w:r>
-              <w:rPr>
-                <w:color w:val="1B2630"/>
-                <w:sz w:val="17"/>
-              </w:rPr>
-              <w:t>Formulierenroute beslist (openstaand punt 20)</w:t>
+              <w:rPr>
+                <w:lang w:val="nl-BE"/>
+              </w:rPr>
+            </w:pPr>
+            <w:r>
+              <w:rPr>
+                <w:color w:val="1B2630"/>
+                <w:sz w:val="17"/>
+                <w:lang w:val="nl-BE"/>
+              </w:rPr>
+              <w:t xml:space="preserve">Formulierenroute </w:t>
+            </w:r>
+            <w:r>
+              <w:rPr>
+                <w:color w:val="1B2630"/>
+                <w:sz w:val="17"/>
+                <w:lang w:val="nl-BE"/>
+              </w:rPr>
+              <w:t>klaar en getest</w:t>
+            </w:r>
+            <w:r>
+              <w:rPr>
+                <w:color w:val="1B2630"/>
+                <w:sz w:val="17"/>
+                <w:lang w:val="nl-BE"/>
+              </w:rPr>
+              <w:t xml:space="preserve"> </w:t>
             </w:r>
           </w:p>
         </w:tc>
@@ -3749,15 +3646,7 @@
                 <w:sz w:val="17"/>
                 <w:lang w:val="nl-BE"/>
               </w:rPr>
-              <w:t>de</w:t>
-            </w:r>
-            <w:r>
-              <w:rPr>
-                <w:color w:val="1B2630"/>
-                <w:sz w:val="17"/>
-                <w:lang w:val="nl-BE"/>
-              </w:rPr>
-              <w:t xml:space="preserve"> sessie van 12 januari heeft geen inhoud</w:t>
+              <w:t>de sessie van 12 januari heeft geen inhoud</w:t>
             </w:r>
           </w:p>
         </w:tc>
@@ -3777,7 +3666,7 @@
                 <w:color w:val="1B2630"/>
                 <w:sz w:val="17"/>
               </w:rPr>
-              <w:t>november</w:t>
+              <w:t>oktober</w:t>
             </w:r>
           </w:p>
         </w:tc>
@@ -3809,14 +3698,15 @@
           <w:p>
             <w:pPr>
               <w:spacing w:before="40" w:after="40"/>
-            </w:pPr>
-            <w:r/>
-            <w:r>
-              <w:rPr>
-                <w:rFonts w:ascii="Segoe UI" w:hAnsi="Segoe UI"/>
-                <w:b w:val="0"/>
-                <w:color w:val="1B2630"/>
-                <w:sz w:val="17"/>
+              <w:rPr>
+                <w:lang w:val="nl-BE"/>
+              </w:rPr>
+            </w:pPr>
+            <w:r>
+              <w:rPr>
+                <w:color w:val="1B2630"/>
+                <w:sz w:val="17"/>
+                <w:lang w:val="nl-BE"/>
               </w:rPr>
               <w:t>één ziekteperiode van twee weken legt twaalf van de veertien sessiedagen stil</w:t>
             </w:r>
@@ -3838,7 +3728,7 @@
                 <w:color w:val="1B2630"/>
                 <w:sz w:val="17"/>
               </w:rPr>
-              <w:t>vóór de eigen dag</w:t>
+              <w:t>vr 18 dec</w:t>
             </w:r>
           </w:p>
         </w:tc>
@@ -3849,13 +3739,17 @@
           <w:p>
             <w:pPr>
               <w:spacing w:before="40" w:after="40"/>
-            </w:pPr>
-            <w:r>
-              <w:rPr>
-                <w:color w:val="1B2630"/>
-                <w:sz w:val="17"/>
-              </w:rPr>
-              <w:t>Drukmeetsysteem geïnstalleerd, kalibratietestrun gedaan</w:t>
+              <w:rPr>
+                <w:lang w:val="nl-BE"/>
+              </w:rPr>
+            </w:pPr>
+            <w:r>
+              <w:rPr>
+                <w:color w:val="1B2630"/>
+                <w:sz w:val="17"/>
+                <w:lang w:val="nl-BE"/>
+              </w:rPr>
+              <w:t>Assessment booklet drukklaar na de consensusvergadering</w:t>
             </w:r>
           </w:p>
         </w:tc>
@@ -3876,7 +3770,7 @@
                 <w:sz w:val="17"/>
                 <w:lang w:val="nl-BE"/>
               </w:rPr>
-              <w:t>dat centrum schuift naar januari</w:t>
+              <w:t>de zelftest en de sessie van 12 januari</w:t>
             </w:r>
           </w:p>
         </w:tc>
@@ -3896,7 +3790,7 @@
                 <w:color w:val="1B2630"/>
                 <w:sz w:val="17"/>
               </w:rPr>
-              <w:t>vr 18 dec</w:t>
+              <w:t>december</w:t>
             </w:r>
           </w:p>
         </w:tc>
@@ -3917,7 +3811,7 @@
                 <w:sz w:val="17"/>
                 <w:lang w:val="nl-BE"/>
               </w:rPr>
-              <w:t>Assessment booklet drukklaar na de consensusvergadering</w:t>
+              <w:t>Beslissing over de opnames, clausule in eCRF 02</w:t>
             </w:r>
           </w:p>
         </w:tc>
@@ -3937,75 +3831,6 @@
                 <w:color w:val="1B2630"/>
                 <w:sz w:val="17"/>
                 <w:lang w:val="nl-BE"/>
-              </w:rPr>
-              <w:t>de</w:t>
-            </w:r>
-            <w:r>
-              <w:rPr>
-                <w:color w:val="1B2630"/>
-                <w:sz w:val="17"/>
-                <w:lang w:val="nl-BE"/>
-              </w:rPr>
-              <w:t xml:space="preserve"> zelftest en de sessie van 12 januari</w:t>
-            </w:r>
-          </w:p>
-        </w:tc>
-      </w:tr>
-      <w:tr>
-        <w:tc>
-          <w:tcPr>
-            <w:tcW w:w="1600" w:type="dxa"/>
-          </w:tcPr>
-          <w:p>
-            <w:pPr>
-              <w:spacing w:before="40" w:after="40"/>
-            </w:pPr>
-            <w:r>
-              <w:rPr>
-                <w:b/>
-                <w:color w:val="1B2630"/>
-                <w:sz w:val="17"/>
-              </w:rPr>
-              <w:t>december</w:t>
-            </w:r>
-          </w:p>
-        </w:tc>
-        <w:tc>
-          <w:tcPr>
-            <w:tcW w:w="4200" w:type="dxa"/>
-          </w:tcPr>
-          <w:p>
-            <w:pPr>
-              <w:spacing w:before="40" w:after="40"/>
-              <w:rPr>
-                <w:lang w:val="nl-BE"/>
-              </w:rPr>
-            </w:pPr>
-            <w:r>
-              <w:rPr>
-                <w:color w:val="1B2630"/>
-                <w:sz w:val="17"/>
-                <w:lang w:val="nl-BE"/>
-              </w:rPr>
-              <w:t>Beslissing over de opnames, clausule in eCRF 02</w:t>
-            </w:r>
-          </w:p>
-        </w:tc>
-        <w:tc>
-          <w:tcPr>
-            <w:tcW w:w="4060" w:type="dxa"/>
-          </w:tcPr>
-          <w:p>
-            <w:pPr>
-              <w:spacing w:before="40" w:after="40"/>
-            </w:pPr>
-            <w:r/>
-            <w:r>
-              <w:rPr>
-                <w:rFonts w:ascii="Segoe UI" w:hAnsi="Segoe UI"/>
-                <w:b w:val="0"/>
-                <w:color w:val="1B2630"/>
-                <w:sz w:val="17"/>
               </w:rPr>
               <w:t>gedragsdag 2 van april en de fideliteitsmeting</w:t>
             </w:r>
@@ -4208,14 +4033,15 @@
           <w:p>
             <w:pPr>
               <w:spacing w:before="40" w:after="40"/>
-            </w:pPr>
-            <w:r/>
-            <w:r>
-              <w:rPr>
-                <w:rFonts w:ascii="Segoe UI" w:hAnsi="Segoe UI"/>
-                <w:b w:val="0"/>
-                <w:color w:val="1B2630"/>
-                <w:sz w:val="17"/>
+              <w:rPr>
+                <w:lang w:val="nl-BE"/>
+              </w:rPr>
+            </w:pPr>
+            <w:r>
+              <w:rPr>
+                <w:color w:val="1B2630"/>
+                <w:sz w:val="17"/>
+                <w:lang w:val="nl-BE"/>
               </w:rPr>
               <w:t>3 u theorie, 1,5 u toestemming en randomisatie</w:t>
             </w:r>
@@ -4265,14 +4091,15 @@
           <w:p>
             <w:pPr>
               <w:spacing w:before="40" w:after="40"/>
-            </w:pPr>
-            <w:r/>
-            <w:r>
-              <w:rPr>
-                <w:rFonts w:ascii="Segoe UI" w:hAnsi="Segoe UI"/>
-                <w:b w:val="0"/>
-                <w:color w:val="1B2630"/>
-                <w:sz w:val="17"/>
+              <w:rPr>
+                <w:lang w:val="nl-BE"/>
+              </w:rPr>
+            </w:pPr>
+            <w:r>
+              <w:rPr>
+                <w:color w:val="1B2630"/>
+                <w:sz w:val="17"/>
+                <w:lang w:val="nl-BE"/>
               </w:rPr>
               <w:t>3 u theorie, 2 u technologie, 4,5 u droogloop</w:t>
             </w:r>
@@ -4326,14 +4153,15 @@
           <w:p>
             <w:pPr>
               <w:spacing w:before="40" w:after="40"/>
-            </w:pPr>
-            <w:r/>
-            <w:r>
-              <w:rPr>
-                <w:rFonts w:ascii="Segoe UI" w:hAnsi="Segoe UI"/>
-                <w:b w:val="0"/>
-                <w:color w:val="1B2630"/>
-                <w:sz w:val="17"/>
+              <w:rPr>
+                <w:lang w:val="nl-BE"/>
+              </w:rPr>
+            </w:pPr>
+            <w:r>
+              <w:rPr>
+                <w:color w:val="1B2630"/>
+                <w:sz w:val="17"/>
+                <w:lang w:val="nl-BE"/>
               </w:rPr>
               <w:t>3 u theorie, 1,5 u toestemming, 1,5 u educatie, 2 u technologie, 3 u gedrag, 3 u vragenlijsten, 4,5 u droogloop — samen 18,5 u vóór de start, plus 3 u in april</w:t>
             </w:r>
@@ -4438,11 +4266,8 @@
             <w:pPr>
               <w:spacing w:before="40" w:after="40"/>
             </w:pPr>
-            <w:r/>
-            <w:r>
-              <w:rPr>
-                <w:rFonts w:ascii="Segoe UI" w:hAnsi="Segoe UI"/>
-                <w:b w:val="0"/>
+            <w:r>
+              <w:rPr>
                 <w:color w:val="1B2630"/>
                 <w:sz w:val="17"/>
               </w:rPr>
@@ -4457,14 +4282,15 @@
           <w:p>
             <w:pPr>
               <w:spacing w:before="40" w:after="40"/>
-            </w:pPr>
-            <w:r/>
-            <w:r>
-              <w:rPr>
-                <w:rFonts w:ascii="Segoe UI" w:hAnsi="Segoe UI"/>
-                <w:b w:val="0"/>
-                <w:color w:val="1B2630"/>
-                <w:sz w:val="17"/>
+              <w:rPr>
+                <w:lang w:val="nl-BE"/>
+              </w:rPr>
+            </w:pPr>
+            <w:r>
+              <w:rPr>
+                <w:color w:val="1B2630"/>
+                <w:sz w:val="17"/>
+                <w:lang w:val="nl-BE"/>
               </w:rPr>
               <w:t>Janou achttien sitebezoeken, Dobbels twaalf reisdagen — zes per gedragsdag</w:t>
             </w:r>
@@ -4486,7 +4312,6 @@
           <w:sz w:val="22"/>
           <w:lang w:val="nl-BE"/>
         </w:rPr>
-        <w:lastRenderedPageBreak/>
         <w:t>6</w:t>
       </w:r>
       <w:r>
@@ -4632,6 +4457,13 @@
               </w:rPr>
               <w:t>Deschamps</w:t>
             </w:r>
+            <w:r>
+              <w:rPr>
+                <w:color w:val="1B2630"/>
+                <w:sz w:val="17"/>
+              </w:rPr>
+              <w:t xml:space="preserve"> en Janou</w:t>
+            </w:r>
           </w:p>
         </w:tc>
         <w:tc>
@@ -4684,7 +4516,14 @@
                 <w:color w:val="1B2630"/>
                 <w:sz w:val="17"/>
               </w:rPr>
-              <w:t>Deschamps, met de site-PI's</w:t>
+              <w:t>Deschamps</w:t>
+            </w:r>
+            <w:r>
+              <w:rPr>
+                <w:color w:val="1B2630"/>
+                <w:sz w:val="17"/>
+              </w:rPr>
+              <w:t xml:space="preserve"> en janou</w:t>
             </w:r>
           </w:p>
         </w:tc>
@@ -4769,10 +4608,8 @@
             <w:pPr>
               <w:spacing w:before="40" w:after="40"/>
             </w:pPr>
-            <w:r/>
-            <w:r>
-              <w:rPr>
-                <w:rFonts w:ascii="Segoe UI" w:hAnsi="Segoe UI"/>
+            <w:r>
+              <w:rPr>
                 <w:b/>
                 <w:color w:val="1B2630"/>
                 <w:sz w:val="17"/>
@@ -4789,15 +4626,12 @@
             <w:pPr>
               <w:spacing w:before="40" w:after="40"/>
             </w:pPr>
-            <w:r/>
-            <w:r>
-              <w:rPr>
-                <w:rFonts w:ascii="Segoe UI" w:hAnsi="Segoe UI"/>
-                <w:b w:val="0"/>
-                <w:color w:val="1B2630"/>
-                <w:sz w:val="17"/>
-              </w:rPr>
-              <w:t>Dobbels, met Janou erbij</w:t>
+            <w:r>
+              <w:rPr>
+                <w:color w:val="1B2630"/>
+                <w:sz w:val="17"/>
+              </w:rPr>
+              <w:t xml:space="preserve">Dobbels, met Janou </w:t>
             </w:r>
           </w:p>
         </w:tc>
@@ -4809,11 +4643,8 @@
             <w:pPr>
               <w:spacing w:before="40" w:after="40"/>
             </w:pPr>
-            <w:r/>
-            <w:r>
-              <w:rPr>
-                <w:rFonts w:ascii="Segoe UI" w:hAnsi="Segoe UI"/>
-                <w:b w:val="0"/>
+            <w:r>
+              <w:rPr>
                 <w:color w:val="1B2630"/>
                 <w:sz w:val="17"/>
               </w:rPr>
@@ -5052,10 +4883,8 @@
             <w:pPr>
               <w:spacing w:before="40" w:after="40"/>
             </w:pPr>
-            <w:r/>
-            <w:r>
-              <w:rPr>
-                <w:rFonts w:ascii="Segoe UI" w:hAnsi="Segoe UI"/>
+            <w:r>
+              <w:rPr>
                 <w:b/>
                 <w:color w:val="1B2630"/>
                 <w:sz w:val="17"/>
@@ -5073,15 +4902,12 @@
             <w:pPr>
               <w:spacing w:before="40" w:after="40"/>
             </w:pPr>
-            <w:r/>
-            <w:r>
-              <w:rPr>
-                <w:rFonts w:ascii="Segoe UI" w:hAnsi="Segoe UI"/>
-                <w:b w:val="0"/>
-                <w:color w:val="1B2630"/>
-                <w:sz w:val="17"/>
-              </w:rPr>
-              <w:t>Dobbels, met Janou erbij</w:t>
+            <w:r>
+              <w:rPr>
+                <w:color w:val="1B2630"/>
+                <w:sz w:val="17"/>
+              </w:rPr>
+              <w:t xml:space="preserve">Dobbels, met Janou </w:t>
             </w:r>
           </w:p>
         </w:tc>
@@ -5094,11 +4920,8 @@
             <w:pPr>
               <w:spacing w:before="40" w:after="40"/>
             </w:pPr>
-            <w:r/>
-            <w:r>
-              <w:rPr>
-                <w:rFonts w:ascii="Segoe UI" w:hAnsi="Segoe UI"/>
-                <w:b w:val="0"/>
+            <w:r>
+              <w:rPr>
                 <w:color w:val="1B2630"/>
                 <w:sz w:val="17"/>
               </w:rPr>
@@ -5136,16 +4959,6 @@
             <w:pPr>
               <w:spacing w:before="40" w:after="40"/>
             </w:pPr>
-            <w:r/>
-            <w:r>
-              <w:rPr>
-                <w:rFonts w:ascii="Segoe UI" w:hAnsi="Segoe UI"/>
-                <w:b w:val="0"/>
-                <w:color w:val="1B2630"/>
-                <w:sz w:val="17"/>
-              </w:rPr>
-              <w:t>waarvan Janou 42 u</w:t>
-            </w:r>
           </w:p>
         </w:tc>
         <w:tc>
@@ -5157,11 +4970,8 @@
             <w:pPr>
               <w:spacing w:before="40" w:after="40"/>
             </w:pPr>
-            <w:r/>
-            <w:r>
-              <w:rPr>
-                <w:rFonts w:ascii="Segoe UI" w:hAnsi="Segoe UI"/>
-                <w:b w:val="0"/>
+            <w:r>
+              <w:rPr>
                 <w:color w:val="1B2630"/>
                 <w:sz w:val="17"/>
               </w:rPr>
@@ -5171,1486 +4981,6 @@
         </w:tc>
       </w:tr>
     </w:tbl>
-    <w:p>
-      <w:pPr>
-        <w:spacing w:after="40"/>
-        <w:rPr>
-          <w:lang w:val="nl-BE"/>
-        </w:rPr>
-      </w:pPr>
-    </w:p>
-    <w:p>
-      <w:pPr>
-        <w:spacing w:before="160" w:after="60"/>
-        <w:rPr>
-          <w:lang w:val="nl-BE"/>
-        </w:rPr>
-      </w:pPr>
-      <w:r>
-        <w:rPr>
-          <w:b/>
-          <w:color w:val="00407A"/>
-          <w:lang w:val="nl-BE"/>
-        </w:rPr>
-        <w:t>Het schema van Janou, week per week</w:t>
-      </w:r>
-    </w:p>
-    <w:tbl>
-      <w:tblPr>
-        <w:tblW w:w="0" w:type="auto"/>
-        <w:tblBorders>
-          <w:top w:val="single" w:sz="4" w:space="0" w:color="D8E2EA"/>
-          <w:left w:val="single" w:sz="4" w:space="0" w:color="D8E2EA"/>
-          <w:bottom w:val="single" w:sz="4" w:space="0" w:color="D8E2EA"/>
-          <w:right w:val="single" w:sz="4" w:space="0" w:color="D8E2EA"/>
-          <w:insideH w:val="single" w:sz="4" w:space="0" w:color="D8E2EA"/>
-          <w:insideV w:val="single" w:sz="4" w:space="0" w:color="D8E2EA"/>
-        </w:tblBorders>
-        <w:tblLayout w:type="fixed"/>
-        <w:tblLook w:val="04A0" w:firstRow="1" w:lastRow="0" w:firstColumn="1" w:lastColumn="0" w:noHBand="0" w:noVBand="1"/>
-      </w:tblPr>
-      <w:tblGrid>
-        <w:gridCol w:w="1900"/>
-        <w:gridCol w:w="6300"/>
-        <w:gridCol w:w="1660"/>
-      </w:tblGrid>
-      <w:tr>
-        <w:tc>
-          <w:tcPr>
-            <w:tcW w:w="1900" w:type="dxa"/>
-            <w:shd w:val="clear" w:color="auto" w:fill="1D8DB0"/>
-          </w:tcPr>
-          <w:p>
-            <w:pPr>
-              <w:spacing w:before="60" w:after="60"/>
-            </w:pPr>
-            <w:r>
-              <w:rPr>
-                <w:b/>
-                <w:color w:val="FFFFFF"/>
-                <w:sz w:val="15"/>
-              </w:rPr>
-              <w:t>Week</w:t>
-            </w:r>
-          </w:p>
-        </w:tc>
-        <w:tc>
-          <w:tcPr>
-            <w:tcW w:w="6300" w:type="dxa"/>
-            <w:shd w:val="clear" w:color="auto" w:fill="1D8DB0"/>
-          </w:tcPr>
-          <w:p>
-            <w:pPr>
-              <w:spacing w:before="60" w:after="60"/>
-            </w:pPr>
-            <w:r>
-              <w:rPr>
-                <w:b/>
-                <w:color w:val="FFFFFF"/>
-                <w:sz w:val="15"/>
-              </w:rPr>
-              <w:t>Wat</w:t>
-            </w:r>
-          </w:p>
-        </w:tc>
-        <w:tc>
-          <w:tcPr>
-            <w:tcW w:w="1660" w:type="dxa"/>
-            <w:shd w:val="clear" w:color="auto" w:fill="1D8DB0"/>
-          </w:tcPr>
-          <w:p>
-            <w:pPr>
-              <w:spacing w:before="60" w:after="60"/>
-            </w:pPr>
-            <w:r>
-              <w:rPr>
-                <w:b/>
-                <w:color w:val="FFFFFF"/>
-                <w:sz w:val="15"/>
-              </w:rPr>
-              <w:t>Dagen</w:t>
-            </w:r>
-          </w:p>
-        </w:tc>
-      </w:tr>
-      <w:tr>
-        <w:tc>
-          <w:tcPr>
-            <w:tcW w:w="1900" w:type="dxa"/>
-          </w:tcPr>
-          <w:p>
-            <w:pPr>
-              <w:spacing w:before="40" w:after="40"/>
-            </w:pPr>
-            <w:r/>
-            <w:r>
-              <w:rPr>
-                <w:rFonts w:ascii="Segoe UI" w:hAnsi="Segoe UI"/>
-                <w:b/>
-                <w:color w:val="1B2630"/>
-                <w:sz w:val="17"/>
-              </w:rPr>
-              <w:t>9–27 nov</w:t>
-            </w:r>
-          </w:p>
-        </w:tc>
-        <w:tc>
-          <w:tcPr>
-            <w:tcW w:w="6300" w:type="dxa"/>
-          </w:tcPr>
-          <w:p>
-            <w:pPr>
-              <w:spacing w:before="40" w:after="40"/>
-            </w:pPr>
-            <w:r/>
-            <w:r>
-              <w:rPr>
-                <w:rFonts w:ascii="Segoe UI" w:hAnsi="Segoe UI"/>
-                <w:b w:val="0"/>
-                <w:color w:val="1B2630"/>
-                <w:sz w:val="17"/>
-              </w:rPr>
-              <w:t>Vier online sessies bijwonen, geen verplaatsing</w:t>
-            </w:r>
-          </w:p>
-        </w:tc>
-        <w:tc>
-          <w:tcPr>
-            <w:tcW w:w="1660" w:type="dxa"/>
-          </w:tcPr>
-          <w:p>
-            <w:pPr>
-              <w:spacing w:before="40" w:after="40"/>
-            </w:pPr>
-            <w:r/>
-            <w:r>
-              <w:rPr>
-                <w:rFonts w:ascii="Segoe UI" w:hAnsi="Segoe UI"/>
-                <w:b w:val="0"/>
-                <w:color w:val="1B2630"/>
-                <w:sz w:val="17"/>
-              </w:rPr>
-              <w:t>1</w:t>
-            </w:r>
-          </w:p>
-        </w:tc>
-      </w:tr>
-      <w:tr>
-        <w:tc>
-          <w:tcPr>
-            <w:tcW w:w="1900" w:type="dxa"/>
-          </w:tcPr>
-          <w:p>
-            <w:pPr>
-              <w:spacing w:before="40" w:after="40"/>
-            </w:pPr>
-            <w:r/>
-            <w:r>
-              <w:rPr>
-                <w:rFonts w:ascii="Segoe UI" w:hAnsi="Segoe UI"/>
-                <w:b/>
-                <w:color w:val="1B2630"/>
-                <w:sz w:val="17"/>
-              </w:rPr>
-              <w:t>30 nov – 4 dec</w:t>
-            </w:r>
-          </w:p>
-        </w:tc>
-        <w:tc>
-          <w:tcPr>
-            <w:tcW w:w="6300" w:type="dxa"/>
-          </w:tcPr>
-          <w:p>
-            <w:pPr>
-              <w:spacing w:before="40" w:after="40"/>
-            </w:pPr>
-            <w:r/>
-            <w:r>
-              <w:rPr>
-                <w:rFonts w:ascii="Segoe UI" w:hAnsi="Segoe UI"/>
-                <w:b w:val="0"/>
-                <w:color w:val="1B2630"/>
-                <w:sz w:val="17"/>
-              </w:rPr>
-              <w:t>di 1 Brugge en Kortrijk — technologie</w:t>
-            </w:r>
-          </w:p>
-        </w:tc>
-        <w:tc>
-          <w:tcPr>
-            <w:tcW w:w="1660" w:type="dxa"/>
-          </w:tcPr>
-          <w:p>
-            <w:pPr>
-              <w:spacing w:before="40" w:after="40"/>
-            </w:pPr>
-            <w:r/>
-            <w:r>
-              <w:rPr>
-                <w:rFonts w:ascii="Segoe UI" w:hAnsi="Segoe UI"/>
-                <w:b w:val="0"/>
-                <w:color w:val="1B2630"/>
-                <w:sz w:val="17"/>
-              </w:rPr>
-              <w:t>1</w:t>
-            </w:r>
-          </w:p>
-        </w:tc>
-      </w:tr>
-      <w:tr>
-        <w:tc>
-          <w:tcPr>
-            <w:tcW w:w="1900" w:type="dxa"/>
-          </w:tcPr>
-          <w:p>
-            <w:pPr>
-              <w:spacing w:before="40" w:after="40"/>
-            </w:pPr>
-            <w:r/>
-            <w:r>
-              <w:rPr>
-                <w:rFonts w:ascii="Segoe UI" w:hAnsi="Segoe UI"/>
-                <w:b/>
-                <w:color w:val="1B2630"/>
-                <w:sz w:val="17"/>
-              </w:rPr>
-              <w:t>7–11 dec</w:t>
-            </w:r>
-          </w:p>
-        </w:tc>
-        <w:tc>
-          <w:tcPr>
-            <w:tcW w:w="6300" w:type="dxa"/>
-          </w:tcPr>
-          <w:p>
-            <w:pPr>
-              <w:spacing w:before="40" w:after="40"/>
-            </w:pPr>
-            <w:r/>
-            <w:r>
-              <w:rPr>
-                <w:rFonts w:ascii="Segoe UI" w:hAnsi="Segoe UI"/>
-                <w:b w:val="0"/>
-                <w:color w:val="1B2630"/>
-                <w:sz w:val="17"/>
-              </w:rPr>
-              <w:t>di 8 Gent en Aalst — technologie</w:t>
-            </w:r>
-          </w:p>
-        </w:tc>
-        <w:tc>
-          <w:tcPr>
-            <w:tcW w:w="1660" w:type="dxa"/>
-          </w:tcPr>
-          <w:p>
-            <w:pPr>
-              <w:spacing w:before="40" w:after="40"/>
-            </w:pPr>
-            <w:r/>
-            <w:r>
-              <w:rPr>
-                <w:rFonts w:ascii="Segoe UI" w:hAnsi="Segoe UI"/>
-                <w:b w:val="0"/>
-                <w:color w:val="1B2630"/>
-                <w:sz w:val="17"/>
-              </w:rPr>
-              <w:t>1</w:t>
-            </w:r>
-          </w:p>
-        </w:tc>
-      </w:tr>
-      <w:tr>
-        <w:tc>
-          <w:tcPr>
-            <w:tcW w:w="1900" w:type="dxa"/>
-          </w:tcPr>
-          <w:p>
-            <w:pPr>
-              <w:spacing w:before="40" w:after="40"/>
-            </w:pPr>
-            <w:r/>
-            <w:r>
-              <w:rPr>
-                <w:rFonts w:ascii="Segoe UI" w:hAnsi="Segoe UI"/>
-                <w:b/>
-                <w:color w:val="1B2630"/>
-                <w:sz w:val="17"/>
-              </w:rPr>
-              <w:t>14–18 dec</w:t>
-            </w:r>
-          </w:p>
-        </w:tc>
-        <w:tc>
-          <w:tcPr>
-            <w:tcW w:w="6300" w:type="dxa"/>
-          </w:tcPr>
-          <w:p>
-            <w:pPr>
-              <w:spacing w:before="40" w:after="40"/>
-            </w:pPr>
-            <w:r/>
-            <w:r>
-              <w:rPr>
-                <w:rFonts w:ascii="Segoe UI" w:hAnsi="Segoe UI"/>
-                <w:b w:val="0"/>
-                <w:color w:val="1B2630"/>
-                <w:sz w:val="17"/>
-              </w:rPr>
-              <w:t>di 15 Leuven, wo 16 Antwerpen — technologie; vr 18 vragenlijstenset uit</w:t>
-            </w:r>
-          </w:p>
-        </w:tc>
-        <w:tc>
-          <w:tcPr>
-            <w:tcW w:w="1660" w:type="dxa"/>
-          </w:tcPr>
-          <w:p>
-            <w:pPr>
-              <w:spacing w:before="40" w:after="40"/>
-            </w:pPr>
-            <w:r/>
-            <w:r>
-              <w:rPr>
-                <w:rFonts w:ascii="Segoe UI" w:hAnsi="Segoe UI"/>
-                <w:b w:val="0"/>
-                <w:color w:val="1B2630"/>
-                <w:sz w:val="17"/>
-              </w:rPr>
-              <w:t>2,5</w:t>
-            </w:r>
-          </w:p>
-        </w:tc>
-      </w:tr>
-      <w:tr>
-        <w:tc>
-          <w:tcPr>
-            <w:tcW w:w="1900" w:type="dxa"/>
-          </w:tcPr>
-          <w:p>
-            <w:pPr>
-              <w:spacing w:before="40" w:after="40"/>
-            </w:pPr>
-            <w:r/>
-            <w:r>
-              <w:rPr>
-                <w:rFonts w:ascii="Segoe UI" w:hAnsi="Segoe UI"/>
-                <w:b/>
-                <w:color w:val="1B2630"/>
-                <w:sz w:val="17"/>
-              </w:rPr>
-              <w:t>december, te plannen</w:t>
-            </w:r>
-          </w:p>
-        </w:tc>
-        <w:tc>
-          <w:tcPr>
-            <w:tcW w:w="6300" w:type="dxa"/>
-          </w:tcPr>
-          <w:p>
-            <w:pPr>
-              <w:spacing w:before="40" w:after="40"/>
-            </w:pPr>
-            <w:r/>
-            <w:r>
-              <w:rPr>
-                <w:rFonts w:ascii="Segoe UI" w:hAnsi="Segoe UI"/>
-                <w:b w:val="0"/>
-                <w:color w:val="1B2630"/>
-                <w:sz w:val="17"/>
-              </w:rPr>
-              <w:t>Zes gedragsdagen bijwonen, één per centrum</w:t>
-            </w:r>
-          </w:p>
-        </w:tc>
-        <w:tc>
-          <w:tcPr>
-            <w:tcW w:w="1660" w:type="dxa"/>
-          </w:tcPr>
-          <w:p>
-            <w:pPr>
-              <w:spacing w:before="40" w:after="40"/>
-            </w:pPr>
-            <w:r/>
-            <w:r>
-              <w:rPr>
-                <w:rFonts w:ascii="Segoe UI" w:hAnsi="Segoe UI"/>
-                <w:b w:val="0"/>
-                <w:color w:val="1B2630"/>
-                <w:sz w:val="17"/>
-              </w:rPr>
-              <w:t>6</w:t>
-            </w:r>
-          </w:p>
-        </w:tc>
-      </w:tr>
-      <w:tr>
-        <w:tc>
-          <w:tcPr>
-            <w:tcW w:w="1900" w:type="dxa"/>
-          </w:tcPr>
-          <w:p>
-            <w:pPr>
-              <w:spacing w:before="40" w:after="40"/>
-            </w:pPr>
-            <w:r/>
-            <w:r>
-              <w:rPr>
-                <w:rFonts w:ascii="Segoe UI" w:hAnsi="Segoe UI"/>
-                <w:b/>
-                <w:color w:val="1B2630"/>
-                <w:sz w:val="17"/>
-              </w:rPr>
-              <w:t>4–8 jan</w:t>
-            </w:r>
-          </w:p>
-        </w:tc>
-        <w:tc>
-          <w:tcPr>
-            <w:tcW w:w="6300" w:type="dxa"/>
-          </w:tcPr>
-          <w:p>
-            <w:pPr>
-              <w:spacing w:before="40" w:after="40"/>
-            </w:pPr>
-            <w:r/>
-            <w:r>
-              <w:rPr>
-                <w:rFonts w:ascii="Segoe UI" w:hAnsi="Segoe UI"/>
-                <w:b w:val="0"/>
-                <w:color w:val="1B2630"/>
-                <w:sz w:val="17"/>
-              </w:rPr>
-              <w:t>Zelftest loopt in de centra</w:t>
-            </w:r>
-          </w:p>
-        </w:tc>
-        <w:tc>
-          <w:tcPr>
-            <w:tcW w:w="1660" w:type="dxa"/>
-          </w:tcPr>
-          <w:p>
-            <w:pPr>
-              <w:spacing w:before="40" w:after="40"/>
-            </w:pPr>
-            <w:r/>
-            <w:r>
-              <w:rPr>
-                <w:rFonts w:ascii="Segoe UI" w:hAnsi="Segoe UI"/>
-                <w:b w:val="0"/>
-                <w:color w:val="1B2630"/>
-                <w:sz w:val="17"/>
-              </w:rPr>
-              <w:t>0,5</w:t>
-            </w:r>
-          </w:p>
-        </w:tc>
-      </w:tr>
-      <w:tr>
-        <w:tc>
-          <w:tcPr>
-            <w:tcW w:w="1900" w:type="dxa"/>
-          </w:tcPr>
-          <w:p>
-            <w:pPr>
-              <w:spacing w:before="40" w:after="40"/>
-            </w:pPr>
-            <w:r/>
-            <w:r>
-              <w:rPr>
-                <w:rFonts w:ascii="Segoe UI" w:hAnsi="Segoe UI"/>
-                <w:b/>
-                <w:color w:val="1B2630"/>
-                <w:sz w:val="17"/>
-              </w:rPr>
-              <w:t>11–15 jan</w:t>
-            </w:r>
-          </w:p>
-        </w:tc>
-        <w:tc>
-          <w:tcPr>
-            <w:tcW w:w="6300" w:type="dxa"/>
-          </w:tcPr>
-          <w:p>
-            <w:pPr>
-              <w:spacing w:before="40" w:after="40"/>
-            </w:pPr>
-            <w:r/>
-            <w:r>
-              <w:rPr>
-                <w:rFonts w:ascii="Segoe UI" w:hAnsi="Segoe UI"/>
-                <w:b w:val="0"/>
-                <w:color w:val="1B2630"/>
-                <w:sz w:val="17"/>
-              </w:rPr>
-              <w:t>di 12 datacollectie online; do 14 Brugge, vr 15 Kortrijk — droogloop</w:t>
-            </w:r>
-          </w:p>
-        </w:tc>
-        <w:tc>
-          <w:tcPr>
-            <w:tcW w:w="1660" w:type="dxa"/>
-          </w:tcPr>
-          <w:p>
-            <w:pPr>
-              <w:spacing w:before="40" w:after="40"/>
-            </w:pPr>
-            <w:r/>
-            <w:r>
-              <w:rPr>
-                <w:rFonts w:ascii="Segoe UI" w:hAnsi="Segoe UI"/>
-                <w:b w:val="0"/>
-                <w:color w:val="1B2630"/>
-                <w:sz w:val="17"/>
-              </w:rPr>
-              <w:t>2,5</w:t>
-            </w:r>
-          </w:p>
-        </w:tc>
-      </w:tr>
-      <w:tr>
-        <w:tc>
-          <w:tcPr>
-            <w:tcW w:w="1900" w:type="dxa"/>
-          </w:tcPr>
-          <w:p>
-            <w:pPr>
-              <w:spacing w:before="40" w:after="40"/>
-            </w:pPr>
-            <w:r/>
-            <w:r>
-              <w:rPr>
-                <w:rFonts w:ascii="Segoe UI" w:hAnsi="Segoe UI"/>
-                <w:b/>
-                <w:color w:val="1B2630"/>
-                <w:sz w:val="17"/>
-              </w:rPr>
-              <w:t>18–22 jan</w:t>
-            </w:r>
-          </w:p>
-        </w:tc>
-        <w:tc>
-          <w:tcPr>
-            <w:tcW w:w="6300" w:type="dxa"/>
-          </w:tcPr>
-          <w:p>
-            <w:pPr>
-              <w:spacing w:before="40" w:after="40"/>
-            </w:pPr>
-            <w:r/>
-            <w:r>
-              <w:rPr>
-                <w:rFonts w:ascii="Segoe UI" w:hAnsi="Segoe UI"/>
-                <w:b w:val="0"/>
-                <w:color w:val="1B2630"/>
-                <w:sz w:val="17"/>
-              </w:rPr>
-              <w:t>di 19 Gent, wo 20 Aalst — droogloop</w:t>
-            </w:r>
-          </w:p>
-        </w:tc>
-        <w:tc>
-          <w:tcPr>
-            <w:tcW w:w="1660" w:type="dxa"/>
-          </w:tcPr>
-          <w:p>
-            <w:pPr>
-              <w:spacing w:before="40" w:after="40"/>
-            </w:pPr>
-            <w:r/>
-            <w:r>
-              <w:rPr>
-                <w:rFonts w:ascii="Segoe UI" w:hAnsi="Segoe UI"/>
-                <w:b w:val="0"/>
-                <w:color w:val="1B2630"/>
-                <w:sz w:val="17"/>
-              </w:rPr>
-              <w:t>2</w:t>
-            </w:r>
-          </w:p>
-        </w:tc>
-      </w:tr>
-      <w:tr>
-        <w:tc>
-          <w:tcPr>
-            <w:tcW w:w="1900" w:type="dxa"/>
-            <w:shd w:val="clear" w:color="auto" w:fill="EAF3F8"/>
-          </w:tcPr>
-          <w:p>
-            <w:pPr>
-              <w:spacing w:before="40" w:after="40"/>
-            </w:pPr>
-            <w:r/>
-            <w:r>
-              <w:rPr>
-                <w:rFonts w:ascii="Segoe UI" w:hAnsi="Segoe UI"/>
-                <w:b/>
-                <w:color w:val="1B2630"/>
-                <w:sz w:val="17"/>
-              </w:rPr>
-              <w:t>25–29 jan</w:t>
-            </w:r>
-          </w:p>
-        </w:tc>
-        <w:tc>
-          <w:tcPr>
-            <w:tcW w:w="6300" w:type="dxa"/>
-            <w:shd w:val="clear" w:color="auto" w:fill="EAF3F8"/>
-          </w:tcPr>
-          <w:p>
-            <w:pPr>
-              <w:spacing w:before="40" w:after="40"/>
-            </w:pPr>
-            <w:r/>
-            <w:r>
-              <w:rPr>
-                <w:rFonts w:ascii="Segoe UI" w:hAnsi="Segoe UI"/>
-                <w:b w:val="0"/>
-                <w:color w:val="1B2630"/>
-                <w:sz w:val="17"/>
-              </w:rPr>
-              <w:t>di 26 Leuven, wo 27 Antwerpen — droogloop</w:t>
-            </w:r>
-          </w:p>
-        </w:tc>
-        <w:tc>
-          <w:tcPr>
-            <w:tcW w:w="1660" w:type="dxa"/>
-            <w:shd w:val="clear" w:color="auto" w:fill="EAF3F8"/>
-          </w:tcPr>
-          <w:p>
-            <w:pPr>
-              <w:spacing w:before="40" w:after="40"/>
-            </w:pPr>
-            <w:r/>
-            <w:r>
-              <w:rPr>
-                <w:rFonts w:ascii="Segoe UI" w:hAnsi="Segoe UI"/>
-                <w:b w:val="0"/>
-                <w:color w:val="1B2630"/>
-                <w:sz w:val="17"/>
-              </w:rPr>
-              <w:t>2</w:t>
-            </w:r>
-          </w:p>
-        </w:tc>
-      </w:tr>
-      <w:tr>
-        <w:tc>
-          <w:tcPr>
-            <w:tcW w:type="dxa" w:w="1900"/>
-            <w:shd w:val="clear" w:color="auto" w:fill="EAF3F8"/>
-          </w:tcPr>
-          <w:p>
-            <w:pPr>
-              <w:spacing w:before="40" w:after="40"/>
-            </w:pPr>
-            <w:r/>
-            <w:r>
-              <w:rPr>
-                <w:rFonts w:ascii="Segoe UI" w:hAnsi="Segoe UI"/>
-                <w:b/>
-                <w:color w:val="00407A"/>
-                <w:sz w:val="17"/>
-              </w:rPr>
-              <w:t>Zestien reisdagen, achttien sitebezoeken</w:t>
-            </w:r>
-          </w:p>
-        </w:tc>
-        <w:tc>
-          <w:tcPr>
-            <w:tcW w:type="dxa" w:w="6300"/>
-            <w:shd w:val="clear" w:color="auto" w:fill="EAF3F8"/>
-          </w:tcPr>
-          <w:p>
-            <w:pPr>
-              <w:spacing w:before="40" w:after="40"/>
-            </w:pPr>
-            <w:r/>
-            <w:r>
-              <w:rPr>
-                <w:rFonts w:ascii="Segoe UI" w:hAnsi="Segoe UI"/>
-                <w:b/>
-                <w:color w:val="00407A"/>
-                <w:sz w:val="17"/>
-              </w:rPr>
-              <w:t>Elke dag met een verplaatsing telt als een volle dag</w:t>
-            </w:r>
-          </w:p>
-        </w:tc>
-        <w:tc>
-          <w:tcPr>
-            <w:tcW w:type="dxa" w:w="1660"/>
-            <w:shd w:val="clear" w:color="auto" w:fill="EAF3F8"/>
-          </w:tcPr>
-          <w:p>
-            <w:pPr>
-              <w:spacing w:before="40" w:after="40"/>
-            </w:pPr>
-            <w:r/>
-            <w:r>
-              <w:rPr>
-                <w:rFonts w:ascii="Segoe UI" w:hAnsi="Segoe UI"/>
-                <w:b/>
-                <w:color w:val="00407A"/>
-                <w:sz w:val="17"/>
-              </w:rPr>
-              <w:t>18,5 dagen</w:t>
-            </w:r>
-          </w:p>
-        </w:tc>
-      </w:tr>
-    </w:tbl>
-    <w:p>
-      <w:pPr>
-        <w:spacing w:after="40"/>
-      </w:pPr>
-    </w:p>
-    <w:p>
-      <w:pPr>
-        <w:spacing w:before="160" w:after="60"/>
-      </w:pPr>
-      <w:r>
-        <w:rPr>
-          <w:b/>
-          <w:color w:val="00407A"/>
-        </w:rPr>
-        <w:t>Voorbereiding</w:t>
-      </w:r>
-      <w:r>
-        <w:rPr>
-          <w:b/>
-          <w:color w:val="00407A"/>
-        </w:rPr>
-        <w:t xml:space="preserve"> van Janou</w:t>
-      </w:r>
-    </w:p>
-    <w:tbl>
-      <w:tblPr>
-        <w:tblW w:w="0" w:type="auto"/>
-        <w:tblBorders>
-          <w:top w:val="single" w:sz="4" w:space="0" w:color="D8E2EA"/>
-          <w:left w:val="single" w:sz="4" w:space="0" w:color="D8E2EA"/>
-          <w:bottom w:val="single" w:sz="4" w:space="0" w:color="D8E2EA"/>
-          <w:right w:val="single" w:sz="4" w:space="0" w:color="D8E2EA"/>
-          <w:insideH w:val="single" w:sz="4" w:space="0" w:color="D8E2EA"/>
-          <w:insideV w:val="single" w:sz="4" w:space="0" w:color="D8E2EA"/>
-        </w:tblBorders>
-        <w:tblLayout w:type="fixed"/>
-        <w:tblLook w:val="04A0" w:firstRow="1" w:lastRow="0" w:firstColumn="1" w:lastColumn="0" w:noHBand="0" w:noVBand="1"/>
-      </w:tblPr>
-      <w:tblGrid>
-        <w:gridCol w:w="3000"/>
-        <w:gridCol w:w="2600"/>
-        <w:gridCol w:w="2200"/>
-        <w:gridCol w:w="2060"/>
-      </w:tblGrid>
-      <w:tr>
-        <w:tc>
-          <w:tcPr>
-            <w:tcW w:w="3000" w:type="dxa"/>
-            <w:shd w:val="clear" w:color="auto" w:fill="1D8DB0"/>
-          </w:tcPr>
-          <w:p>
-            <w:pPr>
-              <w:spacing w:before="60" w:after="60"/>
-            </w:pPr>
-            <w:r>
-              <w:rPr>
-                <w:b/>
-                <w:color w:val="FFFFFF"/>
-                <w:sz w:val="15"/>
-              </w:rPr>
-              <w:t>Onderdeel</w:t>
-            </w:r>
-          </w:p>
-        </w:tc>
-        <w:tc>
-          <w:tcPr>
-            <w:tcW w:w="2600" w:type="dxa"/>
-            <w:shd w:val="clear" w:color="auto" w:fill="1D8DB0"/>
-          </w:tcPr>
-          <w:p>
-            <w:pPr>
-              <w:spacing w:before="60" w:after="60"/>
-            </w:pPr>
-            <w:r>
-              <w:rPr>
-                <w:b/>
-                <w:color w:val="FFFFFF"/>
-                <w:sz w:val="15"/>
-              </w:rPr>
-              <w:t>Nieuw materiaal</w:t>
-            </w:r>
-          </w:p>
-        </w:tc>
-        <w:tc>
-          <w:tcPr>
-            <w:tcW w:w="2200" w:type="dxa"/>
-            <w:shd w:val="clear" w:color="auto" w:fill="1D8DB0"/>
-          </w:tcPr>
-          <w:p>
-            <w:pPr>
-              <w:spacing w:before="60" w:after="60"/>
-            </w:pPr>
-            <w:r>
-              <w:rPr>
-                <w:b/>
-                <w:color w:val="FFFFFF"/>
-                <w:sz w:val="15"/>
-              </w:rPr>
-              <w:t>Herhaling</w:t>
-            </w:r>
-          </w:p>
-        </w:tc>
-        <w:tc>
-          <w:tcPr>
-            <w:tcW w:w="2060" w:type="dxa"/>
-            <w:shd w:val="clear" w:color="auto" w:fill="1D8DB0"/>
-          </w:tcPr>
-          <w:p>
-            <w:pPr>
-              <w:spacing w:before="60" w:after="60"/>
-            </w:pPr>
-            <w:r>
-              <w:rPr>
-                <w:b/>
-                <w:color w:val="FFFFFF"/>
-                <w:sz w:val="15"/>
-              </w:rPr>
-              <w:t>Totaal</w:t>
-            </w:r>
-          </w:p>
-        </w:tc>
-      </w:tr>
-      <w:tr>
-        <w:tc>
-          <w:tcPr>
-            <w:tcW w:w="3000" w:type="dxa"/>
-          </w:tcPr>
-          <w:p>
-            <w:pPr>
-              <w:spacing w:before="40" w:after="40"/>
-            </w:pPr>
-            <w:r>
-              <w:rPr>
-                <w:b/>
-                <w:color w:val="1B2630"/>
-                <w:sz w:val="17"/>
-              </w:rPr>
-              <w:t>Technologie, 2 u</w:t>
-            </w:r>
-          </w:p>
-        </w:tc>
-        <w:tc>
-          <w:tcPr>
-            <w:tcW w:w="2600" w:type="dxa"/>
-          </w:tcPr>
-          <w:p>
-            <w:pPr>
-              <w:spacing w:before="40" w:after="40"/>
-            </w:pPr>
-            <w:r>
-              <w:rPr>
-                <w:color w:val="1B2630"/>
-                <w:sz w:val="17"/>
-              </w:rPr>
-              <w:t>6 u</w:t>
-            </w:r>
-          </w:p>
-        </w:tc>
-        <w:tc>
-          <w:tcPr>
-            <w:tcW w:w="2200" w:type="dxa"/>
-          </w:tcPr>
-          <w:p>
-            <w:pPr>
-              <w:spacing w:before="40" w:after="40"/>
-            </w:pPr>
-            <w:r>
-              <w:rPr>
-                <w:color w:val="1B2630"/>
-                <w:sz w:val="17"/>
-              </w:rPr>
-              <w:t>5 × 0,5 u</w:t>
-            </w:r>
-          </w:p>
-        </w:tc>
-        <w:tc>
-          <w:tcPr>
-            <w:tcW w:w="2060" w:type="dxa"/>
-          </w:tcPr>
-          <w:p>
-            <w:pPr>
-              <w:spacing w:before="40" w:after="40"/>
-            </w:pPr>
-            <w:r>
-              <w:rPr>
-                <w:color w:val="1B2630"/>
-                <w:sz w:val="17"/>
-              </w:rPr>
-              <w:t>8,5 u</w:t>
-            </w:r>
-          </w:p>
-        </w:tc>
-      </w:tr>
-      <w:tr>
-        <w:tc>
-          <w:tcPr>
-            <w:tcW w:w="3000" w:type="dxa"/>
-          </w:tcPr>
-          <w:p>
-            <w:pPr>
-              <w:spacing w:before="40" w:after="40"/>
-            </w:pPr>
-            <w:r>
-              <w:rPr>
-                <w:b/>
-                <w:color w:val="1B2630"/>
-                <w:sz w:val="17"/>
-              </w:rPr>
-              <w:t>Softwarevoorbereiding</w:t>
-            </w:r>
-          </w:p>
-        </w:tc>
-        <w:tc>
-          <w:tcPr>
-            <w:tcW w:w="2600" w:type="dxa"/>
-          </w:tcPr>
-          <w:p>
-            <w:pPr>
-              <w:spacing w:before="40" w:after="40"/>
-            </w:pPr>
-            <w:r>
-              <w:rPr>
-                <w:color w:val="1B2630"/>
-                <w:sz w:val="17"/>
-              </w:rPr>
-              <w:t>1 u</w:t>
-            </w:r>
-          </w:p>
-        </w:tc>
-        <w:tc>
-          <w:tcPr>
-            <w:tcW w:w="2200" w:type="dxa"/>
-          </w:tcPr>
-          <w:p>
-            <w:pPr>
-              <w:spacing w:before="40" w:after="40"/>
-            </w:pPr>
-            <w:r>
-              <w:rPr>
-                <w:color w:val="1B2630"/>
-                <w:sz w:val="17"/>
-              </w:rPr>
-              <w:t>—</w:t>
-            </w:r>
-          </w:p>
-        </w:tc>
-        <w:tc>
-          <w:tcPr>
-            <w:tcW w:w="2060" w:type="dxa"/>
-          </w:tcPr>
-          <w:p>
-            <w:pPr>
-              <w:spacing w:before="40" w:after="40"/>
-            </w:pPr>
-            <w:r>
-              <w:rPr>
-                <w:color w:val="1B2630"/>
-                <w:sz w:val="17"/>
-              </w:rPr>
-              <w:t>1 u</w:t>
-            </w:r>
-          </w:p>
-        </w:tc>
-      </w:tr>
-      <w:tr>
-        <w:tc>
-          <w:tcPr>
-            <w:tcW w:w="3000" w:type="dxa"/>
-          </w:tcPr>
-          <w:p>
-            <w:pPr>
-              <w:spacing w:before="40" w:after="40"/>
-            </w:pPr>
-            <w:r>
-              <w:rPr>
-                <w:b/>
-                <w:color w:val="1B2630"/>
-                <w:sz w:val="17"/>
-              </w:rPr>
-              <w:t>Droogloop met debriefing, 4,5 u</w:t>
-            </w:r>
-          </w:p>
-        </w:tc>
-        <w:tc>
-          <w:tcPr>
-            <w:tcW w:w="2600" w:type="dxa"/>
-          </w:tcPr>
-          <w:p>
-            <w:pPr>
-              <w:spacing w:before="40" w:after="40"/>
-            </w:pPr>
-            <w:r>
-              <w:rPr>
-                <w:color w:val="1B2630"/>
-                <w:sz w:val="17"/>
-              </w:rPr>
-              <w:t>12 u scenario en materialenset</w:t>
-            </w:r>
-          </w:p>
-        </w:tc>
-        <w:tc>
-          <w:tcPr>
-            <w:tcW w:w="2200" w:type="dxa"/>
-          </w:tcPr>
-          <w:p>
-            <w:pPr>
-              <w:spacing w:before="40" w:after="40"/>
-            </w:pPr>
-            <w:r>
-              <w:rPr>
-                <w:color w:val="1B2630"/>
-                <w:sz w:val="17"/>
-              </w:rPr>
-              <w:t>5 × 0,5 u</w:t>
-            </w:r>
-          </w:p>
-        </w:tc>
-        <w:tc>
-          <w:tcPr>
-            <w:tcW w:w="2060" w:type="dxa"/>
-          </w:tcPr>
-          <w:p>
-            <w:pPr>
-              <w:spacing w:before="40" w:after="40"/>
-            </w:pPr>
-            <w:r>
-              <w:rPr>
-                <w:color w:val="1B2630"/>
-                <w:sz w:val="17"/>
-              </w:rPr>
-              <w:t>14,5 u</w:t>
-            </w:r>
-          </w:p>
-        </w:tc>
-      </w:tr>
-      <w:tr>
-        <w:tc>
-          <w:tcPr>
-            <w:tcW w:w="3000" w:type="dxa"/>
-            <w:shd w:val="clear" w:color="auto" w:fill="EAF3F8"/>
-          </w:tcPr>
-          <w:p>
-            <w:pPr>
-              <w:spacing w:before="40" w:after="40"/>
-            </w:pPr>
-            <w:r>
-              <w:rPr>
-                <w:b/>
-                <w:color w:val="00407A"/>
-                <w:sz w:val="17"/>
-              </w:rPr>
-              <w:t>Totaal</w:t>
-            </w:r>
-          </w:p>
-        </w:tc>
-        <w:tc>
-          <w:tcPr>
-            <w:tcW w:w="2600" w:type="dxa"/>
-            <w:shd w:val="clear" w:color="auto" w:fill="EAF3F8"/>
-          </w:tcPr>
-          <w:p>
-            <w:pPr>
-              <w:spacing w:before="40" w:after="40"/>
-            </w:pPr>
-            <w:r>
-              <w:rPr>
-                <w:b/>
-                <w:color w:val="00407A"/>
-                <w:sz w:val="17"/>
-              </w:rPr>
-              <w:t>—</w:t>
-            </w:r>
-          </w:p>
-        </w:tc>
-        <w:tc>
-          <w:tcPr>
-            <w:tcW w:w="2200" w:type="dxa"/>
-            <w:shd w:val="clear" w:color="auto" w:fill="EAF3F8"/>
-          </w:tcPr>
-          <w:p>
-            <w:pPr>
-              <w:spacing w:before="40" w:after="40"/>
-            </w:pPr>
-            <w:r>
-              <w:rPr>
-                <w:b/>
-                <w:color w:val="00407A"/>
-                <w:sz w:val="17"/>
-              </w:rPr>
-              <w:t>—</w:t>
-            </w:r>
-          </w:p>
-        </w:tc>
-        <w:tc>
-          <w:tcPr>
-            <w:tcW w:w="2060" w:type="dxa"/>
-            <w:shd w:val="clear" w:color="auto" w:fill="EAF3F8"/>
-          </w:tcPr>
-          <w:p>
-            <w:pPr>
-              <w:spacing w:before="40" w:after="40"/>
-            </w:pPr>
-            <w:r/>
-            <w:r>
-              <w:rPr>
-                <w:rFonts w:ascii="Segoe UI" w:hAnsi="Segoe UI"/>
-                <w:b w:val="0"/>
-                <w:color w:val="1B2630"/>
-                <w:sz w:val="17"/>
-              </w:rPr>
-              <w:t>24 u ≈ 3 dagen</w:t>
-            </w:r>
-          </w:p>
-        </w:tc>
-      </w:tr>
-    </w:tbl>
-    <w:p>
-      <w:pPr>
-        <w:spacing w:after="40"/>
-      </w:pPr>
-    </w:p>
-    <w:p>
-      <w:pPr>
-        <w:spacing w:before="160" w:after="60"/>
-      </w:pPr>
-      <w:r>
-        <w:rPr>
-          <w:b/>
-          <w:color w:val="00407A"/>
-        </w:rPr>
-        <w:t>Totaal</w:t>
-      </w:r>
-    </w:p>
-    <w:tbl>
-      <w:tblPr>
-        <w:tblW w:w="0" w:type="auto"/>
-        <w:tblBorders>
-          <w:top w:val="single" w:sz="4" w:space="0" w:color="D8E2EA"/>
-          <w:left w:val="single" w:sz="4" w:space="0" w:color="D8E2EA"/>
-          <w:bottom w:val="single" w:sz="4" w:space="0" w:color="D8E2EA"/>
-          <w:right w:val="single" w:sz="4" w:space="0" w:color="D8E2EA"/>
-          <w:insideH w:val="single" w:sz="4" w:space="0" w:color="D8E2EA"/>
-          <w:insideV w:val="single" w:sz="4" w:space="0" w:color="D8E2EA"/>
-        </w:tblBorders>
-        <w:tblLayout w:type="fixed"/>
-        <w:tblLook w:val="04A0" w:firstRow="1" w:lastRow="0" w:firstColumn="1" w:lastColumn="0" w:noHBand="0" w:noVBand="1"/>
-      </w:tblPr>
-      <w:tblGrid>
-        <w:gridCol w:w="6400"/>
-        <w:gridCol w:w="3460"/>
-      </w:tblGrid>
-      <w:tr>
-        <w:tc>
-          <w:tcPr>
-            <w:tcW w:w="6400" w:type="dxa"/>
-            <w:shd w:val="clear" w:color="auto" w:fill="1D8DB0"/>
-          </w:tcPr>
-          <w:p>
-            <w:pPr>
-              <w:spacing w:before="60" w:after="60"/>
-            </w:pPr>
-            <w:r>
-              <w:rPr>
-                <w:b/>
-                <w:color w:val="FFFFFF"/>
-                <w:sz w:val="15"/>
-              </w:rPr>
-              <w:t>Post</w:t>
-            </w:r>
-          </w:p>
-        </w:tc>
-        <w:tc>
-          <w:tcPr>
-            <w:tcW w:w="3460" w:type="dxa"/>
-            <w:shd w:val="clear" w:color="auto" w:fill="1D8DB0"/>
-          </w:tcPr>
-          <w:p>
-            <w:pPr>
-              <w:spacing w:before="60" w:after="60"/>
-            </w:pPr>
-            <w:r>
-              <w:rPr>
-                <w:b/>
-                <w:color w:val="FFFFFF"/>
-                <w:sz w:val="15"/>
-              </w:rPr>
-              <w:t>Dagen</w:t>
-            </w:r>
-          </w:p>
-        </w:tc>
-      </w:tr>
-      <w:tr>
-        <w:tc>
-          <w:tcPr>
-            <w:tcW w:w="6400" w:type="dxa"/>
-          </w:tcPr>
-          <w:p>
-            <w:pPr>
-              <w:spacing w:before="40" w:after="40"/>
-            </w:pPr>
-            <w:r/>
-            <w:r>
-              <w:rPr>
-                <w:rFonts w:ascii="Segoe UI" w:hAnsi="Segoe UI"/>
-                <w:b/>
-                <w:color w:val="1B2630"/>
-                <w:sz w:val="17"/>
-              </w:rPr>
-              <w:t>Janou · sessies en reisdagen</w:t>
-            </w:r>
-          </w:p>
-        </w:tc>
-        <w:tc>
-          <w:tcPr>
-            <w:tcW w:w="3460" w:type="dxa"/>
-          </w:tcPr>
-          <w:p>
-            <w:pPr>
-              <w:spacing w:before="40" w:after="40"/>
-            </w:pPr>
-            <w:r/>
-            <w:r>
-              <w:rPr>
-                <w:rFonts w:ascii="Segoe UI" w:hAnsi="Segoe UI"/>
-                <w:b w:val="0"/>
-                <w:color w:val="1B2630"/>
-                <w:sz w:val="17"/>
-              </w:rPr>
-              <w:t>18,5</w:t>
-            </w:r>
-          </w:p>
-        </w:tc>
-      </w:tr>
-      <w:tr>
-        <w:tc>
-          <w:tcPr>
-            <w:tcW w:w="6400" w:type="dxa"/>
-          </w:tcPr>
-          <w:p>
-            <w:pPr>
-              <w:spacing w:before="40" w:after="40"/>
-            </w:pPr>
-            <w:r/>
-            <w:r>
-              <w:rPr>
-                <w:rFonts w:ascii="Segoe UI" w:hAnsi="Segoe UI"/>
-                <w:b/>
-                <w:color w:val="1B2630"/>
-                <w:sz w:val="17"/>
-              </w:rPr>
-              <w:t>Janou · voorbereiding</w:t>
-            </w:r>
-          </w:p>
-        </w:tc>
-        <w:tc>
-          <w:tcPr>
-            <w:tcW w:w="3460" w:type="dxa"/>
-          </w:tcPr>
-          <w:p>
-            <w:pPr>
-              <w:spacing w:before="40" w:after="40"/>
-            </w:pPr>
-            <w:r/>
-            <w:r>
-              <w:rPr>
-                <w:rFonts w:ascii="Segoe UI" w:hAnsi="Segoe UI"/>
-                <w:b w:val="0"/>
-                <w:color w:val="1B2630"/>
-                <w:sz w:val="17"/>
-              </w:rPr>
-              <w:t>3</w:t>
-            </w:r>
-          </w:p>
-        </w:tc>
-      </w:tr>
-      <w:tr>
-        <w:tc>
-          <w:tcPr>
-            <w:tcW w:w="6400" w:type="dxa"/>
-          </w:tcPr>
-          <w:p>
-            <w:pPr>
-              <w:spacing w:before="40" w:after="40"/>
-            </w:pPr>
-            <w:r/>
-            <w:r>
-              <w:rPr>
-                <w:rFonts w:ascii="Segoe UI" w:hAnsi="Segoe UI"/>
-                <w:b/>
-                <w:color w:val="1B2630"/>
-                <w:sz w:val="17"/>
-              </w:rPr>
-              <w:t>Deschamps · 4,5 u contact, drie online sessies</w:t>
-            </w:r>
-          </w:p>
-        </w:tc>
-        <w:tc>
-          <w:tcPr>
-            <w:tcW w:w="3460" w:type="dxa"/>
-          </w:tcPr>
-          <w:p>
-            <w:pPr>
-              <w:spacing w:before="40" w:after="40"/>
-            </w:pPr>
-            <w:r/>
-            <w:r>
-              <w:rPr>
-                <w:rFonts w:ascii="Segoe UI" w:hAnsi="Segoe UI"/>
-                <w:b w:val="0"/>
-                <w:color w:val="1B2630"/>
-                <w:sz w:val="17"/>
-              </w:rPr>
-              <w:t>2</w:t>
-            </w:r>
-          </w:p>
-        </w:tc>
-      </w:tr>
-      <w:tr>
-        <w:tc>
-          <w:tcPr>
-            <w:tcW w:w="6400" w:type="dxa"/>
-          </w:tcPr>
-          <w:p>
-            <w:pPr>
-              <w:spacing w:before="40" w:after="40"/>
-            </w:pPr>
-            <w:r/>
-            <w:r>
-              <w:rPr>
-                <w:rFonts w:ascii="Segoe UI" w:hAnsi="Segoe UI"/>
-                <w:b/>
-                <w:color w:val="1B2630"/>
-                <w:sz w:val="17"/>
-              </w:rPr>
-              <w:t>Dobbels · 19,5 u contact vóór de start, zes lesdagen in december</w:t>
-            </w:r>
-          </w:p>
-        </w:tc>
-        <w:tc>
-          <w:tcPr>
-            <w:tcW w:w="3460" w:type="dxa"/>
-          </w:tcPr>
-          <w:p>
-            <w:pPr>
-              <w:spacing w:before="40" w:after="40"/>
-            </w:pPr>
-            <w:r/>
-            <w:r>
-              <w:rPr>
-                <w:rFonts w:ascii="Segoe UI" w:hAnsi="Segoe UI"/>
-                <w:b w:val="0"/>
-                <w:color w:val="1B2630"/>
-                <w:sz w:val="17"/>
-              </w:rPr>
-              <w:t>8</w:t>
-            </w:r>
-          </w:p>
-        </w:tc>
-      </w:tr>
-      <w:tr>
-        <w:tc>
-          <w:tcPr>
-            <w:tcW w:w="6400" w:type="dxa"/>
-          </w:tcPr>
-          <w:p>
-            <w:pPr>
-              <w:spacing w:before="40" w:after="40"/>
-            </w:pPr>
-            <w:r/>
-            <w:r>
-              <w:rPr>
-                <w:rFonts w:ascii="Segoe UI" w:hAnsi="Segoe UI"/>
-                <w:b/>
-                <w:color w:val="1B2630"/>
-                <w:sz w:val="17"/>
-              </w:rPr>
-              <w:t>Fobelets · 2 u contact, één online sessie</w:t>
-            </w:r>
-          </w:p>
-        </w:tc>
-        <w:tc>
-          <w:tcPr>
-            <w:tcW w:w="3460" w:type="dxa"/>
-          </w:tcPr>
-          <w:p>
-            <w:pPr>
-              <w:spacing w:before="40" w:after="40"/>
-            </w:pPr>
-            <w:r/>
-            <w:r>
-              <w:rPr>
-                <w:rFonts w:ascii="Segoe UI" w:hAnsi="Segoe UI"/>
-                <w:b w:val="0"/>
-                <w:color w:val="1B2630"/>
-                <w:sz w:val="17"/>
-              </w:rPr>
-              <w:t>1,5</w:t>
-            </w:r>
-          </w:p>
-        </w:tc>
-      </w:tr>
-      <w:tr>
-        <w:tc>
-          <w:tcPr>
-            <w:tcW w:w="6400" w:type="dxa"/>
-            <w:shd w:val="clear" w:color="auto" w:fill="EAF3F8"/>
-          </w:tcPr>
-          <w:p>
-            <w:pPr>
-              <w:spacing w:before="40" w:after="40"/>
-            </w:pPr>
-            <w:r/>
-            <w:r>
-              <w:rPr>
-                <w:rFonts w:ascii="Segoe UI" w:hAnsi="Segoe UI"/>
-                <w:b/>
-                <w:color w:val="00407A"/>
-                <w:sz w:val="17"/>
-              </w:rPr>
-              <w:t>Janou, tussen 10 november en 29 januari</w:t>
-            </w:r>
-          </w:p>
-        </w:tc>
-        <w:tc>
-          <w:tcPr>
-            <w:tcW w:w="3460" w:type="dxa"/>
-            <w:shd w:val="clear" w:color="auto" w:fill="EAF3F8"/>
-          </w:tcPr>
-          <w:p>
-            <w:pPr>
-              <w:spacing w:before="40" w:after="40"/>
-            </w:pPr>
-            <w:r/>
-            <w:r>
-              <w:rPr>
-                <w:rFonts w:ascii="Segoe UI" w:hAnsi="Segoe UI"/>
-                <w:b/>
-                <w:color w:val="00407A"/>
-                <w:sz w:val="17"/>
-              </w:rPr>
-              <w:t>21,5 van de 48 werkdagen</w:t>
-            </w:r>
-          </w:p>
-        </w:tc>
-      </w:tr>
-    </w:tbl>
-    <w:p>
-      <w:pPr>
-        <w:spacing w:after="40"/>
-      </w:pPr>
-    </w:p>
     <w:p>
       <w:pPr>
         <w:spacing w:after="40"/>
@@ -6673,6 +5003,7 @@
           <w:sz w:val="22"/>
           <w:lang w:val="nl-BE"/>
         </w:rPr>
+        <w:lastRenderedPageBreak/>
         <w:t xml:space="preserve">7  </w:t>
       </w:r>
       <w:r>
@@ -6695,19 +5026,17 @@
       </w:pPr>
       <w:r>
         <w:rPr>
-          <w:rFonts w:ascii="Segoe UI" w:hAnsi="Segoe UI"/>
           <w:b/>
           <w:color w:val="FF7A00"/>
-          <w:sz w:val="19"/>
+          <w:lang w:val="nl-BE"/>
         </w:rPr>
         <w:t xml:space="preserve">1.  </w:t>
       </w:r>
       <w:r>
         <w:rPr>
-          <w:rFonts w:ascii="Segoe UI" w:hAnsi="Segoe UI"/>
           <w:b/>
           <w:color w:val="1B2630"/>
-          <w:sz w:val="19"/>
+          <w:lang w:val="nl-BE"/>
         </w:rPr>
         <w:t>De zes data van december en januari, met per centrum wie er die dag bij is.</w:t>
       </w:r>
@@ -6722,19 +5051,17 @@
       </w:pPr>
       <w:r>
         <w:rPr>
-          <w:rFonts w:ascii="Segoe UI" w:hAnsi="Segoe UI"/>
           <w:b/>
           <w:color w:val="FF7A00"/>
-          <w:sz w:val="19"/>
+          <w:lang w:val="nl-BE"/>
         </w:rPr>
         <w:t xml:space="preserve">2.  </w:t>
       </w:r>
       <w:r>
         <w:rPr>
-          <w:rFonts w:ascii="Segoe UI" w:hAnsi="Segoe UI"/>
           <w:b/>
           <w:color w:val="1B2630"/>
-          <w:sz w:val="19"/>
+          <w:lang w:val="nl-BE"/>
         </w:rPr>
         <w:t>Of Dobbels de twaalf gedragsdagen zelf geeft, of iemand opleidt voor gedragsdag 2.</w:t>
       </w:r>
@@ -6749,19 +5076,17 @@
       </w:pPr>
       <w:r>
         <w:rPr>
-          <w:rFonts w:ascii="Segoe UI" w:hAnsi="Segoe UI"/>
           <w:b/>
           <w:color w:val="FF7A00"/>
-          <w:sz w:val="19"/>
+          <w:lang w:val="nl-BE"/>
         </w:rPr>
         <w:t xml:space="preserve">3.  </w:t>
       </w:r>
       <w:r>
         <w:rPr>
-          <w:rFonts w:ascii="Segoe UI" w:hAnsi="Segoe UI"/>
           <w:b/>
           <w:color w:val="1B2630"/>
-          <w:sz w:val="19"/>
+          <w:lang w:val="nl-BE"/>
         </w:rPr>
         <w:t>Educatie online of ter plaatse.</w:t>
       </w:r>
@@ -6776,19 +5101,17 @@
       </w:pPr>
       <w:r>
         <w:rPr>
-          <w:rFonts w:ascii="Segoe UI" w:hAnsi="Segoe UI"/>
           <w:b/>
           <w:color w:val="FF7A00"/>
-          <w:sz w:val="19"/>
+          <w:lang w:val="nl-BE"/>
         </w:rPr>
         <w:t xml:space="preserve">4.  </w:t>
       </w:r>
       <w:r>
         <w:rPr>
-          <w:rFonts w:ascii="Segoe UI" w:hAnsi="Segoe UI"/>
           <w:b/>
           <w:color w:val="1B2630"/>
-          <w:sz w:val="19"/>
+          <w:lang w:val="nl-BE"/>
         </w:rPr>
         <w:t>Drie uur gedrag vóór de start en drie in april — of alle zes vooraf.</w:t>
       </w:r>
@@ -6803,46 +5126,25 @@
       </w:pPr>
       <w:r>
         <w:rPr>
-          <w:rFonts w:ascii="Segoe UI" w:hAnsi="Segoe UI"/>
           <w:b/>
           <w:color w:val="FF7A00"/>
-          <w:sz w:val="19"/>
+          <w:lang w:val="nl-BE"/>
         </w:rPr>
-        <w:t xml:space="preserve">5.  </w:t>
+        <w:t>5</w:t>
       </w:r>
       <w:r>
         <w:rPr>
-          <w:rFonts w:ascii="Segoe UI" w:hAnsi="Segoe UI"/>
           <w:b/>
-          <w:color w:val="1B2630"/>
-          <w:sz w:val="19"/>
-        </w:rPr>
-        <w:t>Wie de thema's geeft die Janou niet doet — voorstel: Deschamps theorie en randomisatie, Dobbels educatie en gedrag, Fobelets datacollectie (proces en GE evaluatie).</w:t>
-      </w:r>
-    </w:p>
-    <w:p>
-      <w:pPr>
-        <w:spacing w:after="80"/>
-        <w:ind w:left="280" w:hanging="280"/>
-        <w:rPr>
+          <w:color w:val="FF7A00"/>
           <w:lang w:val="nl-BE"/>
         </w:rPr>
-      </w:pPr>
-      <w:r>
-        <w:rPr>
-          <w:rFonts w:ascii="Segoe UI" w:hAnsi="Segoe UI"/>
-          <w:b/>
-          <w:color w:val="FF7A00"/>
-          <w:sz w:val="19"/>
-        </w:rPr>
-        <w:t xml:space="preserve">6.  </w:t>
+        <w:t xml:space="preserve">.  </w:t>
       </w:r>
       <w:r>
         <w:rPr>
-          <w:rFonts w:ascii="Segoe UI" w:hAnsi="Segoe UI"/>
           <w:b/>
           <w:color w:val="1B2630"/>
-          <w:sz w:val="19"/>
+          <w:lang w:val="nl-BE"/>
         </w:rPr>
         <w:t>Een plaatsvervanger voor technologie en droogloop, met naam.</w:t>
       </w:r>
@@ -6857,19 +5159,25 @@
       </w:pPr>
       <w:r>
         <w:rPr>
-          <w:rFonts w:ascii="Segoe UI" w:hAnsi="Segoe UI"/>
           <w:b/>
           <w:color w:val="FF7A00"/>
-          <w:sz w:val="19"/>
+          <w:lang w:val="nl-BE"/>
         </w:rPr>
-        <w:t xml:space="preserve">7.  </w:t>
+        <w:t>6</w:t>
       </w:r>
       <w:r>
         <w:rPr>
-          <w:rFonts w:ascii="Segoe UI" w:hAnsi="Segoe UI"/>
+          <w:b/>
+          <w:color w:val="FF7A00"/>
+          <w:lang w:val="nl-BE"/>
+        </w:rPr>
+        <w:t xml:space="preserve">.  </w:t>
+      </w:r>
+      <w:r>
+        <w:rPr>
           <w:b/>
           <w:color w:val="1B2630"/>
-          <w:sz w:val="19"/>
+          <w:lang w:val="nl-BE"/>
         </w:rPr>
         <w:t>Wat er gebeurt als een centrum op 1 februari niet klaar is: gefaseerde start of alles opschuiven.</w:t>
       </w:r>

</xml_diff>

<commit_message>
Opleidingsplanning: SEBIA-trainingen volgens Dobbels, podologen in twee groepen, knelpunten
Co-Authored-By: Claude Opus 5.5 <noreply@anthropic.com>
</commit_message>
<xml_diff>
--- a/PARADISE_opleidingsplanning.docx
+++ b/PARADISE_opleidingsplanning.docx
@@ -341,7 +341,7 @@
                 <w:color w:val="1B2630"/>
                 <w:sz w:val="17"/>
               </w:rPr>
-              <w:t>3 · Educatie</w:t>
+              <w:t>3 · SEBIA-training 1 en 2 — educatie geven, kennis en draagtijd terugkoppelen</w:t>
             </w:r>
           </w:p>
         </w:tc>
@@ -358,7 +358,7 @@
                 <w:color w:val="1B2630"/>
                 <w:sz w:val="17"/>
               </w:rPr>
-              <w:t>1,5 u</w:t>
+              <w:t>4 u (2 × 1,5 u, met pauzes)</w:t>
             </w:r>
           </w:p>
         </w:tc>
@@ -375,7 +375,7 @@
                 <w:color w:val="1B2630"/>
                 <w:sz w:val="17"/>
               </w:rPr>
-              <w:t>online</w:t>
+              <w:t>ter plaatse, centraal, twee groepen</w:t>
             </w:r>
           </w:p>
         </w:tc>
@@ -392,7 +392,7 @@
                 <w:color w:val="1B2630"/>
                 <w:sz w:val="17"/>
               </w:rPr>
-              <w:t>wie de educatie geeft</w:t>
+              <w:t>alle podologen</w:t>
             </w:r>
           </w:p>
         </w:tc>
@@ -415,7 +415,7 @@
                 <w:color w:val="1B2630"/>
                 <w:sz w:val="17"/>
               </w:rPr>
-              <w:t>4 · Gedragsbijsturing</w:t>
+              <w:t>4 · SEBIA-training 3 tot 6 — motiverende gespreksvoering, ondersteunende interventies, intervisie</w:t>
             </w:r>
           </w:p>
         </w:tc>
@@ -436,7 +436,7 @@
                 <w:sz w:val="17"/>
                 <w:lang w:val="nl-BE"/>
               </w:rPr>
-              <w:t>6 blokken van 1 u, drie per dag</w:t>
+              <w:t>4 u centraal; 1,5 u individueel; 1 u online</w:t>
             </w:r>
           </w:p>
         </w:tc>
@@ -457,7 +457,7 @@
                 <w:sz w:val="17"/>
                 <w:lang w:val="nl-BE"/>
               </w:rPr>
-              <w:t>ter plaatse, per centrum, twee dagen</w:t>
+              <w:t>centraal in twee groepen; in het centrum; online</w:t>
             </w:r>
           </w:p>
         </w:tc>
@@ -474,7 +474,7 @@
                 <w:color w:val="1B2630"/>
                 <w:sz w:val="17"/>
               </w:rPr>
-              <w:t>3 zorgverleners per centrum</w:t>
+              <w:t>alle podologen</w:t>
             </w:r>
           </w:p>
         </w:tc>
@@ -946,7 +946,7 @@
           <w:color w:val="00407A"/>
           <w:lang w:val="nl-BE"/>
         </w:rPr>
-        <w:t>November · theorie, toestemming en educatie, alles online</w:t>
+        <w:t>November · theorie en toestemming, alles online</w:t>
       </w:r>
     </w:p>
     <w:tbl>
@@ -1193,81 +1193,6 @@
                 <w:sz w:val="17"/>
               </w:rPr>
               <w:t>iedereen</w:t>
-            </w:r>
-          </w:p>
-        </w:tc>
-      </w:tr>
-      <w:tr>
-        <w:tc>
-          <w:tcPr>
-            <w:tcW w:w="1100" w:type="dxa"/>
-          </w:tcPr>
-          <w:p>
-            <w:pPr>
-              <w:spacing w:before="40" w:after="40"/>
-            </w:pPr>
-            <w:r>
-              <w:rPr>
-                <w:b/>
-                <w:color w:val="1B2630"/>
-                <w:sz w:val="17"/>
-              </w:rPr>
-              <w:t>wo 18 nov</w:t>
-            </w:r>
-          </w:p>
-        </w:tc>
-        <w:tc>
-          <w:tcPr>
-            <w:tcW w:w="4500" w:type="dxa"/>
-          </w:tcPr>
-          <w:p>
-            <w:pPr>
-              <w:spacing w:before="40" w:after="40"/>
-              <w:rPr>
-                <w:lang w:val="nl-BE"/>
-              </w:rPr>
-            </w:pPr>
-            <w:r>
-              <w:rPr>
-                <w:color w:val="1B2630"/>
-                <w:sz w:val="17"/>
-                <w:lang w:val="nl-BE"/>
-              </w:rPr>
-              <w:t>Educatie — boekje, folder, logboek, volgorde van de vragenlijsten</w:t>
-            </w:r>
-          </w:p>
-        </w:tc>
-        <w:tc>
-          <w:tcPr>
-            <w:tcW w:w="2000" w:type="dxa"/>
-          </w:tcPr>
-          <w:p>
-            <w:pPr>
-              <w:spacing w:before="40" w:after="40"/>
-            </w:pPr>
-            <w:r>
-              <w:rPr>
-                <w:color w:val="1B2630"/>
-                <w:sz w:val="17"/>
-              </w:rPr>
-              <w:t>online, 13u–14u30</w:t>
-            </w:r>
-          </w:p>
-        </w:tc>
-        <w:tc>
-          <w:tcPr>
-            <w:tcW w:w="2260" w:type="dxa"/>
-          </w:tcPr>
-          <w:p>
-            <w:pPr>
-              <w:spacing w:before="40" w:after="40"/>
-            </w:pPr>
-            <w:r>
-              <w:rPr>
-                <w:color w:val="1B2630"/>
-                <w:sz w:val="17"/>
-              </w:rPr>
-              <w:t>wie de educatie geeft</w:t>
             </w:r>
           </w:p>
         </w:tc>
@@ -1381,7 +1306,7 @@
           <w:color w:val="00407A"/>
           <w:lang w:val="nl-BE"/>
         </w:rPr>
-        <w:t>December · technologie per centrum, gedrag blok 1</w:t>
+        <w:t>December · technologie per centrum</w:t>
       </w:r>
     </w:p>
     <w:tbl>
@@ -1697,65 +1622,6 @@
                 <w:color w:val="1B2630"/>
                 <w:sz w:val="17"/>
               </w:rPr>
-              <w:lastRenderedPageBreak/>
-              <w:t>december</w:t>
-            </w:r>
-          </w:p>
-        </w:tc>
-        <w:tc>
-          <w:tcPr>
-            <w:tcW w:w="4700" w:type="dxa"/>
-          </w:tcPr>
-          <w:p>
-            <w:pPr>
-              <w:spacing w:before="40" w:after="40"/>
-              <w:rPr>
-                <w:lang w:val="nl-BE"/>
-              </w:rPr>
-            </w:pPr>
-            <w:r>
-              <w:rPr>
-                <w:color w:val="1B2630"/>
-                <w:sz w:val="17"/>
-                <w:lang w:val="nl-BE"/>
-              </w:rPr>
-              <w:t>Gedragsdag 1: blok 1 tot 3, drie uur per centrum — op een andere dag dan de technologiedag</w:t>
-            </w:r>
-          </w:p>
-        </w:tc>
-        <w:tc>
-          <w:tcPr>
-            <w:tcW w:w="4060" w:type="dxa"/>
-          </w:tcPr>
-          <w:p>
-            <w:pPr>
-              <w:spacing w:before="40" w:after="40"/>
-            </w:pPr>
-            <w:r>
-              <w:rPr>
-                <w:color w:val="1B2630"/>
-                <w:sz w:val="17"/>
-              </w:rPr>
-              <w:t>bij elk centrum</w:t>
-            </w:r>
-          </w:p>
-        </w:tc>
-      </w:tr>
-      <w:tr>
-        <w:tc>
-          <w:tcPr>
-            <w:tcW w:w="1100" w:type="dxa"/>
-          </w:tcPr>
-          <w:p>
-            <w:pPr>
-              <w:spacing w:before="40" w:after="40"/>
-            </w:pPr>
-            <w:r>
-              <w:rPr>
-                <w:b/>
-                <w:color w:val="1B2630"/>
-                <w:sz w:val="17"/>
-              </w:rPr>
               <w:t>vr 18 dec</w:t>
             </w:r>
           </w:p>
@@ -1821,7 +1687,7 @@
           <w:color w:val="00407A"/>
           <w:lang w:val="nl-BE"/>
         </w:rPr>
-        <w:t>Januari · vragenlijsten, dan de zes drooglopen</w:t>
+        <w:t>Januari · SEBIA 1 en 2, vragenlijsten, dan de zes drooglopen</w:t>
       </w:r>
     </w:p>
     <w:tbl>
@@ -1956,6 +1822,122 @@
                 <w:sz w:val="17"/>
               </w:rPr>
               <w:t>eigen centrum</w:t>
+            </w:r>
+          </w:p>
+        </w:tc>
+      </w:tr>
+      <w:tr>
+        <w:tc>
+          <w:tcPr>
+            <w:tcW w:w="1500" w:type="dxa"/>
+          </w:tcPr>
+          <w:p>
+            <w:pPr>
+              <w:spacing w:before="40" w:after="40"/>
+            </w:pPr>
+            <w:r>
+              <w:rPr>
+                <w:b/>
+                <w:color w:val="1B2630"/>
+                <w:sz w:val="17"/>
+              </w:rPr>
+              <w:t>di 5 jan</w:t>
+            </w:r>
+          </w:p>
+        </w:tc>
+        <w:tc>
+          <w:tcPr>
+            <w:tcW w:w="4900" w:type="dxa"/>
+          </w:tcPr>
+          <w:p>
+            <w:pPr>
+              <w:spacing w:before="40" w:after="40"/>
+              <w:rPr>
+                <w:lang w:val="nl-BE"/>
+              </w:rPr>
+            </w:pPr>
+            <w:r>
+              <w:rPr>
+                <w:color w:val="1B2630"/>
+                <w:sz w:val="17"/>
+                <w:lang w:val="nl-BE"/>
+              </w:rPr>
+              <w:t>SEBIA-training 1 en 2, groep Oost (Antwerpen, Leuven, Aalst), 9u–13u</w:t>
+            </w:r>
+          </w:p>
+        </w:tc>
+        <w:tc>
+          <w:tcPr>
+            <w:tcW w:w="3460" w:type="dxa"/>
+          </w:tcPr>
+          <w:p>
+            <w:pPr>
+              <w:spacing w:before="40" w:after="40"/>
+            </w:pPr>
+            <w:r>
+              <w:rPr>
+                <w:color w:val="1B2630"/>
+                <w:sz w:val="17"/>
+              </w:rPr>
+              <w:t>centraal, voorstel Leuven</w:t>
+            </w:r>
+          </w:p>
+        </w:tc>
+      </w:tr>
+      <w:tr>
+        <w:tc>
+          <w:tcPr>
+            <w:tcW w:w="1500" w:type="dxa"/>
+          </w:tcPr>
+          <w:p>
+            <w:pPr>
+              <w:spacing w:before="40" w:after="40"/>
+            </w:pPr>
+            <w:r>
+              <w:rPr>
+                <w:b/>
+                <w:color w:val="1B2630"/>
+                <w:sz w:val="17"/>
+              </w:rPr>
+              <w:t>vr 8 jan</w:t>
+            </w:r>
+          </w:p>
+        </w:tc>
+        <w:tc>
+          <w:tcPr>
+            <w:tcW w:w="4900" w:type="dxa"/>
+          </w:tcPr>
+          <w:p>
+            <w:pPr>
+              <w:spacing w:before="40" w:after="40"/>
+              <w:rPr>
+                <w:lang w:val="nl-BE"/>
+              </w:rPr>
+            </w:pPr>
+            <w:r>
+              <w:rPr>
+                <w:color w:val="1B2630"/>
+                <w:sz w:val="17"/>
+                <w:lang w:val="nl-BE"/>
+              </w:rPr>
+              <w:t>SEBIA-training 1 en 2, groep West (Brugge, Kortrijk, Gent), 13u–17u; alternatief do 7 jan, 8u30–12u30</w:t>
+            </w:r>
+          </w:p>
+        </w:tc>
+        <w:tc>
+          <w:tcPr>
+            <w:tcW w:w="3460" w:type="dxa"/>
+          </w:tcPr>
+          <w:p>
+            <w:pPr>
+              <w:spacing w:before="40" w:after="40"/>
+            </w:pPr>
+            <w:r>
+              <w:rPr>
+                <w:color w:val="1B2630"/>
+                <w:sz w:val="17"/>
+              </w:rPr>
+              <w:t>centraal, voorstel Gent</w:t>
             </w:r>
           </w:p>
         </w:tc>
@@ -2695,7 +2677,7 @@
           <w:b/>
           <w:color w:val="00407A"/>
         </w:rPr>
-        <w:t>2027 · de tweede gedragsdag</w:t>
+        <w:t>Maart 2027 en later · SEBIA 3 tot 6</w:t>
       </w:r>
     </w:p>
     <w:tbl>
@@ -2771,7 +2753,7 @@
                 <w:color w:val="1B2630"/>
                 <w:sz w:val="17"/>
               </w:rPr>
-              <w:t>april 2027</w:t>
+              <w:t>di 2 mrt</w:t>
             </w:r>
           </w:p>
         </w:tc>
@@ -2792,31 +2774,130 @@
                 <w:sz w:val="17"/>
                 <w:lang w:val="nl-BE"/>
               </w:rPr>
-              <w:t>Gedragsdag 2: blok 4 tot 6, drie uur per centrum</w:t>
-            </w:r>
-            <w:r>
-              <w:rPr>
-                <w:color w:val="1B2630"/>
-                <w:sz w:val="17"/>
+              <w:t>SEBIA-training 3 en 4, groep Oost, 9u–13u — data nog te bevestigen door Dobbels</w:t>
+            </w:r>
+          </w:p>
+        </w:tc>
+      </w:tr>
+      <w:tr>
+        <w:tc>
+          <w:tcPr>
+            <w:tcW w:w="1700" w:type="dxa"/>
+          </w:tcPr>
+          <w:p>
+            <w:pPr>
+              <w:spacing w:before="40" w:after="40"/>
+            </w:pPr>
+            <w:r>
+              <w:rPr>
+                <w:b/>
+                <w:color w:val="1B2630"/>
+                <w:sz w:val="17"/>
+              </w:rPr>
+              <w:t>vr 5 mrt</w:t>
+            </w:r>
+          </w:p>
+        </w:tc>
+        <w:tc>
+          <w:tcPr>
+            <w:tcW w:w="8160" w:type="dxa"/>
+          </w:tcPr>
+          <w:p>
+            <w:pPr>
+              <w:spacing w:before="40" w:after="40"/>
+              <w:rPr>
                 <w:lang w:val="nl-BE"/>
               </w:rPr>
-              <w:t xml:space="preserve">, stap 3 en 4, en de fideliteitsterugkoppeling. </w:t>
-            </w:r>
+            </w:pPr>
             <w:r>
               <w:rPr>
                 <w:color w:val="1B2630"/>
                 <w:sz w:val="17"/>
                 <w:lang w:val="nl-BE"/>
               </w:rPr>
-              <w:t xml:space="preserve">Enkele </w:t>
-            </w:r>
-            <w:r>
-              <w:rPr>
-                <w:color w:val="1B2630"/>
-                <w:sz w:val="17"/>
+              <w:t>SEBIA-training 3 en 4, groep West, 13u–17u — data nog te bevestigen door Dobbels</w:t>
+            </w:r>
+          </w:p>
+        </w:tc>
+      </w:tr>
+      <w:tr>
+        <w:tc>
+          <w:tcPr>
+            <w:tcW w:w="1700" w:type="dxa"/>
+          </w:tcPr>
+          <w:p>
+            <w:pPr>
+              <w:spacing w:before="40" w:after="40"/>
+            </w:pPr>
+            <w:r>
+              <w:rPr>
+                <w:b/>
+                <w:color w:val="1B2630"/>
+                <w:sz w:val="17"/>
+              </w:rPr>
+              <w:t>mrt–apr</w:t>
+            </w:r>
+          </w:p>
+        </w:tc>
+        <w:tc>
+          <w:tcPr>
+            <w:tcW w:w="8160" w:type="dxa"/>
+          </w:tcPr>
+          <w:p>
+            <w:pPr>
+              <w:spacing w:before="40" w:after="40"/>
+              <w:rPr>
                 <w:lang w:val="nl-BE"/>
               </w:rPr>
-              <w:t>dagen, vóór de eerste maand 3-visites</w:t>
+            </w:pPr>
+            <w:r>
+              <w:rPr>
+                <w:color w:val="1B2630"/>
+                <w:sz w:val="17"/>
+                <w:lang w:val="nl-BE"/>
+              </w:rPr>
+              <w:t>SEBIA-training 5, 1,5 u per podoloog in het eigen centrum, vóór de eerste maand 3-visite. Beste moment: Kortrijk wo, Brugge ma VM, Gent do VM, Leuven di, Antwerpen di of wo VM, Aalst di</w:t>
+            </w:r>
+          </w:p>
+        </w:tc>
+      </w:tr>
+      <w:tr>
+        <w:tc>
+          <w:tcPr>
+            <w:tcW w:w="1700" w:type="dxa"/>
+          </w:tcPr>
+          <w:p>
+            <w:pPr>
+              <w:spacing w:before="40" w:after="40"/>
+            </w:pPr>
+            <w:r>
+              <w:rPr>
+                <w:b/>
+                <w:color w:val="1B2630"/>
+                <w:sz w:val="17"/>
+              </w:rPr>
+              <w:t>maand 6–9</w:t>
+            </w:r>
+          </w:p>
+        </w:tc>
+        <w:tc>
+          <w:tcPr>
+            <w:tcW w:w="8160" w:type="dxa"/>
+          </w:tcPr>
+          <w:p>
+            <w:pPr>
+              <w:spacing w:before="40" w:after="40"/>
+              <w:rPr>
+                <w:lang w:val="nl-BE"/>
+              </w:rPr>
+            </w:pPr>
+            <w:r>
+              <w:rPr>
+                <w:color w:val="1B2630"/>
+                <w:sz w:val="17"/>
+                <w:lang w:val="nl-BE"/>
+              </w:rPr>
+              <w:t>SEBIA-training 6, intervisie, online, 1 u per podoloog, na de start van de inclusies</w:t>
             </w:r>
           </w:p>
         </w:tc>
@@ -3790,6 +3871,68 @@
                 <w:color w:val="1B2630"/>
                 <w:sz w:val="17"/>
               </w:rPr>
+              <w:t>vr 18 dec</w:t>
+            </w:r>
+          </w:p>
+        </w:tc>
+        <w:tc>
+          <w:tcPr>
+            <w:tcW w:w="4200" w:type="dxa"/>
+          </w:tcPr>
+          <w:p>
+            <w:pPr>
+              <w:spacing w:before="40" w:after="40"/>
+              <w:rPr>
+                <w:lang w:val="nl-BE"/>
+              </w:rPr>
+            </w:pPr>
+            <w:r>
+              <w:rPr>
+                <w:color w:val="1B2630"/>
+                <w:sz w:val="17"/>
+                <w:lang w:val="nl-BE"/>
+              </w:rPr>
+              <w:t>Voor SEBIA 1 en 2: beknopt overzicht voetzorg en zolen/schoenen met foto's, termen in de scripts, printout van de sensor, kaartjes per sessie, demonstratiepakket voetzorg</w:t>
+            </w:r>
+          </w:p>
+        </w:tc>
+        <w:tc>
+          <w:tcPr>
+            <w:tcW w:w="4060" w:type="dxa"/>
+          </w:tcPr>
+          <w:p>
+            <w:pPr>
+              <w:spacing w:before="40" w:after="40"/>
+              <w:rPr>
+                <w:lang w:val="nl-BE"/>
+              </w:rPr>
+            </w:pPr>
+            <w:r>
+              <w:rPr>
+                <w:color w:val="1B2630"/>
+                <w:sz w:val="17"/>
+                <w:lang w:val="nl-BE"/>
+              </w:rPr>
+              <w:t>SEBIA-training 1 en 2 in januari</w:t>
+            </w:r>
+          </w:p>
+        </w:tc>
+      </w:tr>
+      <w:tr>
+        <w:tc>
+          <w:tcPr>
+            <w:tcW w:w="1600" w:type="dxa"/>
+          </w:tcPr>
+          <w:p>
+            <w:pPr>
+              <w:spacing w:before="40" w:after="40"/>
+            </w:pPr>
+            <w:r>
+              <w:rPr>
+                <w:b/>
+                <w:color w:val="1B2630"/>
+                <w:sz w:val="17"/>
+              </w:rPr>
               <w:t>december</w:t>
             </w:r>
           </w:p>
@@ -3832,7 +3975,7 @@
                 <w:sz w:val="17"/>
                 <w:lang w:val="nl-BE"/>
               </w:rPr>
-              <w:t>gedragsdag 2 van april en de fideliteitsmeting</w:t>
+              <w:t>SEBIA-training 6 en de fideliteitsmeting</w:t>
             </w:r>
           </w:p>
         </w:tc>
@@ -4163,7 +4306,7 @@
                 <w:sz w:val="17"/>
                 <w:lang w:val="nl-BE"/>
               </w:rPr>
-              <w:t>3 u theorie, 1,5 u toestemming, 1,5 u educatie, 2 u technologie, 3 u gedrag, 3 u vragenlijsten, 4,5 u droogloop — samen 18,5 u vóór de start, plus 3 u in april</w:t>
+              <w:t>3 u theorie, 1,5 u toestemming, 2 u technologie, 4 u SEBIA 1 en 2, 3 u vragenlijsten, 4,5 u droogloop — samen 18 u vóór de piloot; daarna 4 u SEBIA 3 en 4, 1,5 u SEBIA 5 en 1 u SEBIA 6</w:t>
             </w:r>
           </w:p>
         </w:tc>
@@ -4180,7 +4323,7 @@
                 <w:color w:val="1B2630"/>
                 <w:sz w:val="17"/>
               </w:rPr>
-              <w:t>geen</w:t>
+              <w:t>twee keer naar een centrale locatie</w:t>
             </w:r>
           </w:p>
         </w:tc>
@@ -4292,7 +4435,7 @@
                 <w:sz w:val="17"/>
                 <w:lang w:val="nl-BE"/>
               </w:rPr>
-              <w:t>Janou achttien sitebezoeken, Dobbels twaalf reisdagen — zes per gedragsdag</w:t>
+              <w:t>Janou achttien sitebezoeken; Dobbels vier centrale sessies en SEBIA 5 in de zes centra</w:t>
             </w:r>
           </w:p>
         </w:tc>
@@ -4560,7 +4703,7 @@
                 <w:color w:val="1B2630"/>
                 <w:sz w:val="17"/>
               </w:rPr>
-              <w:t>Educatie</w:t>
+              <w:t>SEBIA-training 1 en 2, twee groepen</w:t>
             </w:r>
           </w:p>
         </w:tc>
@@ -4577,7 +4720,7 @@
                 <w:color w:val="1B2630"/>
                 <w:sz w:val="17"/>
               </w:rPr>
-              <w:t>Dobbels</w:t>
+              <w:t>Dobbels, met Janou</w:t>
             </w:r>
           </w:p>
         </w:tc>
@@ -4594,7 +4737,7 @@
                 <w:color w:val="1B2630"/>
                 <w:sz w:val="17"/>
               </w:rPr>
-              <w:t>1,5 u</w:t>
+              <w:t>8 u</w:t>
             </w:r>
           </w:p>
         </w:tc>
@@ -4614,7 +4757,7 @@
                 <w:color w:val="1B2630"/>
                 <w:sz w:val="17"/>
               </w:rPr>
-              <w:t>Gedragsdag 1, zes centra</w:t>
+              <w:t>Technologie, zes centra</w:t>
             </w:r>
           </w:p>
         </w:tc>
@@ -4631,7 +4774,7 @@
                 <w:color w:val="1B2630"/>
                 <w:sz w:val="17"/>
               </w:rPr>
-              <w:t xml:space="preserve">Dobbels, met Janou </w:t>
+              <w:t>Janou</w:t>
             </w:r>
           </w:p>
         </w:tc>
@@ -4648,7 +4791,7 @@
                 <w:color w:val="1B2630"/>
                 <w:sz w:val="17"/>
               </w:rPr>
-              <w:t>18 u</w:t>
+              <w:t>12 u</w:t>
             </w:r>
           </w:p>
         </w:tc>
@@ -4668,7 +4811,7 @@
                 <w:color w:val="1B2630"/>
                 <w:sz w:val="17"/>
               </w:rPr>
-              <w:t>Technologie, zes centra</w:t>
+              <w:t>Softwarevoorbereiding, zes centra</w:t>
             </w:r>
           </w:p>
         </w:tc>
@@ -4702,7 +4845,7 @@
                 <w:color w:val="1B2630"/>
                 <w:sz w:val="17"/>
               </w:rPr>
-              <w:t>12 u</w:t>
+              <w:t>3 u</w:t>
             </w:r>
           </w:p>
         </w:tc>
@@ -4722,7 +4865,7 @@
                 <w:color w:val="1B2630"/>
                 <w:sz w:val="17"/>
               </w:rPr>
-              <w:t>Softwarevoorbereiding, zes centra</w:t>
+              <w:t>Datacollectie en vragenlijsten</w:t>
             </w:r>
           </w:p>
         </w:tc>
@@ -4739,7 +4882,7 @@
                 <w:color w:val="1B2630"/>
                 <w:sz w:val="17"/>
               </w:rPr>
-              <w:t>Janou</w:t>
+              <w:t>Fobelets, met het studieteam</w:t>
             </w:r>
           </w:p>
         </w:tc>
@@ -4756,7 +4899,7 @@
                 <w:color w:val="1B2630"/>
                 <w:sz w:val="17"/>
               </w:rPr>
-              <w:t>3 u</w:t>
+              <w:t>2 u</w:t>
             </w:r>
           </w:p>
         </w:tc>
@@ -4769,14 +4912,18 @@
           <w:p>
             <w:pPr>
               <w:spacing w:before="40" w:after="40"/>
+              <w:rPr>
+                <w:lang w:val="nl-BE"/>
+              </w:rPr>
             </w:pPr>
             <w:r>
               <w:rPr>
                 <w:b/>
                 <w:color w:val="1B2630"/>
                 <w:sz w:val="17"/>
-              </w:rPr>
-              <w:t>Datacollectie en vragenlijsten</w:t>
+                <w:lang w:val="nl-BE"/>
+              </w:rPr>
+              <w:t>Droogloop met debriefing, zes centra</w:t>
             </w:r>
           </w:p>
         </w:tc>
@@ -4793,7 +4940,7 @@
                 <w:color w:val="1B2630"/>
                 <w:sz w:val="17"/>
               </w:rPr>
-              <w:t>Fobelets, met het studieteam</w:t>
+              <w:t>Janou</w:t>
             </w:r>
           </w:p>
         </w:tc>
@@ -4810,7 +4957,7 @@
                 <w:color w:val="1B2630"/>
                 <w:sz w:val="17"/>
               </w:rPr>
-              <w:t>2 u</w:t>
+              <w:t>27 u</w:t>
             </w:r>
           </w:p>
         </w:tc>
@@ -4819,56 +4966,55 @@
         <w:tc>
           <w:tcPr>
             <w:tcW w:w="3400" w:type="dxa"/>
-          </w:tcPr>
-          <w:p>
-            <w:pPr>
-              <w:spacing w:before="40" w:after="40"/>
-              <w:rPr>
-                <w:lang w:val="nl-BE"/>
-              </w:rPr>
+            <w:shd w:val="clear" w:color="auto" w:fill="EAF3F8"/>
+          </w:tcPr>
+          <w:p>
+            <w:pPr>
+              <w:spacing w:before="40" w:after="40"/>
             </w:pPr>
             <w:r>
               <w:rPr>
                 <w:b/>
                 <w:color w:val="1B2630"/>
                 <w:sz w:val="17"/>
-                <w:lang w:val="nl-BE"/>
-              </w:rPr>
-              <w:t>Droogloop met debriefing, zes centra</w:t>
+              </w:rPr>
+              <w:t>SEBIA-training 3 tot 6, na de piloot</w:t>
             </w:r>
           </w:p>
         </w:tc>
         <w:tc>
           <w:tcPr>
             <w:tcW w:w="3600" w:type="dxa"/>
-          </w:tcPr>
-          <w:p>
-            <w:pPr>
-              <w:spacing w:before="40" w:after="40"/>
-            </w:pPr>
-            <w:r>
-              <w:rPr>
-                <w:color w:val="1B2630"/>
-                <w:sz w:val="17"/>
-              </w:rPr>
-              <w:t>Janou</w:t>
+            <w:shd w:val="clear" w:color="auto" w:fill="EAF3F8"/>
+          </w:tcPr>
+          <w:p>
+            <w:pPr>
+              <w:spacing w:before="40" w:after="40"/>
+            </w:pPr>
+            <w:r>
+              <w:rPr>
+                <w:color w:val="1B2630"/>
+                <w:sz w:val="17"/>
+              </w:rPr>
+              <w:t>Dobbels, met Janou</w:t>
             </w:r>
           </w:p>
         </w:tc>
         <w:tc>
           <w:tcPr>
             <w:tcW w:w="2860" w:type="dxa"/>
-          </w:tcPr>
-          <w:p>
-            <w:pPr>
-              <w:spacing w:before="40" w:after="40"/>
-            </w:pPr>
-            <w:r>
-              <w:rPr>
-                <w:color w:val="1B2630"/>
-                <w:sz w:val="17"/>
-              </w:rPr>
-              <w:t>27 u</w:t>
+            <w:shd w:val="clear" w:color="auto" w:fill="EAF3F8"/>
+          </w:tcPr>
+          <w:p>
+            <w:pPr>
+              <w:spacing w:before="40" w:after="40"/>
+            </w:pPr>
+            <w:r>
+              <w:rPr>
+                <w:color w:val="1B2630"/>
+                <w:sz w:val="17"/>
+              </w:rPr>
+              <w:t>8 u centraal, 2,5 u per podoloog</w:t>
             </w:r>
           </w:p>
         </w:tc>
@@ -4886,10 +5032,10 @@
             <w:r>
               <w:rPr>
                 <w:b/>
-                <w:color w:val="1B2630"/>
-                <w:sz w:val="17"/>
-              </w:rPr>
-              <w:t>Gedragsdag 2, in april 2027</w:t>
+                <w:color w:val="00407A"/>
+                <w:sz w:val="17"/>
+              </w:rPr>
+              <w:t>Totaal vóór de start</w:t>
             </w:r>
           </w:p>
         </w:tc>
@@ -4902,13 +5048,6 @@
             <w:pPr>
               <w:spacing w:before="40" w:after="40"/>
             </w:pPr>
-            <w:r>
-              <w:rPr>
-                <w:color w:val="1B2630"/>
-                <w:sz w:val="17"/>
-              </w:rPr>
-              <w:t xml:space="preserve">Dobbels, met Janou </w:t>
-            </w:r>
           </w:p>
         </w:tc>
         <w:tc>
@@ -4925,57 +5064,7 @@
                 <w:color w:val="1B2630"/>
                 <w:sz w:val="17"/>
               </w:rPr>
-              <w:t>18 u</w:t>
-            </w:r>
-          </w:p>
-        </w:tc>
-      </w:tr>
-      <w:tr>
-        <w:tc>
-          <w:tcPr>
-            <w:tcW w:w="3400" w:type="dxa"/>
-            <w:shd w:val="clear" w:color="auto" w:fill="EAF3F8"/>
-          </w:tcPr>
-          <w:p>
-            <w:pPr>
-              <w:spacing w:before="40" w:after="40"/>
-            </w:pPr>
-            <w:r>
-              <w:rPr>
-                <w:b/>
-                <w:color w:val="00407A"/>
-                <w:sz w:val="17"/>
-              </w:rPr>
-              <w:t>Totaal vóór de start</w:t>
-            </w:r>
-          </w:p>
-        </w:tc>
-        <w:tc>
-          <w:tcPr>
-            <w:tcW w:w="3600" w:type="dxa"/>
-            <w:shd w:val="clear" w:color="auto" w:fill="EAF3F8"/>
-          </w:tcPr>
-          <w:p>
-            <w:pPr>
-              <w:spacing w:before="40" w:after="40"/>
-            </w:pPr>
-          </w:p>
-        </w:tc>
-        <w:tc>
-          <w:tcPr>
-            <w:tcW w:w="2860" w:type="dxa"/>
-            <w:shd w:val="clear" w:color="auto" w:fill="EAF3F8"/>
-          </w:tcPr>
-          <w:p>
-            <w:pPr>
-              <w:spacing w:before="40" w:after="40"/>
-            </w:pPr>
-            <w:r>
-              <w:rPr>
-                <w:color w:val="1B2630"/>
-                <w:sz w:val="17"/>
-              </w:rPr>
-              <w:t>68 u</w:t>
+              <w:t>56,5 u</w:t>
             </w:r>
           </w:p>
         </w:tc>
@@ -5063,7 +5152,7 @@
           <w:color w:val="1B2630"/>
           <w:lang w:val="nl-BE"/>
         </w:rPr>
-        <w:t>Of Dobbels de twaalf gedragsdagen zelf geeft, of iemand opleidt voor gedragsdag 2.</w:t>
+        <w:t>Datum, uur en locatie van SEBIA 1 en 2 per groep, via een doodle met de podologen.</w:t>
       </w:r>
     </w:p>
     <w:p>
@@ -5088,7 +5177,7 @@
           <w:color w:val="1B2630"/>
           <w:lang w:val="nl-BE"/>
         </w:rPr>
-        <w:t>Educatie online of ter plaatse.</w:t>
+        <w:t>Welk SEBIA-schema geldt: dat van Dobbels en het script (eCRF 17), of dat van het manuscript. Daarna manuscript en REDCap gelijkzetten (knelpunt 8).</w:t>
       </w:r>
     </w:p>
     <w:p>
@@ -5113,7 +5202,7 @@
           <w:color w:val="1B2630"/>
           <w:lang w:val="nl-BE"/>
         </w:rPr>
-        <w:t>Drie uur gedrag vóór de start en drie in april — of alle zes vooraf.</w:t>
+        <w:t>MOS-revised (eCRF 13) ook op maand 3 en 18 afnemen, zoals Dobbels en eCRF 17 vragen; dan REDCap aanpassen, want daar staat eCRF 13 alleen op visite 1.</w:t>
       </w:r>
     </w:p>
     <w:p>
@@ -5180,6 +5269,282 @@
           <w:lang w:val="nl-BE"/>
         </w:rPr>
         <w:t>Wat er gebeurt als een centrum op 1 februari niet klaar is: gefaseerde start of alles opschuiven.</w:t>
+      </w:r>
+    </w:p>
+    <w:p>
+      <w:pPr>
+        <w:spacing w:before="300" w:after="100"/>
+        <w:rPr>
+          <w:lang w:val="nl-BE"/>
+        </w:rPr>
+      </w:pPr>
+      <w:r>
+        <w:rPr>
+          <w:b/>
+          <w:color w:val="FF7A00"/>
+          <w:sz w:val="22"/>
+          <w:lang w:val="nl-BE"/>
+        </w:rPr>
+        <w:t xml:space="preserve">8  </w:t>
+      </w:r>
+      <w:r>
+        <w:rPr>
+          <w:b/>
+          <w:color w:val="00407A"/>
+          <w:sz w:val="22"/>
+          <w:lang w:val="nl-BE"/>
+        </w:rPr>
+        <w:t>Knelpunten</w:t>
+      </w:r>
+    </w:p>
+    <w:p>
+      <w:pPr>
+        <w:spacing w:after="80"/>
+        <w:ind w:left="280" w:hanging="280"/>
+        <w:rPr>
+          <w:lang w:val="nl-BE"/>
+        </w:rPr>
+      </w:pPr>
+      <w:r>
+        <w:rPr>
+          <w:b/>
+          <w:color w:val="FF7A00"/>
+          <w:lang w:val="nl-BE"/>
+        </w:rPr>
+        <w:t xml:space="preserve">1.  </w:t>
+      </w:r>
+      <w:r>
+        <w:rPr>
+          <w:b w:val="0"/>
+          <w:color w:val="1B2630"/>
+          <w:lang w:val="nl-BE"/>
+        </w:rPr>
+        <w:t>Eén sessie voor alle zes podologen lukt niet: er is geen weekdag waarop iedereen kan. Gent kan alleen do VM of vr NM, Leuven niet op ma en do, Antwerpen en Aalst niet op vr. Daarom twee groepen.</w:t>
+      </w:r>
+    </w:p>
+    <w:p>
+      <w:pPr>
+        <w:spacing w:after="80"/>
+        <w:ind w:left="280" w:hanging="280"/>
+        <w:rPr>
+          <w:lang w:val="nl-BE"/>
+        </w:rPr>
+      </w:pPr>
+      <w:r>
+        <w:rPr>
+          <w:b/>
+          <w:color w:val="FF7A00"/>
+          <w:lang w:val="nl-BE"/>
+        </w:rPr>
+        <w:t xml:space="preserve">2.  </w:t>
+      </w:r>
+      <w:r>
+        <w:rPr>
+          <w:b w:val="0"/>
+          <w:color w:val="1B2630"/>
+          <w:lang w:val="nl-BE"/>
+        </w:rPr>
+        <w:t>Groep West hangt aan Gent: alleen vr 8 jan NM of do 7 jan VM, en beide zijn reservedata van Dobbels. Op do begint de voetkliniek van Gent om 13u. Kortrijk en Brugge werken die dagen niet in het ziekenhuis: bevestigen.</w:t>
+      </w:r>
+    </w:p>
+    <w:p>
+      <w:pPr>
+        <w:spacing w:after="80"/>
+        <w:ind w:left="280" w:hanging="280"/>
+        <w:rPr>
+          <w:lang w:val="nl-BE"/>
+        </w:rPr>
+      </w:pPr>
+      <w:r>
+        <w:rPr>
+          <w:b/>
+          <w:color w:val="FF7A00"/>
+          <w:lang w:val="nl-BE"/>
+        </w:rPr>
+        <w:t xml:space="preserve">3.  </w:t>
+      </w:r>
+      <w:r>
+        <w:rPr>
+          <w:b w:val="0"/>
+          <w:color w:val="1B2630"/>
+          <w:lang w:val="nl-BE"/>
+        </w:rPr>
+        <w:t>Groep Oost kan op di 5 jan. Di 12 jan niet (datacollectie 13u–15u), vr 15 jan niet (droogloop Kortrijk).</w:t>
+      </w:r>
+    </w:p>
+    <w:p>
+      <w:pPr>
+        <w:spacing w:after="80"/>
+        <w:ind w:left="280" w:hanging="280"/>
+        <w:rPr>
+          <w:lang w:val="nl-BE"/>
+        </w:rPr>
+      </w:pPr>
+      <w:r>
+        <w:rPr>
+          <w:b/>
+          <w:color w:val="FF7A00"/>
+          <w:lang w:val="nl-BE"/>
+        </w:rPr>
+        <w:t xml:space="preserve">4.  </w:t>
+      </w:r>
+      <w:r>
+        <w:rPr>
+          <w:b w:val="0"/>
+          <w:color w:val="1B2630"/>
+          <w:lang w:val="nl-BE"/>
+        </w:rPr>
+        <w:t>Onvolledig: UZ Gent en UZ Leuven gaven geen beste moment op; de tweede podoloog van Sint-Jan, UZ Leuven, UZA en Azorg heeft nog geen bevestigde naam; AZ Groeninge heeft wellicht maar één podoloog, dus geen vervanger.</w:t>
+      </w:r>
+    </w:p>
+    <w:p>
+      <w:pPr>
+        <w:spacing w:after="80"/>
+        <w:ind w:left="280" w:hanging="280"/>
+        <w:rPr>
+          <w:lang w:val="nl-BE"/>
+        </w:rPr>
+      </w:pPr>
+      <w:r>
+        <w:rPr>
+          <w:b/>
+          <w:color w:val="FF7A00"/>
+          <w:lang w:val="nl-BE"/>
+        </w:rPr>
+        <w:t xml:space="preserve">5.  </w:t>
+      </w:r>
+      <w:r>
+        <w:rPr>
+          <w:b w:val="0"/>
+          <w:color w:val="1B2630"/>
+          <w:lang w:val="nl-BE"/>
+        </w:rPr>
+        <w:t>Podologen verplaatsen zich nu twee keer naar een centrale locatie; in het vorige voorstel was dat nooit.</w:t>
+      </w:r>
+    </w:p>
+    <w:p>
+      <w:pPr>
+        <w:spacing w:after="80"/>
+        <w:ind w:left="280" w:hanging="280"/>
+        <w:rPr>
+          <w:lang w:val="nl-BE"/>
+        </w:rPr>
+      </w:pPr>
+      <w:r>
+        <w:rPr>
+          <w:b/>
+          <w:color w:val="FF7A00"/>
+          <w:lang w:val="nl-BE"/>
+        </w:rPr>
+        <w:t xml:space="preserve">6.  </w:t>
+      </w:r>
+      <w:r>
+        <w:rPr>
+          <w:b w:val="0"/>
+          <w:color w:val="1B2630"/>
+          <w:lang w:val="nl-BE"/>
+        </w:rPr>
+        <w:t>Piloot (1–19 feb) en droogloop van de kwartaalvisites vallen vóór SEBIA 3 en 4: de ondersteunende interventies zijn dan nog niet aangeleerd. Dobbels noemt dit zelf.</w:t>
+      </w:r>
+    </w:p>
+    <w:p>
+      <w:pPr>
+        <w:spacing w:after="80"/>
+        <w:ind w:left="280" w:hanging="280"/>
+        <w:rPr>
+          <w:lang w:val="nl-BE"/>
+        </w:rPr>
+      </w:pPr>
+      <w:r>
+        <w:rPr>
+          <w:b/>
+          <w:color w:val="FF7A00"/>
+          <w:lang w:val="nl-BE"/>
+        </w:rPr>
+        <w:t xml:space="preserve">7.  </w:t>
+      </w:r>
+      <w:r>
+        <w:rPr>
+          <w:b w:val="0"/>
+          <w:color w:val="1B2630"/>
+          <w:lang w:val="nl-BE"/>
+        </w:rPr>
+        <w:t>Alleen podologen worden getraind. Volgens het manuscript leveren ook verpleegkundigen en artsen SEBIA.</w:t>
+      </w:r>
+    </w:p>
+    <w:p>
+      <w:pPr>
+        <w:spacing w:after="80"/>
+        <w:ind w:left="280" w:hanging="280"/>
+        <w:rPr>
+          <w:lang w:val="nl-BE"/>
+        </w:rPr>
+      </w:pPr>
+      <w:r>
+        <w:rPr>
+          <w:b/>
+          <w:color w:val="FF7A00"/>
+          <w:lang w:val="nl-BE"/>
+        </w:rPr>
+        <w:t xml:space="preserve">8.  </w:t>
+      </w:r>
+      <w:r>
+        <w:rPr>
+          <w:b w:val="0"/>
+          <w:color w:val="1B2630"/>
+          <w:lang w:val="nl-BE"/>
+        </w:rPr>
+        <w:t>Het schema van Dobbels (dia 3) volgt het SEBIA-script (eCRF 17), maar niet het manuscript en REDCap. Demonstratie voetzorg op maand 6 en 12 (manuscript: maand 9 en 15). NAFF op visite 1 en 2, maand 6, 12 en 18 (REDCap: alleen visite 1; manuscript: baseline, 3, 9 en 15). MOS-revised is eCRF 13, de twee VAS-schalen zijn eCRF 31. Haar vraag over contact op D14–M1: dat is visite 2 (eCRF 28 en 29).</w:t>
+      </w:r>
+    </w:p>
+    <w:p>
+      <w:pPr>
+        <w:spacing w:after="80"/>
+        <w:ind w:left="280" w:hanging="280"/>
+        <w:rPr>
+          <w:lang w:val="nl-BE"/>
+        </w:rPr>
+      </w:pPr>
+      <w:r>
+        <w:rPr>
+          <w:b/>
+          <w:color w:val="FF7A00"/>
+          <w:lang w:val="nl-BE"/>
+        </w:rPr>
+        <w:t xml:space="preserve">9.  </w:t>
+      </w:r>
+      <w:r>
+        <w:rPr>
+          <w:b w:val="0"/>
+          <w:color w:val="1B2630"/>
+          <w:lang w:val="nl-BE"/>
+        </w:rPr>
+        <w:t>"Geen brochure" (Dobbels) botst met het educatieboekje (eCRF 16) en de folder (eCRF 48).</w:t>
+      </w:r>
+    </w:p>
+    <w:p>
+      <w:pPr>
+        <w:spacing w:after="80"/>
+        <w:ind w:left="280" w:hanging="280"/>
+        <w:rPr>
+          <w:lang w:val="nl-BE"/>
+        </w:rPr>
+      </w:pPr>
+      <w:r>
+        <w:rPr>
+          <w:b/>
+          <w:color w:val="FF7A00"/>
+          <w:lang w:val="nl-BE"/>
+        </w:rPr>
+        <w:t xml:space="preserve">10.  </w:t>
+      </w:r>
+      <w:r>
+        <w:rPr>
+          <w:b w:val="0"/>
+          <w:color w:val="1B2630"/>
+          <w:lang w:val="nl-BE"/>
+        </w:rPr>
+        <w:t>De technologiesessie in december leert het uitlezen van de sensor; SEBIA 2 in januari herhaalt dat. Afstemmen wie wat geeft.</w:t>
       </w:r>
     </w:p>
     <w:p>

</xml_diff>

<commit_message>
Opleidingsplanning getoetst aan de podologen; kalender wat, waar en wanneer
Co-Authored-By: Claude Opus 5.5 <noreply@anthropic.com>
</commit_message>
<xml_diff>
--- a/PARADISE_opleidingsplanning.docx
+++ b/PARADISE_opleidingsplanning.docx
@@ -1290,7 +1290,7 @@
           <w:sz w:val="17"/>
           <w:lang w:val="nl-BE"/>
         </w:rPr>
-        <w:t>De week van 2 tot 8 november is herfstvakantie en woensdag 11 november is een feestdag; daar staat niets.</w:t>
+        <w:t>De week van 2 tot 8 november is herfstvakantie en woensdag 11 november is een feestdag; daar staat niets. Op dinsdag kan Gent nooit (hogeschool) en heeft Kortrijk vanaf de middag voetkliniek: voorstel is de online sessies op te nemen.</w:t>
       </w:r>
     </w:p>
     <w:p>
@@ -1402,7 +1402,7 @@
                 <w:color w:val="1B2630"/>
                 <w:sz w:val="17"/>
               </w:rPr>
-              <w:t>di 1 dec</w:t>
+              <w:t>wo 2 dec</w:t>
             </w:r>
           </w:p>
         </w:tc>
@@ -1419,7 +1419,7 @@
                 <w:color w:val="1B2630"/>
                 <w:sz w:val="17"/>
               </w:rPr>
-              <w:t>Technologie, voormiddag en namiddag</w:t>
+              <w:t>Technologie: voormiddag Kortrijk, namiddag Brugge</w:t>
             </w:r>
           </w:p>
         </w:tc>
@@ -1440,7 +1440,7 @@
                 <w:sz w:val="17"/>
                 <w:lang w:val="nl-BE"/>
               </w:rPr>
-              <w:t>AZ Sint-Jan Brugge · AZ Groeninge Kortrijk</w:t>
+              <w:t>AZ Groeninge Kortrijk · AZ Sint-Jan Brugge</w:t>
             </w:r>
           </w:p>
         </w:tc>
@@ -1460,7 +1460,7 @@
                 <w:color w:val="1B2630"/>
                 <w:sz w:val="17"/>
               </w:rPr>
-              <w:t>di 8 dec</w:t>
+              <w:t>do 10 dec</w:t>
             </w:r>
           </w:p>
         </w:tc>
@@ -1477,7 +1477,7 @@
                 <w:color w:val="1B2630"/>
                 <w:sz w:val="17"/>
               </w:rPr>
-              <w:t>Technologie, voormiddag en namiddag</w:t>
+              <w:t>Technologie: voormiddag Gent, namiddag Aalst</w:t>
             </w:r>
           </w:p>
         </w:tc>
@@ -1899,7 +1899,7 @@
                 <w:color w:val="1B2630"/>
                 <w:sz w:val="17"/>
               </w:rPr>
-              <w:t>vr 8 jan</w:t>
+              <w:t>do 7 of vr 8 jan</w:t>
             </w:r>
           </w:p>
         </w:tc>
@@ -1920,7 +1920,7 @@
                 <w:sz w:val="17"/>
                 <w:lang w:val="nl-BE"/>
               </w:rPr>
-              <w:t>SEBIA-training 1 en 2, groep West (Brugge, Kortrijk, Gent), 13u–17u; alternatief do 7 jan, 8u30–12u30</w:t>
+              <w:t>SEBIA-training 1 en 2, groep West (Brugge, Kortrijk, Gent): do 7 jan 17u30–21u30 of vr 8 jan 13u–17u, via doodle</w:t>
             </w:r>
           </w:p>
         </w:tc>
@@ -2053,7 +2053,7 @@
                 <w:color w:val="1B2630"/>
                 <w:sz w:val="17"/>
               </w:rPr>
-              <w:t>online, 13u–15u</w:t>
+              <w:t>online, 9u–11u</w:t>
             </w:r>
           </w:p>
         </w:tc>
@@ -2073,7 +2073,7 @@
                 <w:color w:val="1B2630"/>
                 <w:sz w:val="17"/>
               </w:rPr>
-              <w:t>do 14 jan</w:t>
+              <w:t>wo 13 jan</w:t>
             </w:r>
           </w:p>
         </w:tc>
@@ -2090,7 +2090,7 @@
                 <w:color w:val="1B2630"/>
                 <w:sz w:val="17"/>
               </w:rPr>
-              <w:t>Droogloop en debriefing</w:t>
+              <w:t>Droogloop en debriefing, namiddag</w:t>
             </w:r>
           </w:p>
         </w:tc>
@@ -2127,7 +2127,7 @@
                 <w:color w:val="1B2630"/>
                 <w:sz w:val="17"/>
               </w:rPr>
-              <w:t>vr 15 jan</w:t>
+              <w:t>do 14 jan</w:t>
             </w:r>
           </w:p>
         </w:tc>
@@ -2144,7 +2144,7 @@
                 <w:color w:val="1B2630"/>
                 <w:sz w:val="17"/>
               </w:rPr>
-              <w:t>Droogloop en debriefing</w:t>
+              <w:t>Droogloop en debriefing, voormiddag — vóór de voetkliniek van 13u</w:t>
             </w:r>
           </w:p>
         </w:tc>
@@ -2161,7 +2161,7 @@
                 <w:color w:val="1B2630"/>
                 <w:sz w:val="17"/>
               </w:rPr>
-              <w:t>AZ Groeninge Kortrijk</w:t>
+              <w:t>UZ Gent</w:t>
             </w:r>
           </w:p>
         </w:tc>
@@ -2215,7 +2215,7 @@
                 <w:color w:val="1B2630"/>
                 <w:sz w:val="17"/>
               </w:rPr>
-              <w:t>UZ Gent</w:t>
+              <w:t>AZORG Aalst</w:t>
             </w:r>
           </w:p>
         </w:tc>
@@ -2269,7 +2269,7 @@
                 <w:color w:val="1B2630"/>
                 <w:sz w:val="17"/>
               </w:rPr>
-              <w:t>AZORG Aalst</w:t>
+              <w:t>AZ Groeninge Kortrijk</w:t>
             </w:r>
           </w:p>
         </w:tc>
@@ -2360,7 +2360,7 @@
                 <w:color w:val="1B2630"/>
                 <w:sz w:val="17"/>
               </w:rPr>
-              <w:t>Droogloop en debriefing</w:t>
+              <w:t>Droogloop en debriefing, voormiddag — vóór de voetkliniek</w:t>
             </w:r>
           </w:p>
         </w:tc>
@@ -2401,7 +2401,7 @@
           <w:sz w:val="17"/>
           <w:lang w:val="nl-BE"/>
         </w:rPr>
-        <w:t>Donderdag 21, vrijdag 22 en donderdag 28 januari blijven vrij als inhaalslots. Met zes drooglopen in twee weken is de kans reëel dat er één verschuift, en de kerstvakantie ervoor laat geen ruimte om iets naar voren te halen. Leuven en Antwerpen vallen bovendien op twee opeenvolgende dagen, elk negen en een half uur deur tot deur.</w:t>
+        <w:t>Inhaalslots: do 21 jan (Gent, Aalst), vr 22 jan (Leuven; Gent in de namiddag), ma 25 jan namiddag (Kortrijk), do 28 jan (Antwerpen, Gent). Brugge heeft vóór de piloot alleen nog een dinsdagnamiddag, met de tweede podoloog. Leuven en Antwerpen vallen op twee opeenvolgende dagen, elk negen en een half uur deur tot deur.</w:t>
       </w:r>
     </w:p>
     <w:p>
@@ -2794,7 +2794,7 @@
                 <w:color w:val="1B2630"/>
                 <w:sz w:val="17"/>
               </w:rPr>
-              <w:t>vr 5 mrt</w:t>
+              <w:t>do 4 of vr 5 mrt</w:t>
             </w:r>
           </w:p>
         </w:tc>
@@ -2815,7 +2815,7 @@
                 <w:sz w:val="17"/>
                 <w:lang w:val="nl-BE"/>
               </w:rPr>
-              <w:t>SEBIA-training 3 en 4, groep West, 13u–17u — data nog te bevestigen door Dobbels</w:t>
+              <w:t>SEBIA-training 3 en 4, groep West: do 4 mrt avond of vr 5 mrt 13u–17u, via doodle — data nog te bevestigen door Dobbels</w:t>
             </w:r>
           </w:p>
         </w:tc>
@@ -2856,7 +2856,7 @@
                 <w:sz w:val="17"/>
                 <w:lang w:val="nl-BE"/>
               </w:rPr>
-              <w:t>SEBIA-training 5, 1,5 u per podoloog in het eigen centrum, vóór de eerste maand 3-visite. Beste moment: Kortrijk wo, Brugge ma VM, Gent do VM, Leuven di, Antwerpen di of wo VM, Aalst di</w:t>
+              <w:t>SEBIA-training 5, 1,5 u per podoloog in het eigen centrum, vóór de eerste maand 3-visite. Beste moment: Kortrijk wo, Brugge ma VM, Gent do VM, Leuven di, Antwerpen di of wo VM, Aalst di. Valt deels in de paasvakantie (29 mrt – 11 apr)</w:t>
             </w:r>
           </w:p>
         </w:tc>
@@ -5177,7 +5177,7 @@
           <w:color w:val="1B2630"/>
           <w:lang w:val="nl-BE"/>
         </w:rPr>
-        <w:t>Welk SEBIA-schema geldt: dat van Dobbels en het script (eCRF 17), of dat van het manuscript. Daarna manuscript en REDCap gelijkzetten (knelpunt 8).</w:t>
+        <w:t>Welk SEBIA-schema geldt: dat van Dobbels en het script (eCRF 17), of dat van het manuscript. Daarna manuscript en REDCap gelijkzetten (knelpunt 11).</w:t>
       </w:r>
     </w:p>
     <w:p>
@@ -5319,7 +5319,7 @@
           <w:color w:val="1B2630"/>
           <w:lang w:val="nl-BE"/>
         </w:rPr>
-        <w:t>Eén sessie voor alle zes podologen lukt niet: er is geen weekdag waarop iedereen kan. Gent kan alleen do VM of vr NM, Leuven niet op ma en do, Antwerpen en Aalst niet op vr. Daarom twee groepen.</w:t>
+        <w:t>Eén sessie voor alle zes podologen lukt niet: er is geen weekdag waarop iedereen kan. Daarom twee groepen.</w:t>
       </w:r>
     </w:p>
     <w:p>
@@ -5344,7 +5344,7 @@
           <w:color w:val="1B2630"/>
           <w:lang w:val="nl-BE"/>
         </w:rPr>
-        <w:t>Groep West hangt aan Gent: alleen vr 8 jan NM of do 7 jan VM, en beide zijn reservedata van Dobbels. Op do begint de voetkliniek van Gent om 13u. Kortrijk en Brugge werken die dagen niet in het ziekenhuis: bevestigen.</w:t>
+        <w:t>Groep West heeft overdag geen gezamenlijk moment: Kortrijk en Brugge werken ma–wo in het ziekenhuis, Gent do–vr (ma–wo hogeschool). Enige opties: een avond, of vr NM met vrijaf voor Kortrijk en Brugge. Idem voor SEBIA 3 en 4.</w:t>
       </w:r>
     </w:p>
     <w:p>
@@ -5369,7 +5369,7 @@
           <w:color w:val="1B2630"/>
           <w:lang w:val="nl-BE"/>
         </w:rPr>
-        <w:t>Groep Oost kan op di 5 jan. Di 12 jan niet (datacollectie 13u–15u), vr 15 jan niet (droogloop Kortrijk).</w:t>
+        <w:t>Online sessies op dinsdag (theorie 10 en 17 nov, toestemming 24 nov): Gent kan nooit, Kortrijk heeft vanaf de middag voetkliniek, de eerste podoloog van Brugge werkt alleen op woensdag. Opnemen.</w:t>
       </w:r>
     </w:p>
     <w:p>
@@ -5394,7 +5394,7 @@
           <w:color w:val="1B2630"/>
           <w:lang w:val="nl-BE"/>
         </w:rPr>
-        <w:t>Onvolledig: UZ Gent en UZ Leuven gaven geen beste moment op; de tweede podoloog van Sint-Jan, UZ Leuven, UZA en Azorg heeft nog geen bevestigde naam; AZ Groeninge heeft wellicht maar één podoloog, dus geen vervanger.</w:t>
+        <w:t>Datacollectie 12 jan naar 9u–11u verschoven, zodat Kortrijk kan; Gent kan nog altijd niet.</w:t>
       </w:r>
     </w:p>
     <w:p>
@@ -5419,7 +5419,7 @@
           <w:color w:val="1B2630"/>
           <w:lang w:val="nl-BE"/>
         </w:rPr>
-        <w:t>Podologen verplaatsen zich nu twee keer naar een centrale locatie; in het vorige voorstel was dat nooit.</w:t>
+        <w:t>Technologie en droogloop verschoven naar dagen waarop de podoloog er is. Is het datumvoorstel van de week van 21 september al vertrokken, dan krijgen de centra de nieuwe data.</w:t>
       </w:r>
     </w:p>
     <w:p>
@@ -5444,7 +5444,7 @@
           <w:color w:val="1B2630"/>
           <w:lang w:val="nl-BE"/>
         </w:rPr>
-        <w:t>Piloot (1–19 feb) en droogloop van de kwartaalvisites vallen vóór SEBIA 3 en 4: de ondersteunende interventies zijn dan nog niet aangeleerd. Dobbels noemt dit zelf.</w:t>
+        <w:t>Brugge: buiten de voetkliniek is alleen de eerste podoloog er, op woensdagnamiddag; geen inhaalmoment voor de droogloop op een woensdag.</w:t>
       </w:r>
     </w:p>
     <w:p>
@@ -5469,7 +5469,7 @@
           <w:color w:val="1B2630"/>
           <w:lang w:val="nl-BE"/>
         </w:rPr>
-        <w:t>Alleen podologen worden getraind. Volgens het manuscript leveren ook verpleegkundigen en artsen SEBIA.</w:t>
+        <w:t>Onvolledig: UZ Gent en UZ Leuven gaven geen beste moment op; de tweede podoloog van Sint-Jan, UZ Leuven, UZA en Azorg is niet bevestigd; AZ Groeninge heeft wellicht maar één podoloog. Bij UZA is "even weken" onduidelijk.</w:t>
       </w:r>
     </w:p>
     <w:p>
@@ -5494,7 +5494,7 @@
           <w:color w:val="1B2630"/>
           <w:lang w:val="nl-BE"/>
         </w:rPr>
-        <w:t>Het schema van Dobbels (dia 3) volgt het SEBIA-script (eCRF 17), maar niet het manuscript en REDCap. Demonstratie voetzorg op maand 6 en 12 (manuscript: maand 9 en 15). NAFF op visite 1 en 2, maand 6, 12 en 18 (REDCap: alleen visite 1; manuscript: baseline, 3, 9 en 15). MOS-revised is eCRF 13, de twee VAS-schalen zijn eCRF 31. Haar vraag over contact op D14–M1: dat is visite 2 (eCRF 28 en 29).</w:t>
+        <w:t>Podologen verplaatsen zich twee keer naar een centrale locatie; in het vorige voorstel nooit.</w:t>
       </w:r>
     </w:p>
     <w:p>
@@ -5519,7 +5519,7 @@
           <w:color w:val="1B2630"/>
           <w:lang w:val="nl-BE"/>
         </w:rPr>
-        <w:t>"Geen brochure" (Dobbels) botst met het educatieboekje (eCRF 16) en de folder (eCRF 48).</w:t>
+        <w:t>Piloot (1–19 feb) en droogloop van de kwartaalvisites vallen vóór SEBIA 3 en 4: de ondersteunende interventies zijn dan nog niet aangeleerd.</w:t>
       </w:r>
     </w:p>
     <w:p>
@@ -5544,16 +5544,83 @@
           <w:color w:val="1B2630"/>
           <w:lang w:val="nl-BE"/>
         </w:rPr>
-        <w:t>De technologiesessie in december leert het uitlezen van de sensor; SEBIA 2 in januari herhaalt dat. Afstemmen wie wat geeft.</w:t>
+        <w:t>Alleen podologen worden getraind; volgens het manuscript leveren ook verpleegkundigen en artsen SEBIA.</w:t>
       </w:r>
     </w:p>
     <w:p>
       <w:pPr>
-        <w:spacing w:before="200" w:after="100"/>
+        <w:spacing w:after="80"/>
+        <w:ind w:left="280" w:hanging="280"/>
         <w:rPr>
           <w:lang w:val="nl-BE"/>
         </w:rPr>
       </w:pPr>
+      <w:r>
+        <w:rPr>
+          <w:b/>
+          <w:color w:val="FF7A00"/>
+          <w:lang w:val="nl-BE"/>
+        </w:rPr>
+        <w:t xml:space="preserve">11.  </w:t>
+      </w:r>
+      <w:r>
+        <w:rPr>
+          <w:b w:val="0"/>
+          <w:color w:val="1B2630"/>
+          <w:lang w:val="nl-BE"/>
+        </w:rPr>
+        <w:t>Het schema van Dobbels (dia 3) volgt het SEBIA-script (eCRF 17), maar niet het manuscript en REDCap: demonstratie voetzorg op maand 6 en 12 (manuscript: 9 en 15); NAFF op visite 1 en 2, maand 6, 12 en 18 (REDCap: alleen visite 1). MOS-revised is eCRF 13, de twee VAS-schalen zijn eCRF 31.</w:t>
+      </w:r>
+    </w:p>
+    <w:p>
+      <w:pPr>
+        <w:spacing w:after="80"/>
+        <w:ind w:left="280" w:hanging="280"/>
+        <w:rPr>
+          <w:lang w:val="nl-BE"/>
+        </w:rPr>
+      </w:pPr>
+      <w:r>
+        <w:rPr>
+          <w:b/>
+          <w:color w:val="FF7A00"/>
+          <w:lang w:val="nl-BE"/>
+        </w:rPr>
+        <w:t xml:space="preserve">12.  </w:t>
+      </w:r>
+      <w:r>
+        <w:rPr>
+          <w:b w:val="0"/>
+          <w:color w:val="1B2630"/>
+          <w:lang w:val="nl-BE"/>
+        </w:rPr>
+        <w:t>"Geen brochure" (Dobbels) botst met het educatieboekje (eCRF 16) en de folder (eCRF 48).</w:t>
+      </w:r>
+    </w:p>
+    <w:p>
+      <w:pPr>
+        <w:spacing w:after="80"/>
+        <w:ind w:left="280" w:hanging="280"/>
+        <w:rPr>
+          <w:lang w:val="nl-BE"/>
+        </w:rPr>
+      </w:pPr>
+      <w:r>
+        <w:rPr>
+          <w:b/>
+          <w:color w:val="FF7A00"/>
+          <w:lang w:val="nl-BE"/>
+        </w:rPr>
+        <w:t xml:space="preserve">13.  </w:t>
+      </w:r>
+      <w:r>
+        <w:rPr>
+          <w:b w:val="0"/>
+          <w:color w:val="1B2630"/>
+          <w:lang w:val="nl-BE"/>
+        </w:rPr>
+        <w:t>Uitlezen van de sensor zit in de technologiesessie én in SEBIA 2: afstemmen wie wat geeft.</w:t>
+      </w:r>
     </w:p>
     <w:sectPr>
       <w:pgSz w:w="11906" w:h="16838"/>

</xml_diff>

<commit_message>
Rekrutering: betaalde uren (17 u OC, 10 u UC), visiteduur per onderdeel geschat, MoveMonitor dag 0 tot 7, 18 maanden uit het voorstel
Co-Authored-By: Claude Opus 5.5 <noreply@anthropic.com>
</commit_message>
<xml_diff>
--- a/PARADISE_opleidingsplanning.docx
+++ b/PARADISE_opleidingsplanning.docx
@@ -3042,7 +3042,7 @@
                 <w:color w:val="FFFFFF"/>
                 <w:sz w:val="15"/>
               </w:rPr>
-              <w:t>In de praktijk</w:t>
+              <w:t>In de praktijk, geschat</w:t>
             </w:r>
           </w:p>
         </w:tc>
@@ -3134,7 +3134,7 @@
                 <w:color w:val="1B2630"/>
                 <w:sz w:val="17"/>
               </w:rPr>
-              <w:t>90–120 min</w:t>
+              <w:t>OC 80–125 · UC 65–105 min</w:t>
             </w:r>
           </w:p>
         </w:tc>
@@ -3226,7 +3226,7 @@
                 <w:color w:val="1B2630"/>
                 <w:sz w:val="17"/>
               </w:rPr>
-              <w:t>60–90 min</w:t>
+              <w:t>OC 77–135 · UC 57–85 min</w:t>
             </w:r>
           </w:p>
         </w:tc>
@@ -3318,7 +3318,7 @@
                 <w:color w:val="1B2630"/>
                 <w:sz w:val="17"/>
               </w:rPr>
-              <w:t>30–45 min</w:t>
+              <w:t>OC 38–70 · UC 23–50 min</w:t>
             </w:r>
           </w:p>
         </w:tc>
@@ -3415,12 +3415,28 @@
                 <w:color w:val="1B2630"/>
                 <w:sz w:val="17"/>
               </w:rPr>
-              <w:t>60–75 min</w:t>
+              <w:t>OC 53–155 · UC 43–95 min</w:t>
             </w:r>
           </w:p>
         </w:tc>
       </w:tr>
     </w:tbl>
+    <w:p>
+      <w:pPr>
+        <w:spacing w:after="100"/>
+        <w:rPr>
+          <w:lang w:val="nl-BE"/>
+        </w:rPr>
+      </w:pPr>
+      <w:r>
+        <w:rPr>
+          <w:color w:val="5A6A78"/>
+          <w:sz w:val="17"/>
+          <w:lang w:val="nl-BE"/>
+        </w:rPr>
+        <w:t>Geschat per onderdeel en af te klokken in de droogloop; de opbouw staat in PARADISE_rekruteringssimulatie.docx, sectie 3. Betaald: 2 u per visite in Optimal Care en 1 u in Usual Care, baseline 2 u, plus 1 u op maand 6 + 1 week (consortiummeeting 1/4/2026, dia 71).</w:t>
+      </w:r>
+    </w:p>
     <w:p>
       <w:pPr>
         <w:spacing w:before="300" w:after="100"/>

</xml_diff>

<commit_message>
Rekrutering nagerekend: grens van 14 maanden voor laatste visite sep 2029, vragenlijsten in de wachtruimte, screening bij de arts, eCRF 40 correct beschreven
Co-Authored-By: Claude Opus 5.5 <noreply@anthropic.com>
</commit_message>
<xml_diff>
--- a/PARADISE_opleidingsplanning.docx
+++ b/PARADISE_opleidingsplanning.docx
@@ -3134,7 +3134,7 @@
                 <w:color w:val="1B2630"/>
                 <w:sz w:val="17"/>
               </w:rPr>
-              <w:t>OC 80–125 · UC 65–105 min</w:t>
+              <w:t>OC 77–120 · UC 62–100 min</w:t>
             </w:r>
           </w:p>
         </w:tc>
@@ -3226,7 +3226,7 @@
                 <w:color w:val="1B2630"/>
                 <w:sz w:val="17"/>
               </w:rPr>
-              <w:t>OC 77–135 · UC 57–85 min</w:t>
+              <w:t>OC 76–133 · UC 56–83 min</w:t>
             </w:r>
           </w:p>
         </w:tc>
@@ -3318,7 +3318,7 @@
                 <w:color w:val="1B2630"/>
                 <w:sz w:val="17"/>
               </w:rPr>
-              <w:t>OC 38–70 · UC 23–50 min</w:t>
+              <w:t>OC 35–65 · UC 20–45 min</w:t>
             </w:r>
           </w:p>
         </w:tc>
@@ -3415,7 +3415,7 @@
                 <w:color w:val="1B2630"/>
                 <w:sz w:val="17"/>
               </w:rPr>
-              <w:t>OC 53–155 · UC 43–95 min</w:t>
+              <w:t>OC 50–150 · UC 40–90 min</w:t>
             </w:r>
           </w:p>
         </w:tc>

</xml_diff>

<commit_message>
Rekrutering en opleidingsplanning rekenen alleen nog met de betaalde uren: 17 u OC, 10 u UC per patiënt
Co-Authored-By: Claude Opus 5.5 <noreply@anthropic.com>
</commit_message>
<xml_diff>
--- a/PARADISE_opleidingsplanning.docx
+++ b/PARADISE_opleidingsplanning.docx
@@ -3042,7 +3042,7 @@
                 <w:color w:val="FFFFFF"/>
                 <w:sz w:val="15"/>
               </w:rPr>
-              <w:t>In de praktijk, geschat</w:t>
+              <w:t>Betaald per patiënt</w:t>
             </w:r>
           </w:p>
         </w:tc>
@@ -3134,7 +3134,7 @@
                 <w:color w:val="1B2630"/>
                 <w:sz w:val="17"/>
               </w:rPr>
-              <w:t>OC 77–120 · UC 62–100 min</w:t>
+              <w:t>OC 2 u · UC 2 u</w:t>
             </w:r>
           </w:p>
         </w:tc>
@@ -3226,7 +3226,7 @@
                 <w:color w:val="1B2630"/>
                 <w:sz w:val="17"/>
               </w:rPr>
-              <w:t>OC 76–133 · UC 56–83 min</w:t>
+              <w:t>OC 2 u · UC 1 u</w:t>
             </w:r>
           </w:p>
         </w:tc>
@@ -3318,7 +3318,7 @@
                 <w:color w:val="1B2630"/>
                 <w:sz w:val="17"/>
               </w:rPr>
-              <w:t>OC 35–65 · UC 20–45 min</w:t>
+              <w:t>OC 2 u · UC 1 u</w:t>
             </w:r>
           </w:p>
         </w:tc>
@@ -3415,7 +3415,7 @@
                 <w:color w:val="1B2630"/>
                 <w:sz w:val="17"/>
               </w:rPr>
-              <w:t>OC 50–150 · UC 40–90 min</w:t>
+              <w:t>OC 2 u · UC 1 u; maand 6 + 1 week nog 1 u</w:t>
             </w:r>
           </w:p>
         </w:tc>
@@ -3434,7 +3434,7 @@
           <w:sz w:val="17"/>
           <w:lang w:val="nl-BE"/>
         </w:rPr>
-        <w:t>Geschat per onderdeel en af te klokken in de droogloop; de opbouw staat in PARADISE_rekruteringssimulatie.docx, sectie 3. Betaald: 2 u per visite in Optimal Care en 1 u in Usual Care, baseline 2 u, plus 1 u op maand 6 + 1 week (consortiummeeting 1/4/2026, dia 71).</w:t>
+        <w:t>Betaald: 2 u per visite in Optimal Care en 1 u in Usual Care, baseline 2 u, plus 1 u op maand 6 + 1 week; samen 17 u in OC en 10 u in UC per patiënt (consortiummeeting 1/4/2026, dia 71).</w:t>
       </w:r>
     </w:p>
     <w:p>

</xml_diff>

<commit_message>
Planning en toetsingsblad: optie B inline per datum, boekje in beide armen, vrijaf bij optie B van SEBIA 3-4 West
Co-Authored-By: Claude Opus 5.5 <noreply@anthropic.com>
</commit_message>
<xml_diff>
--- a/PARADISE_opleidingsplanning.docx
+++ b/PARADISE_opleidingsplanning.docx
@@ -1746,7 +1746,7 @@
                 <w:color w:val="1B2630"/>
                 <w:sz w:val="17"/>
               </w:rPr>
-              <w:t>wo 2 dec (A) of ma 30 nov (B)</w:t>
+              <w:t>wo 2 dec</w:t>
             </w:r>
           </w:p>
         </w:tc>
@@ -1766,7 +1766,7 @@
                 <w:color w:val="1B2630"/>
                 <w:sz w:val="17"/>
               </w:rPr>
-              <w:t>Technologie. A: Kortrijk VM, Brugge NM · B: Brugge VM, Kortrijk NM</w:t>
+              <w:t>Technologie: Kortrijk VM, Brugge NM. Optie B: ma 30 nov, Brugge VM en Kortrijk NM</w:t>
             </w:r>
           </w:p>
         </w:tc>
@@ -2330,7 +2330,7 @@
                 <w:color w:val="1B2630"/>
                 <w:sz w:val="17"/>
               </w:rPr>
-              <w:t>do 7 jan (A) of vr 8 jan (B)</w:t>
+              <w:t>do 7 jan</w:t>
             </w:r>
           </w:p>
         </w:tc>
@@ -2350,7 +2350,7 @@
                 <w:color w:val="1B2630"/>
                 <w:sz w:val="17"/>
               </w:rPr>
-              <w:t>SEBIA 1 en 2, groep West (Brugge, Kortrijk, Gent). A: 17u30–21u30 · B: 13u–17u</w:t>
+              <w:t>SEBIA 1 en 2, groep West (Brugge, Kortrijk, Gent), 17u30–21u30. Optie B: vr 8 jan, 13u–17u</w:t>
             </w:r>
           </w:p>
         </w:tc>
@@ -2590,7 +2590,7 @@
                 <w:color w:val="1B2630"/>
                 <w:sz w:val="17"/>
               </w:rPr>
-              <w:t>wo 13 jan (A) of ma 18 jan (B)</w:t>
+              <w:t>wo 13 jan</w:t>
             </w:r>
           </w:p>
         </w:tc>
@@ -2610,7 +2610,7 @@
                 <w:color w:val="1B2630"/>
                 <w:sz w:val="17"/>
               </w:rPr>
-              <w:t>Droogloop en debriefing. A: namiddag · B: voormiddag</w:t>
+              <w:t>Droogloop en debriefing, namiddag. Optie B: ma 18 jan, voormiddag</w:t>
             </w:r>
           </w:p>
         </w:tc>
@@ -2978,7 +2978,7 @@
           <w:color w:val="5A6A78"/>
           <w:sz w:val="17"/>
         </w:rPr>
-        <w:t>Inhaalslots: do 21 jan (Gent VM, Aalst), vr 22 jan (Leuven; Gent NM), ma 25 jan NM (Kortrijk), do 28 jan VM (Antwerpen, Gent). Voor Brugge is de droogloopdatum die niet gekozen wordt het inhaalslot.</w:t>
+        <w:t>Inhaalslots: do 21 jan (Gent VM, Aalst), vr 22 jan (Leuven; Gent NM), ma 25 jan NM (Kortrijk), do 28 jan VM (Antwerpen, Gent). Voor Brugge is de droogloopdatum die niet gekozen wordt het inhaalslot: ma 18 jan VM, of wo 13 jan NM bij optie B.</w:t>
       </w:r>
     </w:p>
     <w:p>
@@ -3402,7 +3402,7 @@
                 <w:color w:val="1B2630"/>
                 <w:sz w:val="17"/>
               </w:rPr>
-              <w:t>di 9 (A) of di 23 mrt (B)</w:t>
+              <w:t>di 9 mrt</w:t>
             </w:r>
           </w:p>
         </w:tc>
@@ -3422,7 +3422,7 @@
                 <w:color w:val="1B2630"/>
                 <w:sz w:val="17"/>
               </w:rPr>
-              <w:t>SEBIA 3 en 4, groep Oost, 9u–13u, centraal, voorstel Leuven — data nog te bevestigen door Dobbels</w:t>
+              <w:t>SEBIA 3 en 4, groep Oost, 9u–13u, centraal, voorstel Leuven. Optie B: di 23 mrt. Data nog te bevestigen door Dobbels</w:t>
             </w:r>
           </w:p>
         </w:tc>
@@ -3447,7 +3447,7 @@
                 <w:color w:val="1B2630"/>
                 <w:sz w:val="17"/>
               </w:rPr>
-              <w:t>do 4 (A) of vr 5 mrt (B)</w:t>
+              <w:t>do 4 mrt</w:t>
             </w:r>
           </w:p>
         </w:tc>
@@ -3467,7 +3467,7 @@
                 <w:color w:val="1B2630"/>
                 <w:sz w:val="17"/>
               </w:rPr>
-              <w:t>SEBIA 3 en 4, groep West, centraal, voorstel Gent. A: 17u30–21u30 · B: 13u–17u — data nog te bevestigen door Dobbels</w:t>
+              <w:t>SEBIA 3 en 4, groep West, 17u30–21u30, centraal, voorstel Gent. Optie B: vr 5 mrt, 13u–17u. Data nog te bevestigen door Dobbels</w:t>
             </w:r>
           </w:p>
         </w:tc>
@@ -3492,7 +3492,7 @@
                 <w:color w:val="1B2630"/>
                 <w:sz w:val="17"/>
               </w:rPr>
-              <w:t>maart (A) of vanaf 12 april (B)</w:t>
+              <w:t>maart</w:t>
             </w:r>
           </w:p>
         </w:tc>
@@ -3512,7 +3512,7 @@
                 <w:color w:val="1B2630"/>
                 <w:sz w:val="17"/>
               </w:rPr>
-              <w:t>SEBIA 5, 1,5 u per podoloog in het eigen centrum, door Dobbels, bij voorkeur vóór de eerste maand 3-visite. A: vóór de paasvakantie · B: erna. Beste moment: Kortrijk wo, Brugge ma VM, Antwerpen di of wo VM in een even week, Aalst di; Gent en Leuven nog op te vragen</w:t>
+              <w:t>SEBIA 5, 1,5 u per podoloog in het eigen centrum, door Dobbels, vóór de paasvakantie en bij voorkeur vóór de eerste maand 3-visite. Optie B: vanaf 12 april. Beste moment: Kortrijk wo, Brugge ma VM, Antwerpen di of wo VM in een even week, Aalst di; Gent en Leuven nog op te vragen</w:t>
             </w:r>
           </w:p>
         </w:tc>
@@ -3783,7 +3783,7 @@
                 <w:color w:val="1B2630"/>
                 <w:sz w:val="17"/>
               </w:rPr>
-              <w:t>07, 08, 09 drukmeting zonder CMFO, 10 voorschrift; 12, 13, 14, 15 en 21 op papier in de wachtruimte, vóór de educatie; in OC SEBIA stap 1 met het boekje 16, de folder 48 en het logboek 18; 19 en 20 MoveMonitor mee</w:t>
+              <w:t>07, 08, 09 drukmeting zonder CMFO, 10 voorschrift; 12, 13, 14, 15 en 21 op papier in de wachtruimte, vóór de educatie met het boekje 16, in beide armen, en de folder 48; in OC als SEBIA stap 1, met het logboek 18; 19 en 20 MoveMonitor mee</w:t>
             </w:r>
           </w:p>
         </w:tc>
@@ -3868,7 +3868,7 @@
                 <w:color w:val="1B2630"/>
                 <w:sz w:val="17"/>
               </w:rPr>
-              <w:t>23 pasvorm binnen én buiten met foto's; 24 drukmeting zonder en mét de CMFO — in OC toetsen aan de norm en aanpassen tot ze gehaald is, in UC alleen meten; 25 Orthotimer in de zool; 26 in de wachtruimte; 27 MoveMonitor terug; in OC SEBIA stap 2 met 28 activiteitenprofiel, 29 teach-back en de sensorfolder 30</w:t>
+              <w:t>23 pasvorm binnen én buiten met foto's; 24 drukmeting zonder en mét de CMFO — in OC toetsen aan de norm en aanpassen tot ze gehaald is, in UC alleen meten; 25 Orthotimer in de zool; 26 in de wachtruimte; 27 MoveMonitor terug; in OC SEBIA stap 2 met 28 activiteitenprofiel en 29 teach-back; 30 sensorfolder</w:t>
             </w:r>
           </w:p>
         </w:tc>
@@ -7046,7 +7046,7 @@
                 <w:color w:val="1B2630"/>
                 <w:sz w:val="17"/>
               </w:rPr>
-              <w:t>vr 5 mrt 13u–17u</w:t>
+              <w:t>vr 5 mrt 13u–17u, met vrijaf voor Kortrijk en Brugge</w:t>
             </w:r>
           </w:p>
         </w:tc>

</xml_diff>

<commit_message>
SEBIA volgt de agenda van Dobbels: West wo 6 of ma 11 jan 's avonds; UZA alleen donderdag in even weken
Co-Authored-By: Claude Opus 5.5 <noreply@anthropic.com>
</commit_message>
<xml_diff>
--- a/PARADISE_opleidingsplanning.docx
+++ b/PARADISE_opleidingsplanning.docx
@@ -41,7 +41,7 @@
           <w:color w:val="5A6A78"/>
           <w:sz w:val="18"/>
         </w:rPr>
-        <w:t>Stand van zaken op 29 september 2026  ·  werkdocument</w:t>
+        <w:t>Stand van zaken op 30 september 2026  ·  werkdocument</w:t>
       </w:r>
     </w:p>
     <w:p>
@@ -55,7 +55,7 @@
           <w:color w:val="1B2630"/>
           <w:sz w:val="19"/>
         </w:rPr>
-        <w:t>Vaste punten: eerste patiënt in februari 2027, piloot en Go/No-Go in februari 2027, herfstvakantie 2 tot 8 november, feestdag op woensdag 11 november, kerstvakantie 21 december tot 3 januari, krokusvakantie 8 tot 14 februari en paasvakantie 29 maart tot 11 april 2027.</w:t>
+        <w:t>Vaste punten: eerste patiënt in februari 2027, piloot en Go/No-Go in februari 2027, herfstvakantie 2 tot 8 november, feestdag op woensdag 11 november, kerstvakantie 21 december tot 3 januari, krokusvakantie 8 tot 14 februari en paasvakantie 29 maart tot 11 april 2027. SEBIA volgt de agenda van de lesgever, Fabienne Dobbels (SEBIA-deck van 23 september, dia 12).</w:t>
       </w:r>
     </w:p>
     <w:p>
@@ -1615,7 +1615,7 @@
           <w:color w:val="5A6A78"/>
           <w:sz w:val="17"/>
         </w:rPr>
-        <w:t>De week van 2 tot 8 november is herfstvakantie en woensdag 11 november een feestdag. Beide data vallen in een even week, zodat Antwerpen kan. Op dinsdag kan Gent nooit, heeft Kortrijk vanaf de middag voetkliniek en is in Brugge alleen de tweede podoloog er, in de namiddag. Wie niet live kan, bekijkt de opname online.</w:t>
+        <w:t>De week van 2 tot 8 november is herfstvakantie en woensdag 11 november een feestdag. Op dinsdag kan Gent nooit, heeft Kortrijk vanaf de middag voetkliniek en is in Brugge alleen de tweede podoloog er, in de namiddag. Wie niet live kan, bekijkt de opname online.</w:t>
       </w:r>
     </w:p>
     <w:p>
@@ -2330,7 +2330,7 @@
                 <w:color w:val="1B2630"/>
                 <w:sz w:val="17"/>
               </w:rPr>
-              <w:t>do 7 jan</w:t>
+              <w:t>wo 6 jan</w:t>
             </w:r>
           </w:p>
         </w:tc>
@@ -2350,7 +2350,7 @@
                 <w:color w:val="1B2630"/>
                 <w:sz w:val="17"/>
               </w:rPr>
-              <w:t>SEBIA 1 en 2, groep West (Brugge, Kortrijk, Gent), 17u30–21u30. Optie B: vr 8 jan, 13u–17u</w:t>
+              <w:t>SEBIA 1 en 2, groep West (Brugge, Kortrijk, Gent), 17u30–21u30. Optie B: ma 11 jan, 17u30–21u30</w:t>
             </w:r>
           </w:p>
         </w:tc>
@@ -3422,7 +3422,7 @@
                 <w:color w:val="1B2630"/>
                 <w:sz w:val="17"/>
               </w:rPr>
-              <w:t>SEBIA 3 en 4, groep Oost, 9u–13u, centraal, voorstel Leuven. Optie B: di 23 mrt. Data nog te bevestigen door Dobbels</w:t>
+              <w:t>SEBIA 3 en 4, groep Oost, 9u–13u, centraal, voorstel Leuven. Optie B: di 23 mrt. Voorstel: Dobbels gaf na januari nog geen data</w:t>
             </w:r>
           </w:p>
         </w:tc>
@@ -3467,7 +3467,7 @@
                 <w:color w:val="1B2630"/>
                 <w:sz w:val="17"/>
               </w:rPr>
-              <w:t>SEBIA 3 en 4, groep West, 17u30–21u30, centraal, voorstel Gent. Optie B: vr 5 mrt, 13u–17u. Data nog te bevestigen door Dobbels</w:t>
+              <w:t>SEBIA 3 en 4, groep West, 17u30–21u30, centraal, voorstel Gent. Optie B: vr 5 mrt, 13u–17u. Voorstel: Dobbels gaf na januari nog geen data</w:t>
             </w:r>
           </w:p>
         </w:tc>
@@ -3512,7 +3512,7 @@
                 <w:color w:val="1B2630"/>
                 <w:sz w:val="17"/>
               </w:rPr>
-              <w:t>SEBIA 5, 1,5 u per podoloog in het eigen centrum, door Dobbels, vóór de paasvakantie en bij voorkeur vóór de eerste maand 3-visite. Optie B: vanaf 12 april. Beste moment: Kortrijk wo, Brugge ma VM, Antwerpen di of wo VM in een even week, Aalst di; Gent en Leuven nog op te vragen</w:t>
+              <w:t>SEBIA 5, 1,5 u per podoloog in het eigen centrum, door Dobbels, vóór de paasvakantie en bij voorkeur vóór de eerste maand 3-visite. Optie B: vanaf 12 april. Beste moment: Kortrijk wo, Brugge ma VM, Antwerpen di of wo VM, Aalst di; Gent en Leuven nog op te vragen</w:t>
             </w:r>
           </w:p>
         </w:tc>
@@ -6158,7 +6158,7 @@
           <w:color w:val="1B2630"/>
           <w:sz w:val="19"/>
         </w:rPr>
-        <w:t xml:space="preserve">  Kortrijk werkt maandagnamiddag tot woensdag in het ziekenhuis, Brugge dinsdagnamiddag en woensdag, Gent donderdag en vrijdagnamiddag (maandag tot woensdag hogeschool). Enige opties: een avond, of vrijdagnamiddag met vrijaf voor Kortrijk en Brugge. Idem voor SEBIA 3 en 4. Twee opties: sectie 9.</w:t>
+        <w:t xml:space="preserve">  Kortrijk werkt maandagnamiddag tot woensdag in het ziekenhuis, Brugge dinsdagnamiddag en woensdag, Gent donderdag en vrijdagnamiddag (maandag tot woensdag hogeschool). Enige opties: een avond, of vrijdagnamiddag met vrijaf voor Kortrijk en Brugge. Dobbels heeft in januari vóór de eerste droogloop van West (13 jan) geen gewone vrijdag, dus twee avonden op gewone dagen in haar agenda. Voor SEBIA 3 en 4 ook vrijdagnamiddag. Twee opties: sectie 9.</w:t>
       </w:r>
     </w:p>
     <w:p>
@@ -6215,7 +6215,7 @@
           <w:color w:val="1B2630"/>
           <w:sz w:val="19"/>
         </w:rPr>
-        <w:t>Antwerpen werkt alleen in even weken.</w:t>
+        <w:t>Antwerpen werkt op donderdag alleen in even weken;</w:t>
       </w:r>
       <w:r>
         <w:rPr>
@@ -6224,7 +6224,7 @@
           <w:color w:val="1B2630"/>
           <w:sz w:val="19"/>
         </w:rPr>
-        <w:t xml:space="preserve">  Alle data voor Antwerpen, ook de online sessies, vallen in een even week.</w:t>
+        <w:t xml:space="preserve">  dinsdag en woensdag elke week. Het inhaalslot van do 28 jan valt in een even week (week 4).</w:t>
       </w:r>
     </w:p>
     <w:p>
@@ -6240,6 +6240,39 @@
           <w:sz w:val="19"/>
         </w:rPr>
         <w:t xml:space="preserve">5.  </w:t>
+      </w:r>
+      <w:r>
+        <w:rPr>
+          <w:rFonts w:ascii="Segoe UI" w:hAnsi="Segoe UI"/>
+          <w:b/>
+          <w:color w:val="1B2630"/>
+          <w:sz w:val="19"/>
+        </w:rPr>
+        <w:t>Dobbels is de lesgever van SEBIA:</w:t>
+      </w:r>
+      <w:r>
+        <w:rPr>
+          <w:rFonts w:ascii="Segoe UI" w:hAnsi="Segoe UI"/>
+          <w:b w:val="0"/>
+          <w:color w:val="1B2630"/>
+          <w:sz w:val="19"/>
+        </w:rPr>
+        <w:t xml:space="preserve">  haar agenda (SEBIA-deck, dia 12) bepaalt de data. In januari gebruikt de planning alleen haar gewone dagen, niet 17 dec en 7 en 8 jan, die ze alleen indien nodig opgaf. Na januari gaf ze nog geen data: SEBIA 3 tot 6 zijn voorstellen die eerst bij haar liggen.</w:t>
+      </w:r>
+    </w:p>
+    <w:p>
+      <w:pPr>
+        <w:spacing w:before="0" w:after="80"/>
+        <w:ind w:left="280" w:hanging="280"/>
+      </w:pPr>
+      <w:r>
+        <w:rPr>
+          <w:rFonts w:ascii="Segoe UI" w:hAnsi="Segoe UI"/>
+          <w:b/>
+          <w:color w:val="FF7A00"/>
+          <w:sz w:val="19"/>
+        </w:rPr>
+        <w:t xml:space="preserve">6.  </w:t>
       </w:r>
       <w:r>
         <w:rPr>
@@ -6272,7 +6305,7 @@
           <w:color w:val="FF7A00"/>
           <w:sz w:val="19"/>
         </w:rPr>
-        <w:t xml:space="preserve">6.  </w:t>
+        <w:t xml:space="preserve">7.  </w:t>
       </w:r>
       <w:r>
         <w:rPr>
@@ -6305,7 +6338,7 @@
           <w:color w:val="FF7A00"/>
           <w:sz w:val="19"/>
         </w:rPr>
-        <w:t xml:space="preserve">7.  </w:t>
+        <w:t xml:space="preserve">8.  </w:t>
       </w:r>
       <w:r>
         <w:rPr>
@@ -6338,7 +6371,7 @@
           <w:color w:val="FF7A00"/>
           <w:sz w:val="19"/>
         </w:rPr>
-        <w:t xml:space="preserve">8.  </w:t>
+        <w:t xml:space="preserve">9.  </w:t>
       </w:r>
       <w:r>
         <w:rPr>
@@ -6371,7 +6404,7 @@
           <w:color w:val="FF7A00"/>
           <w:sz w:val="19"/>
         </w:rPr>
-        <w:t xml:space="preserve">9.  </w:t>
+        <w:t xml:space="preserve">10.  </w:t>
       </w:r>
       <w:r>
         <w:rPr>
@@ -6404,7 +6437,7 @@
           <w:color w:val="FF7A00"/>
           <w:sz w:val="19"/>
         </w:rPr>
-        <w:t xml:space="preserve">10.  </w:t>
+        <w:t xml:space="preserve">11.  </w:t>
       </w:r>
       <w:r>
         <w:rPr>
@@ -6437,7 +6470,7 @@
           <w:color w:val="FF7A00"/>
           <w:sz w:val="19"/>
         </w:rPr>
-        <w:t xml:space="preserve">11.  </w:t>
+        <w:t xml:space="preserve">12.  </w:t>
       </w:r>
       <w:r>
         <w:rPr>
@@ -6470,7 +6503,7 @@
           <w:color w:val="FF7A00"/>
           <w:sz w:val="19"/>
         </w:rPr>
-        <w:t xml:space="preserve">12.  </w:t>
+        <w:t xml:space="preserve">13.  </w:t>
       </w:r>
       <w:r>
         <w:rPr>
@@ -6771,7 +6804,7 @@
                 <w:color w:val="1B2630"/>
                 <w:sz w:val="17"/>
               </w:rPr>
-              <w:t>do 7 jan 17u30–21u30</w:t>
+              <w:t>wo 6 jan 17u30–21u30</w:t>
             </w:r>
           </w:p>
         </w:tc>
@@ -6791,7 +6824,7 @@
                 <w:color w:val="1B2630"/>
                 <w:sz w:val="17"/>
               </w:rPr>
-              <w:t>vr 8 jan 13u–17u, met vrijaf voor Kortrijk en Brugge</w:t>
+              <w:t>ma 11 jan 17u30–21u30</w:t>
             </w:r>
           </w:p>
         </w:tc>

</xml_diff>